<commit_message>
Rebuild demo-site floor plan and reports from founder's hand sketch (v2)
- Floor plan v2 from the 2026-09-21 sketch: A barn resting 17 m x 50 m minus
  5x10 m tractor bay (800 m2), B barn resting 14 m x 37 m (518 m2), 3 m feed
  lanes, 3 m water lane on B, 10x10 m robotic milking room, 10 m west annex;
  sketch original saved alongside SVG/PNG/DXF.
- Bedding basis updated to 1,318 m2; peat moss per application 26-53 m3.
- Feed/water lanes are unbedded movement lanes scraped daily by skid loader to
  the compost yard (vertical composter) - added to context, report and
  submission.
- 2-page submission PDF re-rendered (2 pages verified), DOCX and AI prompt
  file updated; demo-site context v2 with change log.

Co-Authored-By: Claude Fable 5.1 <noreply@anthropic.com>
Claude-Session: https://claude.ai/code/session_01WKbZ2PH3fH4AvF1j5yCwZ2
</commit_message>
<xml_diff>
--- a/deliverables/motie-rs-2026-25508014-중간점검-제출자료-D2O.docx
+++ b/deliverables/motie-rs-2026-25508014-중간점검-제출자료-D2O.docx
@@ -1045,7 +1045,7 @@
           <w:sz w:val="20"/>
           <w:szCs w:val="20"/>
         </w:rPr>
-        <w:t xml:space="preserve">2. 실증지(실사용 환경) 정의 — 송영신목장 우사 (경기 안성)</w:t>
+        <w:t xml:space="preserve">2. 실증지(실사용 환경) 정의 — 송영신목장 우사 (경기 안성, 2026-09-21 손도면 기준)</w:t>
       </w:r>
     </w:p>
     <w:tbl>
@@ -1061,16 +1061,16 @@
         </w:tblBorders>
       </w:tblPr>
       <w:tblGrid>
-        <w:gridCol w:w="2600"/>
-        <w:gridCol w:w="2600"/>
-        <w:gridCol w:w="1400"/>
-        <w:gridCol w:w="1500"/>
-        <w:gridCol w:w="2366"/>
+        <w:gridCol w:w="800"/>
+        <w:gridCol w:w="2500"/>
+        <w:gridCol w:w="2900"/>
+        <w:gridCol w:w="1200"/>
+        <w:gridCol w:w="3066"/>
       </w:tblGrid>
       <w:tr>
         <w:tc>
           <w:tcPr>
-            <w:tcW w:type="dxa" w:w="2600"/>
+            <w:tcW w:type="dxa" w:w="800"/>
             <w:tcBorders>
               <w:top w:val="single" w:color="888888" w:sz="4"/>
               <w:left w:val="single" w:color="888888" w:sz="4"/>
@@ -1098,13 +1098,13 @@
                 <w:sz w:val="16"/>
                 <w:szCs w:val="16"/>
               </w:rPr>
-              <w:t xml:space="preserve">구분</w:t>
-            </w:r>
-          </w:p>
-        </w:tc>
-        <w:tc>
-          <w:tcPr>
-            <w:tcW w:type="dxa" w:w="2600"/>
+              <w:t xml:space="preserve">동</w:t>
+            </w:r>
+          </w:p>
+        </w:tc>
+        <w:tc>
+          <w:tcPr>
+            <w:tcW w:type="dxa" w:w="2500"/>
             <w:tcBorders>
               <w:top w:val="single" w:color="888888" w:sz="4"/>
               <w:left w:val="single" w:color="888888" w:sz="4"/>
@@ -1132,13 +1132,13 @@
                 <w:sz w:val="16"/>
                 <w:szCs w:val="16"/>
               </w:rPr>
-              <w:t xml:space="preserve">규격</w:t>
-            </w:r>
-          </w:p>
-        </w:tc>
-        <w:tc>
-          <w:tcPr>
-            <w:tcW w:type="dxa" w:w="1400"/>
+              <w:t xml:space="preserve">구역</w:t>
+            </w:r>
+          </w:p>
+        </w:tc>
+        <w:tc>
+          <w:tcPr>
+            <w:tcW w:type="dxa" w:w="2900"/>
             <w:tcBorders>
               <w:top w:val="single" w:color="888888" w:sz="4"/>
               <w:left w:val="single" w:color="888888" w:sz="4"/>
@@ -1166,13 +1166,13 @@
                 <w:sz w:val="16"/>
                 <w:szCs w:val="16"/>
               </w:rPr>
-              <w:t xml:space="preserve">1개 동</w:t>
-            </w:r>
-          </w:p>
-        </w:tc>
-        <w:tc>
-          <w:tcPr>
-            <w:tcW w:type="dxa" w:w="1500"/>
+              <w:t xml:space="preserve">규격</w:t>
+            </w:r>
+          </w:p>
+        </w:tc>
+        <w:tc>
+          <w:tcPr>
+            <w:tcW w:type="dxa" w:w="1200"/>
             <w:tcBorders>
               <w:top w:val="single" w:color="888888" w:sz="4"/>
               <w:left w:val="single" w:color="888888" w:sz="4"/>
@@ -1200,13 +1200,13 @@
                 <w:sz w:val="16"/>
                 <w:szCs w:val="16"/>
               </w:rPr>
-              <w:t xml:space="preserve">2개 동 합계</w:t>
-            </w:r>
-          </w:p>
-        </w:tc>
-        <w:tc>
-          <w:tcPr>
-            <w:tcW w:type="dxa" w:w="2366"/>
+              <w:t xml:space="preserve">면적</w:t>
+            </w:r>
+          </w:p>
+        </w:tc>
+        <w:tc>
+          <w:tcPr>
+            <w:tcW w:type="dxa" w:w="3066"/>
             <w:tcBorders>
               <w:top w:val="single" w:color="888888" w:sz="4"/>
               <w:left w:val="single" w:color="888888" w:sz="4"/>
@@ -1234,7 +1234,7 @@
                 <w:sz w:val="16"/>
                 <w:szCs w:val="16"/>
               </w:rPr>
-              <w:t xml:space="preserve">비고</w:t>
+              <w:t xml:space="preserve">구분</w:t>
             </w:r>
           </w:p>
         </w:tc>
@@ -1242,156 +1242,156 @@
       <w:tr>
         <w:tc>
           <w:tcPr>
-            <w:tcW w:type="dxa" w:w="2600"/>
-            <w:tcBorders>
-              <w:top w:val="single" w:color="888888" w:sz="4"/>
-              <w:left w:val="single" w:color="888888" w:sz="4"/>
-              <w:bottom w:val="single" w:color="888888" w:sz="4"/>
-              <w:right w:val="single" w:color="888888" w:sz="4"/>
-            </w:tcBorders>
-            <w:tcMar>
-              <w:top w:type="dxa" w:w="20"/>
-              <w:left w:type="dxa" w:w="60"/>
-              <w:bottom w:type="dxa" w:w="20"/>
-              <w:right w:type="dxa" w:w="60"/>
-            </w:tcMar>
-            <w:vAlign w:val="center"/>
-          </w:tcPr>
-          <w:p>
-            <w:pPr>
-              <w:spacing w:after="0" w:line="230"/>
-            </w:pPr>
-            <w:r>
-              <w:rPr>
-                <w:rFonts w:ascii="NanumGothic" w:cs="NanumGothic" w:eastAsia="NanumGothic" w:hAnsi="NanumGothic"/>
-                <w:sz w:val="16"/>
-                <w:szCs w:val="16"/>
-              </w:rPr>
-              <w:t xml:space="preserve">A동 · B동 우사 (동일 규격)</w:t>
-            </w:r>
-          </w:p>
-        </w:tc>
-        <w:tc>
-          <w:tcPr>
-            <w:tcW w:type="dxa" w:w="2600"/>
-            <w:tcBorders>
-              <w:top w:val="single" w:color="888888" w:sz="4"/>
-              <w:left w:val="single" w:color="888888" w:sz="4"/>
-              <w:bottom w:val="single" w:color="888888" w:sz="4"/>
-              <w:right w:val="single" w:color="888888" w:sz="4"/>
-            </w:tcBorders>
-            <w:tcMar>
-              <w:top w:type="dxa" w:w="20"/>
-              <w:left w:type="dxa" w:w="60"/>
-              <w:bottom w:type="dxa" w:w="20"/>
-              <w:right w:type="dxa" w:w="60"/>
-            </w:tcMar>
-            <w:vAlign w:val="center"/>
-          </w:tcPr>
-          <w:p>
-            <w:pPr>
-              <w:spacing w:after="0" w:line="230"/>
-            </w:pPr>
-            <w:r>
-              <w:rPr>
-                <w:rFonts w:ascii="NanumGothic" w:cs="NanumGothic" w:eastAsia="NanumGothic" w:hAnsi="NanumGothic"/>
-                <w:sz w:val="16"/>
-                <w:szCs w:val="16"/>
-              </w:rPr>
-              <w:t xml:space="preserve">가로 20 m × 세로 50 m</w:t>
-            </w:r>
-          </w:p>
-        </w:tc>
-        <w:tc>
-          <w:tcPr>
-            <w:tcW w:type="dxa" w:w="1400"/>
-            <w:tcBorders>
-              <w:top w:val="single" w:color="888888" w:sz="4"/>
-              <w:left w:val="single" w:color="888888" w:sz="4"/>
-              <w:bottom w:val="single" w:color="888888" w:sz="4"/>
-              <w:right w:val="single" w:color="888888" w:sz="4"/>
-            </w:tcBorders>
-            <w:tcMar>
-              <w:top w:type="dxa" w:w="20"/>
-              <w:left w:type="dxa" w:w="60"/>
-              <w:bottom w:type="dxa" w:w="20"/>
-              <w:right w:type="dxa" w:w="60"/>
-            </w:tcMar>
-            <w:vAlign w:val="center"/>
-          </w:tcPr>
-          <w:p>
-            <w:pPr>
-              <w:spacing w:after="0" w:line="230"/>
-            </w:pPr>
-            <w:r>
-              <w:rPr>
-                <w:rFonts w:ascii="NanumGothic" w:cs="NanumGothic" w:eastAsia="NanumGothic" w:hAnsi="NanumGothic"/>
-                <w:sz w:val="16"/>
-                <w:szCs w:val="16"/>
-              </w:rPr>
-              <w:t xml:space="preserve">1,000 m²</w:t>
-            </w:r>
-          </w:p>
-        </w:tc>
-        <w:tc>
-          <w:tcPr>
-            <w:tcW w:type="dxa" w:w="1500"/>
-            <w:tcBorders>
-              <w:top w:val="single" w:color="888888" w:sz="4"/>
-              <w:left w:val="single" w:color="888888" w:sz="4"/>
-              <w:bottom w:val="single" w:color="888888" w:sz="4"/>
-              <w:right w:val="single" w:color="888888" w:sz="4"/>
-            </w:tcBorders>
-            <w:tcMar>
-              <w:top w:type="dxa" w:w="20"/>
-              <w:left w:type="dxa" w:w="60"/>
-              <w:bottom w:type="dxa" w:w="20"/>
-              <w:right w:type="dxa" w:w="60"/>
-            </w:tcMar>
-            <w:vAlign w:val="center"/>
-          </w:tcPr>
-          <w:p>
-            <w:pPr>
-              <w:spacing w:after="0" w:line="230"/>
-            </w:pPr>
-            <w:r>
-              <w:rPr>
-                <w:rFonts w:ascii="NanumGothic" w:cs="NanumGothic" w:eastAsia="NanumGothic" w:hAnsi="NanumGothic"/>
-                <w:sz w:val="16"/>
-                <w:szCs w:val="16"/>
-              </w:rPr>
-              <w:t xml:space="preserve">2,000 m²</w:t>
-            </w:r>
-          </w:p>
-        </w:tc>
-        <w:tc>
-          <w:tcPr>
-            <w:tcW w:type="dxa" w:w="2366"/>
-            <w:tcBorders>
-              <w:top w:val="single" w:color="888888" w:sz="4"/>
-              <w:left w:val="single" w:color="888888" w:sz="4"/>
-              <w:bottom w:val="single" w:color="888888" w:sz="4"/>
-              <w:right w:val="single" w:color="888888" w:sz="4"/>
-            </w:tcBorders>
-            <w:tcMar>
-              <w:top w:type="dxa" w:w="20"/>
-              <w:left w:type="dxa" w:w="60"/>
-              <w:bottom w:type="dxa" w:w="20"/>
-              <w:right w:type="dxa" w:w="60"/>
-            </w:tcMar>
-            <w:vAlign w:val="center"/>
-          </w:tcPr>
-          <w:p>
-            <w:pPr>
-              <w:spacing w:after="0" w:line="230"/>
-            </w:pPr>
-            <w:r>
-              <w:rPr>
-                <w:rFonts w:ascii="NanumGothic" w:cs="NanumGothic" w:eastAsia="NanumGothic" w:hAnsi="NanumGothic"/>
-                <w:sz w:val="16"/>
-                <w:szCs w:val="16"/>
-              </w:rPr>
-              <w:t xml:space="preserve">중앙 복도 양측 대칭 배치</w:t>
+            <w:tcW w:type="dxa" w:w="800"/>
+            <w:tcBorders>
+              <w:top w:val="single" w:color="888888" w:sz="4"/>
+              <w:left w:val="single" w:color="888888" w:sz="4"/>
+              <w:bottom w:val="single" w:color="888888" w:sz="4"/>
+              <w:right w:val="single" w:color="888888" w:sz="4"/>
+            </w:tcBorders>
+            <w:tcMar>
+              <w:top w:type="dxa" w:w="20"/>
+              <w:left w:type="dxa" w:w="60"/>
+              <w:bottom w:type="dxa" w:w="20"/>
+              <w:right w:type="dxa" w:w="60"/>
+            </w:tcMar>
+            <w:vAlign w:val="center"/>
+          </w:tcPr>
+          <w:p>
+            <w:pPr>
+              <w:spacing w:after="0" w:line="230"/>
+            </w:pPr>
+            <w:r>
+              <w:rPr>
+                <w:rFonts w:ascii="NanumGothic" w:cs="NanumGothic" w:eastAsia="NanumGothic" w:hAnsi="NanumGothic"/>
+                <w:sz w:val="16"/>
+                <w:szCs w:val="16"/>
+              </w:rPr>
+              <w:t xml:space="preserve">A동</w:t>
+            </w:r>
+          </w:p>
+        </w:tc>
+        <w:tc>
+          <w:tcPr>
+            <w:tcW w:type="dxa" w:w="2500"/>
+            <w:tcBorders>
+              <w:top w:val="single" w:color="888888" w:sz="4"/>
+              <w:left w:val="single" w:color="888888" w:sz="4"/>
+              <w:bottom w:val="single" w:color="888888" w:sz="4"/>
+              <w:right w:val="single" w:color="888888" w:sz="4"/>
+            </w:tcBorders>
+            <w:tcMar>
+              <w:top w:type="dxa" w:w="20"/>
+              <w:left w:type="dxa" w:w="60"/>
+              <w:bottom w:type="dxa" w:w="20"/>
+              <w:right w:type="dxa" w:w="60"/>
+            </w:tcMar>
+            <w:vAlign w:val="center"/>
+          </w:tcPr>
+          <w:p>
+            <w:pPr>
+              <w:spacing w:after="0" w:line="230"/>
+            </w:pPr>
+            <w:r>
+              <w:rPr>
+                <w:rFonts w:ascii="NanumGothic" w:cs="NanumGothic" w:eastAsia="NanumGothic" w:hAnsi="NanumGothic"/>
+                <w:sz w:val="16"/>
+                <w:szCs w:val="16"/>
+              </w:rPr>
+              <w:t xml:space="preserve">휴식 공간 = 베딩 기준 면적</w:t>
+            </w:r>
+          </w:p>
+        </w:tc>
+        <w:tc>
+          <w:tcPr>
+            <w:tcW w:type="dxa" w:w="2900"/>
+            <w:tcBorders>
+              <w:top w:val="single" w:color="888888" w:sz="4"/>
+              <w:left w:val="single" w:color="888888" w:sz="4"/>
+              <w:bottom w:val="single" w:color="888888" w:sz="4"/>
+              <w:right w:val="single" w:color="888888" w:sz="4"/>
+            </w:tcBorders>
+            <w:tcMar>
+              <w:top w:type="dxa" w:w="20"/>
+              <w:left w:type="dxa" w:w="60"/>
+              <w:bottom w:type="dxa" w:w="20"/>
+              <w:right w:type="dxa" w:w="60"/>
+            </w:tcMar>
+            <w:vAlign w:val="center"/>
+          </w:tcPr>
+          <w:p>
+            <w:pPr>
+              <w:spacing w:after="0" w:line="230"/>
+            </w:pPr>
+            <w:r>
+              <w:rPr>
+                <w:rFonts w:ascii="NanumGothic" w:cs="NanumGothic" w:eastAsia="NanumGothic" w:hAnsi="NanumGothic"/>
+                <w:sz w:val="16"/>
+                <w:szCs w:val="16"/>
+              </w:rPr>
+              <w:t xml:space="preserve">17 m × 50 m, 트랙터 주차(5×10 m) 제외</w:t>
+            </w:r>
+          </w:p>
+        </w:tc>
+        <w:tc>
+          <w:tcPr>
+            <w:tcW w:type="dxa" w:w="1200"/>
+            <w:tcBorders>
+              <w:top w:val="single" w:color="888888" w:sz="4"/>
+              <w:left w:val="single" w:color="888888" w:sz="4"/>
+              <w:bottom w:val="single" w:color="888888" w:sz="4"/>
+              <w:right w:val="single" w:color="888888" w:sz="4"/>
+            </w:tcBorders>
+            <w:tcMar>
+              <w:top w:type="dxa" w:w="20"/>
+              <w:left w:type="dxa" w:w="60"/>
+              <w:bottom w:type="dxa" w:w="20"/>
+              <w:right w:type="dxa" w:w="60"/>
+            </w:tcMar>
+            <w:vAlign w:val="center"/>
+          </w:tcPr>
+          <w:p>
+            <w:pPr>
+              <w:spacing w:after="0" w:line="230"/>
+            </w:pPr>
+            <w:r>
+              <w:rPr>
+                <w:rFonts w:ascii="NanumGothic" w:cs="NanumGothic" w:eastAsia="NanumGothic" w:hAnsi="NanumGothic"/>
+                <w:sz w:val="16"/>
+                <w:szCs w:val="16"/>
+              </w:rPr>
+              <w:t xml:space="preserve">800 m²</w:t>
+            </w:r>
+          </w:p>
+        </w:tc>
+        <w:tc>
+          <w:tcPr>
+            <w:tcW w:type="dxa" w:w="3066"/>
+            <w:tcBorders>
+              <w:top w:val="single" w:color="888888" w:sz="4"/>
+              <w:left w:val="single" w:color="888888" w:sz="4"/>
+              <w:bottom w:val="single" w:color="888888" w:sz="4"/>
+              <w:right w:val="single" w:color="888888" w:sz="4"/>
+            </w:tcBorders>
+            <w:tcMar>
+              <w:top w:type="dxa" w:w="20"/>
+              <w:left w:type="dxa" w:w="60"/>
+              <w:bottom w:type="dxa" w:w="20"/>
+              <w:right w:type="dxa" w:w="60"/>
+            </w:tcMar>
+            <w:vAlign w:val="center"/>
+          </w:tcPr>
+          <w:p>
+            <w:pPr>
+              <w:spacing w:after="0" w:line="230"/>
+            </w:pPr>
+            <w:r>
+              <w:rPr>
+                <w:rFonts w:ascii="NanumGothic" w:cs="NanumGothic" w:eastAsia="NanumGothic" w:hAnsi="NanumGothic"/>
+                <w:sz w:val="16"/>
+                <w:szCs w:val="16"/>
+              </w:rPr>
+              <w:t xml:space="preserve">로봇 작업 대상 · 급수조 3개 외벽</w:t>
             </w:r>
           </w:p>
         </w:tc>
@@ -1399,156 +1399,156 @@
       <w:tr>
         <w:tc>
           <w:tcPr>
-            <w:tcW w:type="dxa" w:w="2600"/>
-            <w:tcBorders>
-              <w:top w:val="single" w:color="888888" w:sz="4"/>
-              <w:left w:val="single" w:color="888888" w:sz="4"/>
-              <w:bottom w:val="single" w:color="888888" w:sz="4"/>
-              <w:right w:val="single" w:color="888888" w:sz="4"/>
-            </w:tcBorders>
-            <w:tcMar>
-              <w:top w:type="dxa" w:w="20"/>
-              <w:left w:type="dxa" w:w="60"/>
-              <w:bottom w:type="dxa" w:w="20"/>
-              <w:right w:type="dxa" w:w="60"/>
-            </w:tcMar>
-            <w:vAlign w:val="center"/>
-          </w:tcPr>
-          <w:p>
-            <w:pPr>
-              <w:spacing w:after="0" w:line="230"/>
-            </w:pPr>
-            <w:r>
-              <w:rPr>
-                <w:rFonts w:ascii="NanumGothic" w:cs="NanumGothic" w:eastAsia="NanumGothic" w:hAnsi="NanumGothic"/>
-                <w:sz w:val="16"/>
-                <w:szCs w:val="16"/>
-              </w:rPr>
-              <w:t xml:space="preserve">중앙 복도</w:t>
-            </w:r>
-          </w:p>
-        </w:tc>
-        <w:tc>
-          <w:tcPr>
-            <w:tcW w:type="dxa" w:w="2600"/>
-            <w:tcBorders>
-              <w:top w:val="single" w:color="888888" w:sz="4"/>
-              <w:left w:val="single" w:color="888888" w:sz="4"/>
-              <w:bottom w:val="single" w:color="888888" w:sz="4"/>
-              <w:right w:val="single" w:color="888888" w:sz="4"/>
-            </w:tcBorders>
-            <w:tcMar>
-              <w:top w:type="dxa" w:w="20"/>
-              <w:left w:type="dxa" w:w="60"/>
-              <w:bottom w:type="dxa" w:w="20"/>
-              <w:right w:type="dxa" w:w="60"/>
-            </w:tcMar>
-            <w:vAlign w:val="center"/>
-          </w:tcPr>
-          <w:p>
-            <w:pPr>
-              <w:spacing w:after="0" w:line="230"/>
-            </w:pPr>
-            <w:r>
-              <w:rPr>
-                <w:rFonts w:ascii="NanumGothic" w:cs="NanumGothic" w:eastAsia="NanumGothic" w:hAnsi="NanumGothic"/>
-                <w:sz w:val="16"/>
-                <w:szCs w:val="16"/>
-              </w:rPr>
-              <w:t xml:space="preserve">폭 5 m × 50 m</w:t>
-            </w:r>
-          </w:p>
-        </w:tc>
-        <w:tc>
-          <w:tcPr>
-            <w:tcW w:type="dxa" w:w="1400"/>
-            <w:tcBorders>
-              <w:top w:val="single" w:color="888888" w:sz="4"/>
-              <w:left w:val="single" w:color="888888" w:sz="4"/>
-              <w:bottom w:val="single" w:color="888888" w:sz="4"/>
-              <w:right w:val="single" w:color="888888" w:sz="4"/>
-            </w:tcBorders>
-            <w:tcMar>
-              <w:top w:type="dxa" w:w="20"/>
-              <w:left w:type="dxa" w:w="60"/>
-              <w:bottom w:type="dxa" w:w="20"/>
-              <w:right w:type="dxa" w:w="60"/>
-            </w:tcMar>
-            <w:vAlign w:val="center"/>
-          </w:tcPr>
-          <w:p>
-            <w:pPr>
-              <w:spacing w:after="0" w:line="230"/>
-            </w:pPr>
-            <w:r>
-              <w:rPr>
-                <w:rFonts w:ascii="NanumGothic" w:cs="NanumGothic" w:eastAsia="NanumGothic" w:hAnsi="NanumGothic"/>
-                <w:sz w:val="16"/>
-                <w:szCs w:val="16"/>
-              </w:rPr>
-              <w:t xml:space="preserve">—</w:t>
-            </w:r>
-          </w:p>
-        </w:tc>
-        <w:tc>
-          <w:tcPr>
-            <w:tcW w:type="dxa" w:w="1500"/>
-            <w:tcBorders>
-              <w:top w:val="single" w:color="888888" w:sz="4"/>
-              <w:left w:val="single" w:color="888888" w:sz="4"/>
-              <w:bottom w:val="single" w:color="888888" w:sz="4"/>
-              <w:right w:val="single" w:color="888888" w:sz="4"/>
-            </w:tcBorders>
-            <w:tcMar>
-              <w:top w:type="dxa" w:w="20"/>
-              <w:left w:type="dxa" w:w="60"/>
-              <w:bottom w:type="dxa" w:w="20"/>
-              <w:right w:type="dxa" w:w="60"/>
-            </w:tcMar>
-            <w:vAlign w:val="center"/>
-          </w:tcPr>
-          <w:p>
-            <w:pPr>
-              <w:spacing w:after="0" w:line="230"/>
-            </w:pPr>
-            <w:r>
-              <w:rPr>
-                <w:rFonts w:ascii="NanumGothic" w:cs="NanumGothic" w:eastAsia="NanumGothic" w:hAnsi="NanumGothic"/>
-                <w:sz w:val="16"/>
-                <w:szCs w:val="16"/>
-              </w:rPr>
-              <w:t xml:space="preserve">250 m²</w:t>
-            </w:r>
-          </w:p>
-        </w:tc>
-        <w:tc>
-          <w:tcPr>
-            <w:tcW w:type="dxa" w:w="2366"/>
-            <w:tcBorders>
-              <w:top w:val="single" w:color="888888" w:sz="4"/>
-              <w:left w:val="single" w:color="888888" w:sz="4"/>
-              <w:bottom w:val="single" w:color="888888" w:sz="4"/>
-              <w:right w:val="single" w:color="888888" w:sz="4"/>
-            </w:tcBorders>
-            <w:tcMar>
-              <w:top w:type="dxa" w:w="20"/>
-              <w:left w:type="dxa" w:w="60"/>
-              <w:bottom w:type="dxa" w:w="20"/>
-              <w:right w:type="dxa" w:w="60"/>
-            </w:tcMar>
-            <w:vAlign w:val="center"/>
-          </w:tcPr>
-          <w:p>
-            <w:pPr>
-              <w:spacing w:after="0" w:line="230"/>
-            </w:pPr>
-            <w:r>
-              <w:rPr>
-                <w:rFonts w:ascii="NanumGothic" w:cs="NanumGothic" w:eastAsia="NanumGothic" w:hAnsi="NanumGothic"/>
-                <w:sz w:val="16"/>
-                <w:szCs w:val="16"/>
-              </w:rPr>
-              <w:t xml:space="preserve">착유대기실 · 소 이동통로 (베딩 제외)</w:t>
+            <w:tcW w:type="dxa" w:w="800"/>
+            <w:tcBorders>
+              <w:top w:val="single" w:color="888888" w:sz="4"/>
+              <w:left w:val="single" w:color="888888" w:sz="4"/>
+              <w:bottom w:val="single" w:color="888888" w:sz="4"/>
+              <w:right w:val="single" w:color="888888" w:sz="4"/>
+            </w:tcBorders>
+            <w:tcMar>
+              <w:top w:type="dxa" w:w="20"/>
+              <w:left w:type="dxa" w:w="60"/>
+              <w:bottom w:type="dxa" w:w="20"/>
+              <w:right w:type="dxa" w:w="60"/>
+            </w:tcMar>
+            <w:vAlign w:val="center"/>
+          </w:tcPr>
+          <w:p>
+            <w:pPr>
+              <w:spacing w:after="0" w:line="230"/>
+            </w:pPr>
+            <w:r>
+              <w:rPr>
+                <w:rFonts w:ascii="NanumGothic" w:cs="NanumGothic" w:eastAsia="NanumGothic" w:hAnsi="NanumGothic"/>
+                <w:sz w:val="16"/>
+                <w:szCs w:val="16"/>
+              </w:rPr>
+              <w:t xml:space="preserve">A동</w:t>
+            </w:r>
+          </w:p>
+        </w:tc>
+        <w:tc>
+          <w:tcPr>
+            <w:tcW w:type="dxa" w:w="2500"/>
+            <w:tcBorders>
+              <w:top w:val="single" w:color="888888" w:sz="4"/>
+              <w:left w:val="single" w:color="888888" w:sz="4"/>
+              <w:bottom w:val="single" w:color="888888" w:sz="4"/>
+              <w:right w:val="single" w:color="888888" w:sz="4"/>
+            </w:tcBorders>
+            <w:tcMar>
+              <w:top w:type="dxa" w:w="20"/>
+              <w:left w:type="dxa" w:w="60"/>
+              <w:bottom w:type="dxa" w:w="20"/>
+              <w:right w:type="dxa" w:w="60"/>
+            </w:tcMar>
+            <w:vAlign w:val="center"/>
+          </w:tcPr>
+          <w:p>
+            <w:pPr>
+              <w:spacing w:after="0" w:line="230"/>
+            </w:pPr>
+            <w:r>
+              <w:rPr>
+                <w:rFonts w:ascii="NanumGothic" w:cs="NanumGothic" w:eastAsia="NanumGothic" w:hAnsi="NanumGothic"/>
+                <w:sz w:val="16"/>
+                <w:szCs w:val="16"/>
+              </w:rPr>
+              <w:t xml:space="preserve">사조 공간 / 트랙터 주차</w:t>
+            </w:r>
+          </w:p>
+        </w:tc>
+        <w:tc>
+          <w:tcPr>
+            <w:tcW w:type="dxa" w:w="2900"/>
+            <w:tcBorders>
+              <w:top w:val="single" w:color="888888" w:sz="4"/>
+              <w:left w:val="single" w:color="888888" w:sz="4"/>
+              <w:bottom w:val="single" w:color="888888" w:sz="4"/>
+              <w:right w:val="single" w:color="888888" w:sz="4"/>
+            </w:tcBorders>
+            <w:tcMar>
+              <w:top w:type="dxa" w:w="20"/>
+              <w:left w:type="dxa" w:w="60"/>
+              <w:bottom w:type="dxa" w:w="20"/>
+              <w:right w:type="dxa" w:w="60"/>
+            </w:tcMar>
+            <w:vAlign w:val="center"/>
+          </w:tcPr>
+          <w:p>
+            <w:pPr>
+              <w:spacing w:after="0" w:line="230"/>
+            </w:pPr>
+            <w:r>
+              <w:rPr>
+                <w:rFonts w:ascii="NanumGothic" w:cs="NanumGothic" w:eastAsia="NanumGothic" w:hAnsi="NanumGothic"/>
+                <w:sz w:val="16"/>
+                <w:szCs w:val="16"/>
+              </w:rPr>
+              <w:t xml:space="preserve">3 m × 50 m / 5 m × 10 m</w:t>
+            </w:r>
+          </w:p>
+        </w:tc>
+        <w:tc>
+          <w:tcPr>
+            <w:tcW w:type="dxa" w:w="1200"/>
+            <w:tcBorders>
+              <w:top w:val="single" w:color="888888" w:sz="4"/>
+              <w:left w:val="single" w:color="888888" w:sz="4"/>
+              <w:bottom w:val="single" w:color="888888" w:sz="4"/>
+              <w:right w:val="single" w:color="888888" w:sz="4"/>
+            </w:tcBorders>
+            <w:tcMar>
+              <w:top w:type="dxa" w:w="20"/>
+              <w:left w:type="dxa" w:w="60"/>
+              <w:bottom w:type="dxa" w:w="20"/>
+              <w:right w:type="dxa" w:w="60"/>
+            </w:tcMar>
+            <w:vAlign w:val="center"/>
+          </w:tcPr>
+          <w:p>
+            <w:pPr>
+              <w:spacing w:after="0" w:line="230"/>
+            </w:pPr>
+            <w:r>
+              <w:rPr>
+                <w:rFonts w:ascii="NanumGothic" w:cs="NanumGothic" w:eastAsia="NanumGothic" w:hAnsi="NanumGothic"/>
+                <w:sz w:val="16"/>
+                <w:szCs w:val="16"/>
+              </w:rPr>
+              <w:t xml:space="preserve">150 / 50 m²</w:t>
+            </w:r>
+          </w:p>
+        </w:tc>
+        <w:tc>
+          <w:tcPr>
+            <w:tcW w:type="dxa" w:w="3066"/>
+            <w:tcBorders>
+              <w:top w:val="single" w:color="888888" w:sz="4"/>
+              <w:left w:val="single" w:color="888888" w:sz="4"/>
+              <w:bottom w:val="single" w:color="888888" w:sz="4"/>
+              <w:right w:val="single" w:color="888888" w:sz="4"/>
+            </w:tcBorders>
+            <w:tcMar>
+              <w:top w:type="dxa" w:w="20"/>
+              <w:left w:type="dxa" w:w="60"/>
+              <w:bottom w:type="dxa" w:w="20"/>
+              <w:right w:type="dxa" w:w="60"/>
+            </w:tcMar>
+            <w:vAlign w:val="center"/>
+          </w:tcPr>
+          <w:p>
+            <w:pPr>
+              <w:spacing w:after="0" w:line="230"/>
+            </w:pPr>
+            <w:r>
+              <w:rPr>
+                <w:rFonts w:ascii="NanumGothic" w:cs="NanumGothic" w:eastAsia="NanumGothic" w:hAnsi="NanumGothic"/>
+                <w:sz w:val="16"/>
+                <w:szCs w:val="16"/>
+              </w:rPr>
+              <w:t xml:space="preserve">베딩 제외 · 주차 구역은 로봇 대기·충전 공유 제안</w:t>
             </w:r>
           </w:p>
         </w:tc>
@@ -1556,156 +1556,156 @@
       <w:tr>
         <w:tc>
           <w:tcPr>
-            <w:tcW w:type="dxa" w:w="2600"/>
-            <w:tcBorders>
-              <w:top w:val="single" w:color="888888" w:sz="4"/>
-              <w:left w:val="single" w:color="888888" w:sz="4"/>
-              <w:bottom w:val="single" w:color="888888" w:sz="4"/>
-              <w:right w:val="single" w:color="888888" w:sz="4"/>
-            </w:tcBorders>
-            <w:tcMar>
-              <w:top w:type="dxa" w:w="20"/>
-              <w:left w:type="dxa" w:w="60"/>
-              <w:bottom w:type="dxa" w:w="20"/>
-              <w:right w:type="dxa" w:w="60"/>
-            </w:tcMar>
-            <w:vAlign w:val="center"/>
-          </w:tcPr>
-          <w:p>
-            <w:pPr>
-              <w:spacing w:after="0" w:line="230"/>
-            </w:pPr>
-            <w:r>
-              <w:rPr>
-                <w:rFonts w:ascii="NanumGothic" w:cs="NanumGothic" w:eastAsia="NanumGothic" w:hAnsi="NanumGothic"/>
-                <w:sz w:val="16"/>
-                <w:szCs w:val="16"/>
-              </w:rPr>
-              <w:t xml:space="preserve">사조 공간 (사료 섭취)</w:t>
-            </w:r>
-          </w:p>
-        </w:tc>
-        <w:tc>
-          <w:tcPr>
-            <w:tcW w:type="dxa" w:w="2600"/>
-            <w:tcBorders>
-              <w:top w:val="single" w:color="888888" w:sz="4"/>
-              <w:left w:val="single" w:color="888888" w:sz="4"/>
-              <w:bottom w:val="single" w:color="888888" w:sz="4"/>
-              <w:right w:val="single" w:color="888888" w:sz="4"/>
-            </w:tcBorders>
-            <w:tcMar>
-              <w:top w:type="dxa" w:w="20"/>
-              <w:left w:type="dxa" w:w="60"/>
-              <w:bottom w:type="dxa" w:w="20"/>
-              <w:right w:type="dxa" w:w="60"/>
-            </w:tcMar>
-            <w:vAlign w:val="center"/>
-          </w:tcPr>
-          <w:p>
-            <w:pPr>
-              <w:spacing w:after="0" w:line="230"/>
-            </w:pPr>
-            <w:r>
-              <w:rPr>
-                <w:rFonts w:ascii="NanumGothic" w:cs="NanumGothic" w:eastAsia="NanumGothic" w:hAnsi="NanumGothic"/>
-                <w:sz w:val="16"/>
-                <w:szCs w:val="16"/>
-              </w:rPr>
-              <w:t xml:space="preserve">폭 약 3 m × 50 m</w:t>
-            </w:r>
-          </w:p>
-        </w:tc>
-        <w:tc>
-          <w:tcPr>
-            <w:tcW w:type="dxa" w:w="1400"/>
-            <w:tcBorders>
-              <w:top w:val="single" w:color="888888" w:sz="4"/>
-              <w:left w:val="single" w:color="888888" w:sz="4"/>
-              <w:bottom w:val="single" w:color="888888" w:sz="4"/>
-              <w:right w:val="single" w:color="888888" w:sz="4"/>
-            </w:tcBorders>
-            <w:tcMar>
-              <w:top w:type="dxa" w:w="20"/>
-              <w:left w:type="dxa" w:w="60"/>
-              <w:bottom w:type="dxa" w:w="20"/>
-              <w:right w:type="dxa" w:w="60"/>
-            </w:tcMar>
-            <w:vAlign w:val="center"/>
-          </w:tcPr>
-          <w:p>
-            <w:pPr>
-              <w:spacing w:after="0" w:line="230"/>
-            </w:pPr>
-            <w:r>
-              <w:rPr>
-                <w:rFonts w:ascii="NanumGothic" w:cs="NanumGothic" w:eastAsia="NanumGothic" w:hAnsi="NanumGothic"/>
-                <w:sz w:val="16"/>
-                <w:szCs w:val="16"/>
-              </w:rPr>
-              <w:t xml:space="preserve">150 m²</w:t>
-            </w:r>
-          </w:p>
-        </w:tc>
-        <w:tc>
-          <w:tcPr>
-            <w:tcW w:type="dxa" w:w="1500"/>
-            <w:tcBorders>
-              <w:top w:val="single" w:color="888888" w:sz="4"/>
-              <w:left w:val="single" w:color="888888" w:sz="4"/>
-              <w:bottom w:val="single" w:color="888888" w:sz="4"/>
-              <w:right w:val="single" w:color="888888" w:sz="4"/>
-            </w:tcBorders>
-            <w:tcMar>
-              <w:top w:type="dxa" w:w="20"/>
-              <w:left w:type="dxa" w:w="60"/>
-              <w:bottom w:type="dxa" w:w="20"/>
-              <w:right w:type="dxa" w:w="60"/>
-            </w:tcMar>
-            <w:vAlign w:val="center"/>
-          </w:tcPr>
-          <w:p>
-            <w:pPr>
-              <w:spacing w:after="0" w:line="230"/>
-            </w:pPr>
-            <w:r>
-              <w:rPr>
-                <w:rFonts w:ascii="NanumGothic" w:cs="NanumGothic" w:eastAsia="NanumGothic" w:hAnsi="NanumGothic"/>
-                <w:sz w:val="16"/>
-                <w:szCs w:val="16"/>
-              </w:rPr>
-              <w:t xml:space="preserve">300 m²</w:t>
-            </w:r>
-          </w:p>
-        </w:tc>
-        <w:tc>
-          <w:tcPr>
-            <w:tcW w:type="dxa" w:w="2366"/>
-            <w:tcBorders>
-              <w:top w:val="single" w:color="888888" w:sz="4"/>
-              <w:left w:val="single" w:color="888888" w:sz="4"/>
-              <w:bottom w:val="single" w:color="888888" w:sz="4"/>
-              <w:right w:val="single" w:color="888888" w:sz="4"/>
-            </w:tcBorders>
-            <w:tcMar>
-              <w:top w:type="dxa" w:w="20"/>
-              <w:left w:type="dxa" w:w="60"/>
-              <w:bottom w:type="dxa" w:w="20"/>
-              <w:right w:type="dxa" w:w="60"/>
-            </w:tcMar>
-            <w:vAlign w:val="center"/>
-          </w:tcPr>
-          <w:p>
-            <w:pPr>
-              <w:spacing w:after="0" w:line="230"/>
-            </w:pPr>
-            <w:r>
-              <w:rPr>
-                <w:rFonts w:ascii="NanumGothic" w:cs="NanumGothic" w:eastAsia="NanumGothic" w:hAnsi="NanumGothic"/>
-                <w:sz w:val="16"/>
-                <w:szCs w:val="16"/>
-              </w:rPr>
-              <w:t xml:space="preserve">베딩 제외</w:t>
+            <w:tcW w:type="dxa" w:w="800"/>
+            <w:tcBorders>
+              <w:top w:val="single" w:color="888888" w:sz="4"/>
+              <w:left w:val="single" w:color="888888" w:sz="4"/>
+              <w:bottom w:val="single" w:color="888888" w:sz="4"/>
+              <w:right w:val="single" w:color="888888" w:sz="4"/>
+            </w:tcBorders>
+            <w:tcMar>
+              <w:top w:type="dxa" w:w="20"/>
+              <w:left w:type="dxa" w:w="60"/>
+              <w:bottom w:type="dxa" w:w="20"/>
+              <w:right w:type="dxa" w:w="60"/>
+            </w:tcMar>
+            <w:vAlign w:val="center"/>
+          </w:tcPr>
+          <w:p>
+            <w:pPr>
+              <w:spacing w:after="0" w:line="230"/>
+            </w:pPr>
+            <w:r>
+              <w:rPr>
+                <w:rFonts w:ascii="NanumGothic" w:cs="NanumGothic" w:eastAsia="NanumGothic" w:hAnsi="NanumGothic"/>
+                <w:sz w:val="16"/>
+                <w:szCs w:val="16"/>
+              </w:rPr>
+              <w:t xml:space="preserve">공용</w:t>
+            </w:r>
+          </w:p>
+        </w:tc>
+        <w:tc>
+          <w:tcPr>
+            <w:tcW w:type="dxa" w:w="2500"/>
+            <w:tcBorders>
+              <w:top w:val="single" w:color="888888" w:sz="4"/>
+              <w:left w:val="single" w:color="888888" w:sz="4"/>
+              <w:bottom w:val="single" w:color="888888" w:sz="4"/>
+              <w:right w:val="single" w:color="888888" w:sz="4"/>
+            </w:tcBorders>
+            <w:tcMar>
+              <w:top w:type="dxa" w:w="20"/>
+              <w:left w:type="dxa" w:w="60"/>
+              <w:bottom w:type="dxa" w:w="20"/>
+              <w:right w:type="dxa" w:w="60"/>
+            </w:tcMar>
+            <w:vAlign w:val="center"/>
+          </w:tcPr>
+          <w:p>
+            <w:pPr>
+              <w:spacing w:after="0" w:line="230"/>
+            </w:pPr>
+            <w:r>
+              <w:rPr>
+                <w:rFonts w:ascii="NanumGothic" w:cs="NanumGothic" w:eastAsia="NanumGothic" w:hAnsi="NanumGothic"/>
+                <w:sz w:val="16"/>
+                <w:szCs w:val="16"/>
+              </w:rPr>
+              <w:t xml:space="preserve">중앙 복도</w:t>
+            </w:r>
+          </w:p>
+        </w:tc>
+        <w:tc>
+          <w:tcPr>
+            <w:tcW w:type="dxa" w:w="2900"/>
+            <w:tcBorders>
+              <w:top w:val="single" w:color="888888" w:sz="4"/>
+              <w:left w:val="single" w:color="888888" w:sz="4"/>
+              <w:bottom w:val="single" w:color="888888" w:sz="4"/>
+              <w:right w:val="single" w:color="888888" w:sz="4"/>
+            </w:tcBorders>
+            <w:tcMar>
+              <w:top w:type="dxa" w:w="20"/>
+              <w:left w:type="dxa" w:w="60"/>
+              <w:bottom w:type="dxa" w:w="20"/>
+              <w:right w:type="dxa" w:w="60"/>
+            </w:tcMar>
+            <w:vAlign w:val="center"/>
+          </w:tcPr>
+          <w:p>
+            <w:pPr>
+              <w:spacing w:after="0" w:line="230"/>
+            </w:pPr>
+            <w:r>
+              <w:rPr>
+                <w:rFonts w:ascii="NanumGothic" w:cs="NanumGothic" w:eastAsia="NanumGothic" w:hAnsi="NanumGothic"/>
+                <w:sz w:val="16"/>
+                <w:szCs w:val="16"/>
+              </w:rPr>
+              <w:t xml:space="preserve">5 m × 50 m</w:t>
+            </w:r>
+          </w:p>
+        </w:tc>
+        <w:tc>
+          <w:tcPr>
+            <w:tcW w:type="dxa" w:w="1200"/>
+            <w:tcBorders>
+              <w:top w:val="single" w:color="888888" w:sz="4"/>
+              <w:left w:val="single" w:color="888888" w:sz="4"/>
+              <w:bottom w:val="single" w:color="888888" w:sz="4"/>
+              <w:right w:val="single" w:color="888888" w:sz="4"/>
+            </w:tcBorders>
+            <w:tcMar>
+              <w:top w:type="dxa" w:w="20"/>
+              <w:left w:type="dxa" w:w="60"/>
+              <w:bottom w:type="dxa" w:w="20"/>
+              <w:right w:type="dxa" w:w="60"/>
+            </w:tcMar>
+            <w:vAlign w:val="center"/>
+          </w:tcPr>
+          <w:p>
+            <w:pPr>
+              <w:spacing w:after="0" w:line="230"/>
+            </w:pPr>
+            <w:r>
+              <w:rPr>
+                <w:rFonts w:ascii="NanumGothic" w:cs="NanumGothic" w:eastAsia="NanumGothic" w:hAnsi="NanumGothic"/>
+                <w:sz w:val="16"/>
+                <w:szCs w:val="16"/>
+              </w:rPr>
+              <w:t xml:space="preserve">250 m²</w:t>
+            </w:r>
+          </w:p>
+        </w:tc>
+        <w:tc>
+          <w:tcPr>
+            <w:tcW w:type="dxa" w:w="3066"/>
+            <w:tcBorders>
+              <w:top w:val="single" w:color="888888" w:sz="4"/>
+              <w:left w:val="single" w:color="888888" w:sz="4"/>
+              <w:bottom w:val="single" w:color="888888" w:sz="4"/>
+              <w:right w:val="single" w:color="888888" w:sz="4"/>
+            </w:tcBorders>
+            <w:tcMar>
+              <w:top w:type="dxa" w:w="20"/>
+              <w:left w:type="dxa" w:w="60"/>
+              <w:bottom w:type="dxa" w:w="20"/>
+              <w:right w:type="dxa" w:w="60"/>
+            </w:tcMar>
+            <w:vAlign w:val="center"/>
+          </w:tcPr>
+          <w:p>
+            <w:pPr>
+              <w:spacing w:after="0" w:line="230"/>
+            </w:pPr>
+            <w:r>
+              <w:rPr>
+                <w:rFonts w:ascii="NanumGothic" w:cs="NanumGothic" w:eastAsia="NanumGothic" w:hAnsi="NanumGothic"/>
+                <w:sz w:val="16"/>
+                <w:szCs w:val="16"/>
+              </w:rPr>
+              <w:t xml:space="preserve">착유대기실 · 소 이동통로 · 트랙터/로봇 통로</w:t>
             </w:r>
           </w:p>
         </w:tc>
@@ -1713,156 +1713,156 @@
       <w:tr>
         <w:tc>
           <w:tcPr>
-            <w:tcW w:type="dxa" w:w="2600"/>
-            <w:tcBorders>
-              <w:top w:val="single" w:color="888888" w:sz="4"/>
-              <w:left w:val="single" w:color="888888" w:sz="4"/>
-              <w:bottom w:val="single" w:color="888888" w:sz="4"/>
-              <w:right w:val="single" w:color="888888" w:sz="4"/>
-            </w:tcBorders>
-            <w:tcMar>
-              <w:top w:type="dxa" w:w="20"/>
-              <w:left w:type="dxa" w:w="60"/>
-              <w:bottom w:type="dxa" w:w="20"/>
-              <w:right w:type="dxa" w:w="60"/>
-            </w:tcMar>
-            <w:vAlign w:val="center"/>
-          </w:tcPr>
-          <w:p>
-            <w:pPr>
-              <w:spacing w:after="0" w:line="230"/>
-            </w:pPr>
-            <w:r>
-              <w:rPr>
-                <w:rFonts w:ascii="NanumGothic" w:cs="NanumGothic" w:eastAsia="NanumGothic" w:hAnsi="NanumGothic"/>
-                <w:sz w:val="16"/>
-                <w:szCs w:val="16"/>
-              </w:rPr>
-              <w:t xml:space="preserve">음수 공간</w:t>
-            </w:r>
-          </w:p>
-        </w:tc>
-        <w:tc>
-          <w:tcPr>
-            <w:tcW w:type="dxa" w:w="2600"/>
-            <w:tcBorders>
-              <w:top w:val="single" w:color="888888" w:sz="4"/>
-              <w:left w:val="single" w:color="888888" w:sz="4"/>
-              <w:bottom w:val="single" w:color="888888" w:sz="4"/>
-              <w:right w:val="single" w:color="888888" w:sz="4"/>
-            </w:tcBorders>
-            <w:tcMar>
-              <w:top w:type="dxa" w:w="20"/>
-              <w:left w:type="dxa" w:w="60"/>
-              <w:bottom w:type="dxa" w:w="20"/>
-              <w:right w:type="dxa" w:w="60"/>
-            </w:tcMar>
-            <w:vAlign w:val="center"/>
-          </w:tcPr>
-          <w:p>
-            <w:pPr>
-              <w:spacing w:after="0" w:line="230"/>
-            </w:pPr>
-            <w:r>
-              <w:rPr>
-                <w:rFonts w:ascii="NanumGothic" w:cs="NanumGothic" w:eastAsia="NanumGothic" w:hAnsi="NanumGothic"/>
-                <w:sz w:val="16"/>
-                <w:szCs w:val="16"/>
-              </w:rPr>
-              <w:t xml:space="preserve">폭 약 2 m × 50 m</w:t>
-            </w:r>
-          </w:p>
-        </w:tc>
-        <w:tc>
-          <w:tcPr>
-            <w:tcW w:type="dxa" w:w="1400"/>
-            <w:tcBorders>
-              <w:top w:val="single" w:color="888888" w:sz="4"/>
-              <w:left w:val="single" w:color="888888" w:sz="4"/>
-              <w:bottom w:val="single" w:color="888888" w:sz="4"/>
-              <w:right w:val="single" w:color="888888" w:sz="4"/>
-            </w:tcBorders>
-            <w:tcMar>
-              <w:top w:type="dxa" w:w="20"/>
-              <w:left w:type="dxa" w:w="60"/>
-              <w:bottom w:type="dxa" w:w="20"/>
-              <w:right w:type="dxa" w:w="60"/>
-            </w:tcMar>
-            <w:vAlign w:val="center"/>
-          </w:tcPr>
-          <w:p>
-            <w:pPr>
-              <w:spacing w:after="0" w:line="230"/>
-            </w:pPr>
-            <w:r>
-              <w:rPr>
-                <w:rFonts w:ascii="NanumGothic" w:cs="NanumGothic" w:eastAsia="NanumGothic" w:hAnsi="NanumGothic"/>
-                <w:sz w:val="16"/>
-                <w:szCs w:val="16"/>
-              </w:rPr>
-              <w:t xml:space="preserve">100 m²</w:t>
-            </w:r>
-          </w:p>
-        </w:tc>
-        <w:tc>
-          <w:tcPr>
-            <w:tcW w:type="dxa" w:w="1500"/>
-            <w:tcBorders>
-              <w:top w:val="single" w:color="888888" w:sz="4"/>
-              <w:left w:val="single" w:color="888888" w:sz="4"/>
-              <w:bottom w:val="single" w:color="888888" w:sz="4"/>
-              <w:right w:val="single" w:color="888888" w:sz="4"/>
-            </w:tcBorders>
-            <w:tcMar>
-              <w:top w:type="dxa" w:w="20"/>
-              <w:left w:type="dxa" w:w="60"/>
-              <w:bottom w:type="dxa" w:w="20"/>
-              <w:right w:type="dxa" w:w="60"/>
-            </w:tcMar>
-            <w:vAlign w:val="center"/>
-          </w:tcPr>
-          <w:p>
-            <w:pPr>
-              <w:spacing w:after="0" w:line="230"/>
-            </w:pPr>
-            <w:r>
-              <w:rPr>
-                <w:rFonts w:ascii="NanumGothic" w:cs="NanumGothic" w:eastAsia="NanumGothic" w:hAnsi="NanumGothic"/>
-                <w:sz w:val="16"/>
-                <w:szCs w:val="16"/>
-              </w:rPr>
-              <w:t xml:space="preserve">200 m²</w:t>
-            </w:r>
-          </w:p>
-        </w:tc>
-        <w:tc>
-          <w:tcPr>
-            <w:tcW w:type="dxa" w:w="2366"/>
-            <w:tcBorders>
-              <w:top w:val="single" w:color="888888" w:sz="4"/>
-              <w:left w:val="single" w:color="888888" w:sz="4"/>
-              <w:bottom w:val="single" w:color="888888" w:sz="4"/>
-              <w:right w:val="single" w:color="888888" w:sz="4"/>
-            </w:tcBorders>
-            <w:tcMar>
-              <w:top w:type="dxa" w:w="20"/>
-              <w:left w:type="dxa" w:w="60"/>
-              <w:bottom w:type="dxa" w:w="20"/>
-              <w:right w:type="dxa" w:w="60"/>
-            </w:tcMar>
-            <w:vAlign w:val="center"/>
-          </w:tcPr>
-          <w:p>
-            <w:pPr>
-              <w:spacing w:after="0" w:line="230"/>
-            </w:pPr>
-            <w:r>
-              <w:rPr>
-                <w:rFonts w:ascii="NanumGothic" w:cs="NanumGothic" w:eastAsia="NanumGothic" w:hAnsi="NanumGothic"/>
-                <w:sz w:val="16"/>
-                <w:szCs w:val="16"/>
-              </w:rPr>
-              <w:t xml:space="preserve">베딩 제외</w:t>
+            <w:tcW w:type="dxa" w:w="800"/>
+            <w:tcBorders>
+              <w:top w:val="single" w:color="888888" w:sz="4"/>
+              <w:left w:val="single" w:color="888888" w:sz="4"/>
+              <w:bottom w:val="single" w:color="888888" w:sz="4"/>
+              <w:right w:val="single" w:color="888888" w:sz="4"/>
+            </w:tcBorders>
+            <w:tcMar>
+              <w:top w:type="dxa" w:w="20"/>
+              <w:left w:type="dxa" w:w="60"/>
+              <w:bottom w:type="dxa" w:w="20"/>
+              <w:right w:type="dxa" w:w="60"/>
+            </w:tcMar>
+            <w:vAlign w:val="center"/>
+          </w:tcPr>
+          <w:p>
+            <w:pPr>
+              <w:spacing w:after="0" w:line="230"/>
+            </w:pPr>
+            <w:r>
+              <w:rPr>
+                <w:rFonts w:ascii="NanumGothic" w:cs="NanumGothic" w:eastAsia="NanumGothic" w:hAnsi="NanumGothic"/>
+                <w:sz w:val="16"/>
+                <w:szCs w:val="16"/>
+              </w:rPr>
+              <w:t xml:space="preserve">B동</w:t>
+            </w:r>
+          </w:p>
+        </w:tc>
+        <w:tc>
+          <w:tcPr>
+            <w:tcW w:type="dxa" w:w="2500"/>
+            <w:tcBorders>
+              <w:top w:val="single" w:color="888888" w:sz="4"/>
+              <w:left w:val="single" w:color="888888" w:sz="4"/>
+              <w:bottom w:val="single" w:color="888888" w:sz="4"/>
+              <w:right w:val="single" w:color="888888" w:sz="4"/>
+            </w:tcBorders>
+            <w:tcMar>
+              <w:top w:type="dxa" w:w="20"/>
+              <w:left w:type="dxa" w:w="60"/>
+              <w:bottom w:type="dxa" w:w="20"/>
+              <w:right w:type="dxa" w:w="60"/>
+            </w:tcMar>
+            <w:vAlign w:val="center"/>
+          </w:tcPr>
+          <w:p>
+            <w:pPr>
+              <w:spacing w:after="0" w:line="230"/>
+            </w:pPr>
+            <w:r>
+              <w:rPr>
+                <w:rFonts w:ascii="NanumGothic" w:cs="NanumGothic" w:eastAsia="NanumGothic" w:hAnsi="NanumGothic"/>
+                <w:sz w:val="16"/>
+                <w:szCs w:val="16"/>
+              </w:rPr>
+              <w:t xml:space="preserve">휴식 공간 = 베딩 기준 면적</w:t>
+            </w:r>
+          </w:p>
+        </w:tc>
+        <w:tc>
+          <w:tcPr>
+            <w:tcW w:type="dxa" w:w="2900"/>
+            <w:tcBorders>
+              <w:top w:val="single" w:color="888888" w:sz="4"/>
+              <w:left w:val="single" w:color="888888" w:sz="4"/>
+              <w:bottom w:val="single" w:color="888888" w:sz="4"/>
+              <w:right w:val="single" w:color="888888" w:sz="4"/>
+            </w:tcBorders>
+            <w:tcMar>
+              <w:top w:type="dxa" w:w="20"/>
+              <w:left w:type="dxa" w:w="60"/>
+              <w:bottom w:type="dxa" w:w="20"/>
+              <w:right w:type="dxa" w:w="60"/>
+            </w:tcMar>
+            <w:vAlign w:val="center"/>
+          </w:tcPr>
+          <w:p>
+            <w:pPr>
+              <w:spacing w:after="0" w:line="230"/>
+            </w:pPr>
+            <w:r>
+              <w:rPr>
+                <w:rFonts w:ascii="NanumGothic" w:cs="NanumGothic" w:eastAsia="NanumGothic" w:hAnsi="NanumGothic"/>
+                <w:sz w:val="16"/>
+                <w:szCs w:val="16"/>
+              </w:rPr>
+              <w:t xml:space="preserve">14 m × 37 m</w:t>
+            </w:r>
+          </w:p>
+        </w:tc>
+        <w:tc>
+          <w:tcPr>
+            <w:tcW w:type="dxa" w:w="1200"/>
+            <w:tcBorders>
+              <w:top w:val="single" w:color="888888" w:sz="4"/>
+              <w:left w:val="single" w:color="888888" w:sz="4"/>
+              <w:bottom w:val="single" w:color="888888" w:sz="4"/>
+              <w:right w:val="single" w:color="888888" w:sz="4"/>
+            </w:tcBorders>
+            <w:tcMar>
+              <w:top w:type="dxa" w:w="20"/>
+              <w:left w:type="dxa" w:w="60"/>
+              <w:bottom w:type="dxa" w:w="20"/>
+              <w:right w:type="dxa" w:w="60"/>
+            </w:tcMar>
+            <w:vAlign w:val="center"/>
+          </w:tcPr>
+          <w:p>
+            <w:pPr>
+              <w:spacing w:after="0" w:line="230"/>
+            </w:pPr>
+            <w:r>
+              <w:rPr>
+                <w:rFonts w:ascii="NanumGothic" w:cs="NanumGothic" w:eastAsia="NanumGothic" w:hAnsi="NanumGothic"/>
+                <w:sz w:val="16"/>
+                <w:szCs w:val="16"/>
+              </w:rPr>
+              <w:t xml:space="preserve">518 m²</w:t>
+            </w:r>
+          </w:p>
+        </w:tc>
+        <w:tc>
+          <w:tcPr>
+            <w:tcW w:type="dxa" w:w="3066"/>
+            <w:tcBorders>
+              <w:top w:val="single" w:color="888888" w:sz="4"/>
+              <w:left w:val="single" w:color="888888" w:sz="4"/>
+              <w:bottom w:val="single" w:color="888888" w:sz="4"/>
+              <w:right w:val="single" w:color="888888" w:sz="4"/>
+            </w:tcBorders>
+            <w:tcMar>
+              <w:top w:type="dxa" w:w="20"/>
+              <w:left w:type="dxa" w:w="60"/>
+              <w:bottom w:type="dxa" w:w="20"/>
+              <w:right w:type="dxa" w:w="60"/>
+            </w:tcMar>
+            <w:vAlign w:val="center"/>
+          </w:tcPr>
+          <w:p>
+            <w:pPr>
+              <w:spacing w:after="0" w:line="230"/>
+            </w:pPr>
+            <w:r>
+              <w:rPr>
+                <w:rFonts w:ascii="NanumGothic" w:cs="NanumGothic" w:eastAsia="NanumGothic" w:hAnsi="NanumGothic"/>
+                <w:sz w:val="16"/>
+                <w:szCs w:val="16"/>
+              </w:rPr>
+              <w:t xml:space="preserve">로봇 작업 대상</w:t>
             </w:r>
           </w:p>
         </w:tc>
@@ -1870,156 +1870,156 @@
       <w:tr>
         <w:tc>
           <w:tcPr>
-            <w:tcW w:type="dxa" w:w="2600"/>
-            <w:tcBorders>
-              <w:top w:val="single" w:color="888888" w:sz="4"/>
-              <w:left w:val="single" w:color="888888" w:sz="4"/>
-              <w:bottom w:val="single" w:color="888888" w:sz="4"/>
-              <w:right w:val="single" w:color="888888" w:sz="4"/>
-            </w:tcBorders>
-            <w:tcMar>
-              <w:top w:type="dxa" w:w="20"/>
-              <w:left w:type="dxa" w:w="60"/>
-              <w:bottom w:type="dxa" w:w="20"/>
-              <w:right w:type="dxa" w:w="60"/>
-            </w:tcMar>
-            <w:vAlign w:val="center"/>
-          </w:tcPr>
-          <w:p>
-            <w:pPr>
-              <w:spacing w:after="0" w:line="230"/>
-            </w:pPr>
-            <w:r>
-              <w:rPr>
-                <w:rFonts w:ascii="NanumGothic" w:cs="NanumGothic" w:eastAsia="NanumGothic" w:hAnsi="NanumGothic"/>
-                <w:sz w:val="16"/>
-                <w:szCs w:val="16"/>
-              </w:rPr>
-              <w:t xml:space="preserve">휴식 공간 = 베딩 기준 면적</w:t>
-            </w:r>
-          </w:p>
-        </w:tc>
-        <w:tc>
-          <w:tcPr>
-            <w:tcW w:type="dxa" w:w="2600"/>
-            <w:tcBorders>
-              <w:top w:val="single" w:color="888888" w:sz="4"/>
-              <w:left w:val="single" w:color="888888" w:sz="4"/>
-              <w:bottom w:val="single" w:color="888888" w:sz="4"/>
-              <w:right w:val="single" w:color="888888" w:sz="4"/>
-            </w:tcBorders>
-            <w:tcMar>
-              <w:top w:type="dxa" w:w="20"/>
-              <w:left w:type="dxa" w:w="60"/>
-              <w:bottom w:type="dxa" w:w="20"/>
-              <w:right w:type="dxa" w:w="60"/>
-            </w:tcMar>
-            <w:vAlign w:val="center"/>
-          </w:tcPr>
-          <w:p>
-            <w:pPr>
-              <w:spacing w:after="0" w:line="230"/>
-            </w:pPr>
-            <w:r>
-              <w:rPr>
-                <w:rFonts w:ascii="NanumGothic" w:cs="NanumGothic" w:eastAsia="NanumGothic" w:hAnsi="NanumGothic"/>
-                <w:sz w:val="16"/>
-                <w:szCs w:val="16"/>
-              </w:rPr>
-              <w:t xml:space="preserve">폭 15 m × 50 m</w:t>
-            </w:r>
-          </w:p>
-        </w:tc>
-        <w:tc>
-          <w:tcPr>
-            <w:tcW w:type="dxa" w:w="1400"/>
-            <w:tcBorders>
-              <w:top w:val="single" w:color="888888" w:sz="4"/>
-              <w:left w:val="single" w:color="888888" w:sz="4"/>
-              <w:bottom w:val="single" w:color="888888" w:sz="4"/>
-              <w:right w:val="single" w:color="888888" w:sz="4"/>
-            </w:tcBorders>
-            <w:tcMar>
-              <w:top w:type="dxa" w:w="20"/>
-              <w:left w:type="dxa" w:w="60"/>
-              <w:bottom w:type="dxa" w:w="20"/>
-              <w:right w:type="dxa" w:w="60"/>
-            </w:tcMar>
-            <w:vAlign w:val="center"/>
-          </w:tcPr>
-          <w:p>
-            <w:pPr>
-              <w:spacing w:after="0" w:line="230"/>
-            </w:pPr>
-            <w:r>
-              <w:rPr>
-                <w:rFonts w:ascii="NanumGothic" w:cs="NanumGothic" w:eastAsia="NanumGothic" w:hAnsi="NanumGothic"/>
-                <w:sz w:val="16"/>
-                <w:szCs w:val="16"/>
-              </w:rPr>
-              <w:t xml:space="preserve">750 m²</w:t>
-            </w:r>
-          </w:p>
-        </w:tc>
-        <w:tc>
-          <w:tcPr>
-            <w:tcW w:type="dxa" w:w="1500"/>
-            <w:tcBorders>
-              <w:top w:val="single" w:color="888888" w:sz="4"/>
-              <w:left w:val="single" w:color="888888" w:sz="4"/>
-              <w:bottom w:val="single" w:color="888888" w:sz="4"/>
-              <w:right w:val="single" w:color="888888" w:sz="4"/>
-            </w:tcBorders>
-            <w:tcMar>
-              <w:top w:type="dxa" w:w="20"/>
-              <w:left w:type="dxa" w:w="60"/>
-              <w:bottom w:type="dxa" w:w="20"/>
-              <w:right w:type="dxa" w:w="60"/>
-            </w:tcMar>
-            <w:vAlign w:val="center"/>
-          </w:tcPr>
-          <w:p>
-            <w:pPr>
-              <w:spacing w:after="0" w:line="230"/>
-            </w:pPr>
-            <w:r>
-              <w:rPr>
-                <w:rFonts w:ascii="NanumGothic" w:cs="NanumGothic" w:eastAsia="NanumGothic" w:hAnsi="NanumGothic"/>
-                <w:sz w:val="16"/>
-                <w:szCs w:val="16"/>
-              </w:rPr>
-              <w:t xml:space="preserve">1,500 m²</w:t>
-            </w:r>
-          </w:p>
-        </w:tc>
-        <w:tc>
-          <w:tcPr>
-            <w:tcW w:type="dxa" w:w="2366"/>
-            <w:tcBorders>
-              <w:top w:val="single" w:color="888888" w:sz="4"/>
-              <w:left w:val="single" w:color="888888" w:sz="4"/>
-              <w:bottom w:val="single" w:color="888888" w:sz="4"/>
-              <w:right w:val="single" w:color="888888" w:sz="4"/>
-            </w:tcBorders>
-            <w:tcMar>
-              <w:top w:type="dxa" w:w="20"/>
-              <w:left w:type="dxa" w:w="60"/>
-              <w:bottom w:type="dxa" w:w="20"/>
-              <w:right w:type="dxa" w:w="60"/>
-            </w:tcMar>
-            <w:vAlign w:val="center"/>
-          </w:tcPr>
-          <w:p>
-            <w:pPr>
-              <w:spacing w:after="0" w:line="230"/>
-            </w:pPr>
-            <w:r>
-              <w:rPr>
-                <w:rFonts w:ascii="NanumGothic" w:cs="NanumGothic" w:eastAsia="NanumGothic" w:hAnsi="NanumGothic"/>
-                <w:sz w:val="16"/>
-                <w:szCs w:val="16"/>
-              </w:rPr>
-              <w:t xml:space="preserve">소가 누워 쉬는 공간 · 로봇 작업 대상</w:t>
+            <w:tcW w:type="dxa" w:w="800"/>
+            <w:tcBorders>
+              <w:top w:val="single" w:color="888888" w:sz="4"/>
+              <w:left w:val="single" w:color="888888" w:sz="4"/>
+              <w:bottom w:val="single" w:color="888888" w:sz="4"/>
+              <w:right w:val="single" w:color="888888" w:sz="4"/>
+            </w:tcBorders>
+            <w:tcMar>
+              <w:top w:type="dxa" w:w="20"/>
+              <w:left w:type="dxa" w:w="60"/>
+              <w:bottom w:type="dxa" w:w="20"/>
+              <w:right w:type="dxa" w:w="60"/>
+            </w:tcMar>
+            <w:vAlign w:val="center"/>
+          </w:tcPr>
+          <w:p>
+            <w:pPr>
+              <w:spacing w:after="0" w:line="230"/>
+            </w:pPr>
+            <w:r>
+              <w:rPr>
+                <w:rFonts w:ascii="NanumGothic" w:cs="NanumGothic" w:eastAsia="NanumGothic" w:hAnsi="NanumGothic"/>
+                <w:sz w:val="16"/>
+                <w:szCs w:val="16"/>
+              </w:rPr>
+              <w:t xml:space="preserve">B동</w:t>
+            </w:r>
+          </w:p>
+        </w:tc>
+        <w:tc>
+          <w:tcPr>
+            <w:tcW w:type="dxa" w:w="2500"/>
+            <w:tcBorders>
+              <w:top w:val="single" w:color="888888" w:sz="4"/>
+              <w:left w:val="single" w:color="888888" w:sz="4"/>
+              <w:bottom w:val="single" w:color="888888" w:sz="4"/>
+              <w:right w:val="single" w:color="888888" w:sz="4"/>
+            </w:tcBorders>
+            <w:tcMar>
+              <w:top w:type="dxa" w:w="20"/>
+              <w:left w:type="dxa" w:w="60"/>
+              <w:bottom w:type="dxa" w:w="20"/>
+              <w:right w:type="dxa" w:w="60"/>
+            </w:tcMar>
+            <w:vAlign w:val="center"/>
+          </w:tcPr>
+          <w:p>
+            <w:pPr>
+              <w:spacing w:after="0" w:line="230"/>
+            </w:pPr>
+            <w:r>
+              <w:rPr>
+                <w:rFonts w:ascii="NanumGothic" w:cs="NanumGothic" w:eastAsia="NanumGothic" w:hAnsi="NanumGothic"/>
+                <w:sz w:val="16"/>
+                <w:szCs w:val="16"/>
+              </w:rPr>
+              <w:t xml:space="preserve">사조 / 하단 급수 통로</w:t>
+            </w:r>
+          </w:p>
+        </w:tc>
+        <w:tc>
+          <w:tcPr>
+            <w:tcW w:type="dxa" w:w="2900"/>
+            <w:tcBorders>
+              <w:top w:val="single" w:color="888888" w:sz="4"/>
+              <w:left w:val="single" w:color="888888" w:sz="4"/>
+              <w:bottom w:val="single" w:color="888888" w:sz="4"/>
+              <w:right w:val="single" w:color="888888" w:sz="4"/>
+            </w:tcBorders>
+            <w:tcMar>
+              <w:top w:type="dxa" w:w="20"/>
+              <w:left w:type="dxa" w:w="60"/>
+              <w:bottom w:type="dxa" w:w="20"/>
+              <w:right w:type="dxa" w:w="60"/>
+            </w:tcMar>
+            <w:vAlign w:val="center"/>
+          </w:tcPr>
+          <w:p>
+            <w:pPr>
+              <w:spacing w:after="0" w:line="230"/>
+            </w:pPr>
+            <w:r>
+              <w:rPr>
+                <w:rFonts w:ascii="NanumGothic" w:cs="NanumGothic" w:eastAsia="NanumGothic" w:hAnsi="NanumGothic"/>
+                <w:sz w:val="16"/>
+                <w:szCs w:val="16"/>
+              </w:rPr>
+              <w:t xml:space="preserve">3 m × 50 m / 3 m × 37 m (급수조 2개 외벽)</w:t>
+            </w:r>
+          </w:p>
+        </w:tc>
+        <w:tc>
+          <w:tcPr>
+            <w:tcW w:type="dxa" w:w="1200"/>
+            <w:tcBorders>
+              <w:top w:val="single" w:color="888888" w:sz="4"/>
+              <w:left w:val="single" w:color="888888" w:sz="4"/>
+              <w:bottom w:val="single" w:color="888888" w:sz="4"/>
+              <w:right w:val="single" w:color="888888" w:sz="4"/>
+            </w:tcBorders>
+            <w:tcMar>
+              <w:top w:type="dxa" w:w="20"/>
+              <w:left w:type="dxa" w:w="60"/>
+              <w:bottom w:type="dxa" w:w="20"/>
+              <w:right w:type="dxa" w:w="60"/>
+            </w:tcMar>
+            <w:vAlign w:val="center"/>
+          </w:tcPr>
+          <w:p>
+            <w:pPr>
+              <w:spacing w:after="0" w:line="230"/>
+            </w:pPr>
+            <w:r>
+              <w:rPr>
+                <w:rFonts w:ascii="NanumGothic" w:cs="NanumGothic" w:eastAsia="NanumGothic" w:hAnsi="NanumGothic"/>
+                <w:sz w:val="16"/>
+                <w:szCs w:val="16"/>
+              </w:rPr>
+              <w:t xml:space="preserve">150 / 111 m²</w:t>
+            </w:r>
+          </w:p>
+        </w:tc>
+        <w:tc>
+          <w:tcPr>
+            <w:tcW w:type="dxa" w:w="3066"/>
+            <w:tcBorders>
+              <w:top w:val="single" w:color="888888" w:sz="4"/>
+              <w:left w:val="single" w:color="888888" w:sz="4"/>
+              <w:bottom w:val="single" w:color="888888" w:sz="4"/>
+              <w:right w:val="single" w:color="888888" w:sz="4"/>
+            </w:tcBorders>
+            <w:tcMar>
+              <w:top w:type="dxa" w:w="20"/>
+              <w:left w:type="dxa" w:w="60"/>
+              <w:bottom w:type="dxa" w:w="20"/>
+              <w:right w:type="dxa" w:w="60"/>
+            </w:tcMar>
+            <w:vAlign w:val="center"/>
+          </w:tcPr>
+          <w:p>
+            <w:pPr>
+              <w:spacing w:after="0" w:line="230"/>
+            </w:pPr>
+            <w:r>
+              <w:rPr>
+                <w:rFonts w:ascii="NanumGothic" w:cs="NanumGothic" w:eastAsia="NanumGothic" w:hAnsi="NanumGothic"/>
+                <w:sz w:val="16"/>
+                <w:szCs w:val="16"/>
+              </w:rPr>
+              <w:t xml:space="preserve">베딩 제외 · 이동 통로</w:t>
             </w:r>
           </w:p>
         </w:tc>
@@ -2027,156 +2027,470 @@
       <w:tr>
         <w:tc>
           <w:tcPr>
-            <w:tcW w:type="dxa" w:w="2600"/>
-            <w:tcBorders>
-              <w:top w:val="single" w:color="888888" w:sz="4"/>
-              <w:left w:val="single" w:color="888888" w:sz="4"/>
-              <w:bottom w:val="single" w:color="888888" w:sz="4"/>
-              <w:right w:val="single" w:color="888888" w:sz="4"/>
-            </w:tcBorders>
-            <w:tcMar>
-              <w:top w:type="dxa" w:w="20"/>
-              <w:left w:type="dxa" w:w="60"/>
-              <w:bottom w:type="dxa" w:w="20"/>
-              <w:right w:type="dxa" w:w="60"/>
-            </w:tcMar>
-            <w:vAlign w:val="center"/>
-          </w:tcPr>
-          <w:p>
-            <w:pPr>
-              <w:spacing w:after="0" w:line="230"/>
-            </w:pPr>
-            <w:r>
-              <w:rPr>
-                <w:rFonts w:ascii="NanumGothic" w:cs="NanumGothic" w:eastAsia="NanumGothic" w:hAnsi="NanumGothic"/>
-                <w:sz w:val="16"/>
-                <w:szCs w:val="16"/>
-              </w:rPr>
-              <w:t xml:space="preserve">기둥 배치</w:t>
-            </w:r>
-          </w:p>
-        </w:tc>
-        <w:tc>
-          <w:tcPr>
-            <w:tcW w:type="dxa" w:w="2600"/>
-            <w:tcBorders>
-              <w:top w:val="single" w:color="888888" w:sz="4"/>
-              <w:left w:val="single" w:color="888888" w:sz="4"/>
-              <w:bottom w:val="single" w:color="888888" w:sz="4"/>
-              <w:right w:val="single" w:color="888888" w:sz="4"/>
-            </w:tcBorders>
-            <w:tcMar>
-              <w:top w:type="dxa" w:w="20"/>
-              <w:left w:type="dxa" w:w="60"/>
-              <w:bottom w:type="dxa" w:w="20"/>
-              <w:right w:type="dxa" w:w="60"/>
-            </w:tcMar>
-            <w:vAlign w:val="center"/>
-          </w:tcPr>
-          <w:p>
-            <w:pPr>
-              <w:spacing w:after="0" w:line="230"/>
-            </w:pPr>
-            <w:r>
-              <w:rPr>
-                <w:rFonts w:ascii="NanumGothic" w:cs="NanumGothic" w:eastAsia="NanumGothic" w:hAnsi="NanumGothic"/>
-                <w:sz w:val="16"/>
-                <w:szCs w:val="16"/>
-              </w:rPr>
-              <w:t xml:space="preserve">가로 10 m 간격 · 세로 5 m 간격</w:t>
-            </w:r>
-          </w:p>
-        </w:tc>
-        <w:tc>
-          <w:tcPr>
-            <w:tcW w:type="dxa" w:w="1400"/>
-            <w:tcBorders>
-              <w:top w:val="single" w:color="888888" w:sz="4"/>
-              <w:left w:val="single" w:color="888888" w:sz="4"/>
-              <w:bottom w:val="single" w:color="888888" w:sz="4"/>
-              <w:right w:val="single" w:color="888888" w:sz="4"/>
-            </w:tcBorders>
-            <w:tcMar>
-              <w:top w:type="dxa" w:w="20"/>
-              <w:left w:type="dxa" w:w="60"/>
-              <w:bottom w:type="dxa" w:w="20"/>
-              <w:right w:type="dxa" w:w="60"/>
-            </w:tcMar>
-            <w:vAlign w:val="center"/>
-          </w:tcPr>
-          <w:p>
-            <w:pPr>
-              <w:spacing w:after="0" w:line="230"/>
-            </w:pPr>
-            <w:r>
-              <w:rPr>
-                <w:rFonts w:ascii="NanumGothic" w:cs="NanumGothic" w:eastAsia="NanumGothic" w:hAnsi="NanumGothic"/>
-                <w:sz w:val="16"/>
-                <w:szCs w:val="16"/>
-              </w:rPr>
-              <w:t xml:space="preserve">3열 × 11열</w:t>
-            </w:r>
-          </w:p>
-        </w:tc>
-        <w:tc>
-          <w:tcPr>
-            <w:tcW w:type="dxa" w:w="1500"/>
-            <w:tcBorders>
-              <w:top w:val="single" w:color="888888" w:sz="4"/>
-              <w:left w:val="single" w:color="888888" w:sz="4"/>
-              <w:bottom w:val="single" w:color="888888" w:sz="4"/>
-              <w:right w:val="single" w:color="888888" w:sz="4"/>
-            </w:tcBorders>
-            <w:tcMar>
-              <w:top w:type="dxa" w:w="20"/>
-              <w:left w:type="dxa" w:w="60"/>
-              <w:bottom w:type="dxa" w:w="20"/>
-              <w:right w:type="dxa" w:w="60"/>
-            </w:tcMar>
-            <w:vAlign w:val="center"/>
-          </w:tcPr>
-          <w:p>
-            <w:pPr>
-              <w:spacing w:after="0" w:line="230"/>
-            </w:pPr>
-            <w:r>
-              <w:rPr>
-                <w:rFonts w:ascii="NanumGothic" w:cs="NanumGothic" w:eastAsia="NanumGothic" w:hAnsi="NanumGothic"/>
-                <w:sz w:val="16"/>
-                <w:szCs w:val="16"/>
-              </w:rPr>
-              <w:t xml:space="preserve">10 m × 5 m 베이 40개</w:t>
-            </w:r>
-          </w:p>
-        </w:tc>
-        <w:tc>
-          <w:tcPr>
-            <w:tcW w:type="dxa" w:w="2366"/>
-            <w:tcBorders>
-              <w:top w:val="single" w:color="888888" w:sz="4"/>
-              <w:left w:val="single" w:color="888888" w:sz="4"/>
-              <w:bottom w:val="single" w:color="888888" w:sz="4"/>
-              <w:right w:val="single" w:color="888888" w:sz="4"/>
-            </w:tcBorders>
-            <w:tcMar>
-              <w:top w:type="dxa" w:w="20"/>
-              <w:left w:type="dxa" w:w="60"/>
-              <w:bottom w:type="dxa" w:w="20"/>
-              <w:right w:type="dxa" w:w="60"/>
-            </w:tcMar>
-            <w:vAlign w:val="center"/>
-          </w:tcPr>
-          <w:p>
-            <w:pPr>
-              <w:spacing w:after="0" w:line="230"/>
-            </w:pPr>
-            <w:r>
-              <w:rPr>
-                <w:rFonts w:ascii="NanumGothic" w:cs="NanumGothic" w:eastAsia="NanumGothic" w:hAnsi="NanumGothic"/>
-                <w:sz w:val="16"/>
-                <w:szCs w:val="16"/>
-              </w:rPr>
-              <w:t xml:space="preserve">중간 기둥 열이 휴식 공간 내부 통과 → 로봇 경로 제약</w:t>
+            <w:tcW w:type="dxa" w:w="800"/>
+            <w:tcBorders>
+              <w:top w:val="single" w:color="888888" w:sz="4"/>
+              <w:left w:val="single" w:color="888888" w:sz="4"/>
+              <w:bottom w:val="single" w:color="888888" w:sz="4"/>
+              <w:right w:val="single" w:color="888888" w:sz="4"/>
+            </w:tcBorders>
+            <w:tcMar>
+              <w:top w:type="dxa" w:w="20"/>
+              <w:left w:type="dxa" w:w="60"/>
+              <w:bottom w:type="dxa" w:w="20"/>
+              <w:right w:type="dxa" w:w="60"/>
+            </w:tcMar>
+            <w:vAlign w:val="center"/>
+          </w:tcPr>
+          <w:p>
+            <w:pPr>
+              <w:spacing w:after="0" w:line="230"/>
+            </w:pPr>
+            <w:r>
+              <w:rPr>
+                <w:rFonts w:ascii="NanumGothic" w:cs="NanumGothic" w:eastAsia="NanumGothic" w:hAnsi="NanumGothic"/>
+                <w:sz w:val="16"/>
+                <w:szCs w:val="16"/>
+              </w:rPr>
+              <w:t xml:space="preserve">B동</w:t>
+            </w:r>
+          </w:p>
+        </w:tc>
+        <w:tc>
+          <w:tcPr>
+            <w:tcW w:type="dxa" w:w="2500"/>
+            <w:tcBorders>
+              <w:top w:val="single" w:color="888888" w:sz="4"/>
+              <w:left w:val="single" w:color="888888" w:sz="4"/>
+              <w:bottom w:val="single" w:color="888888" w:sz="4"/>
+              <w:right w:val="single" w:color="888888" w:sz="4"/>
+            </w:tcBorders>
+            <w:tcMar>
+              <w:top w:type="dxa" w:w="20"/>
+              <w:left w:type="dxa" w:w="60"/>
+              <w:bottom w:type="dxa" w:w="20"/>
+              <w:right w:type="dxa" w:w="60"/>
+            </w:tcMar>
+            <w:vAlign w:val="center"/>
+          </w:tcPr>
+          <w:p>
+            <w:pPr>
+              <w:spacing w:after="0" w:line="230"/>
+            </w:pPr>
+            <w:r>
+              <w:rPr>
+                <w:rFonts w:ascii="NanumGothic" w:cs="NanumGothic" w:eastAsia="NanumGothic" w:hAnsi="NanumGothic"/>
+                <w:sz w:val="16"/>
+                <w:szCs w:val="16"/>
+              </w:rPr>
+              <w:t xml:space="preserve">로봇착유기실 / 착유 대기·이동 통로</w:t>
+            </w:r>
+          </w:p>
+        </w:tc>
+        <w:tc>
+          <w:tcPr>
+            <w:tcW w:type="dxa" w:w="2900"/>
+            <w:tcBorders>
+              <w:top w:val="single" w:color="888888" w:sz="4"/>
+              <w:left w:val="single" w:color="888888" w:sz="4"/>
+              <w:bottom w:val="single" w:color="888888" w:sz="4"/>
+              <w:right w:val="single" w:color="888888" w:sz="4"/>
+            </w:tcBorders>
+            <w:tcMar>
+              <w:top w:type="dxa" w:w="20"/>
+              <w:left w:type="dxa" w:w="60"/>
+              <w:bottom w:type="dxa" w:w="20"/>
+              <w:right w:type="dxa" w:w="60"/>
+            </w:tcMar>
+            <w:vAlign w:val="center"/>
+          </w:tcPr>
+          <w:p>
+            <w:pPr>
+              <w:spacing w:after="0" w:line="230"/>
+            </w:pPr>
+            <w:r>
+              <w:rPr>
+                <w:rFonts w:ascii="NanumGothic" w:cs="NanumGothic" w:eastAsia="NanumGothic" w:hAnsi="NanumGothic"/>
+                <w:sz w:val="16"/>
+                <w:szCs w:val="16"/>
+              </w:rPr>
+              <w:t xml:space="preserve">10 m × 10 m / 약 121 m²</w:t>
+            </w:r>
+          </w:p>
+        </w:tc>
+        <w:tc>
+          <w:tcPr>
+            <w:tcW w:type="dxa" w:w="1200"/>
+            <w:tcBorders>
+              <w:top w:val="single" w:color="888888" w:sz="4"/>
+              <w:left w:val="single" w:color="888888" w:sz="4"/>
+              <w:bottom w:val="single" w:color="888888" w:sz="4"/>
+              <w:right w:val="single" w:color="888888" w:sz="4"/>
+            </w:tcBorders>
+            <w:tcMar>
+              <w:top w:type="dxa" w:w="20"/>
+              <w:left w:type="dxa" w:w="60"/>
+              <w:bottom w:type="dxa" w:w="20"/>
+              <w:right w:type="dxa" w:w="60"/>
+            </w:tcMar>
+            <w:vAlign w:val="center"/>
+          </w:tcPr>
+          <w:p>
+            <w:pPr>
+              <w:spacing w:after="0" w:line="230"/>
+            </w:pPr>
+            <w:r>
+              <w:rPr>
+                <w:rFonts w:ascii="NanumGothic" w:cs="NanumGothic" w:eastAsia="NanumGothic" w:hAnsi="NanumGothic"/>
+                <w:sz w:val="16"/>
+                <w:szCs w:val="16"/>
+              </w:rPr>
+              <w:t xml:space="preserve">100 / 121 m²</w:t>
+            </w:r>
+          </w:p>
+        </w:tc>
+        <w:tc>
+          <w:tcPr>
+            <w:tcW w:type="dxa" w:w="3066"/>
+            <w:tcBorders>
+              <w:top w:val="single" w:color="888888" w:sz="4"/>
+              <w:left w:val="single" w:color="888888" w:sz="4"/>
+              <w:bottom w:val="single" w:color="888888" w:sz="4"/>
+              <w:right w:val="single" w:color="888888" w:sz="4"/>
+            </w:tcBorders>
+            <w:tcMar>
+              <w:top w:type="dxa" w:w="20"/>
+              <w:left w:type="dxa" w:w="60"/>
+              <w:bottom w:type="dxa" w:w="20"/>
+              <w:right w:type="dxa" w:w="60"/>
+            </w:tcMar>
+            <w:vAlign w:val="center"/>
+          </w:tcPr>
+          <w:p>
+            <w:pPr>
+              <w:spacing w:after="0" w:line="230"/>
+            </w:pPr>
+            <w:r>
+              <w:rPr>
+                <w:rFonts w:ascii="NanumGothic" w:cs="NanumGothic" w:eastAsia="NanumGothic" w:hAnsi="NanumGothic"/>
+                <w:sz w:val="16"/>
+                <w:szCs w:val="16"/>
+              </w:rPr>
+              <w:t xml:space="preserve">로봇 진입 금지 (통로 경계 확인 필요)</w:t>
+            </w:r>
+          </w:p>
+        </w:tc>
+      </w:tr>
+      <w:tr>
+        <w:tc>
+          <w:tcPr>
+            <w:tcW w:type="dxa" w:w="800"/>
+            <w:tcBorders>
+              <w:top w:val="single" w:color="888888" w:sz="4"/>
+              <w:left w:val="single" w:color="888888" w:sz="4"/>
+              <w:bottom w:val="single" w:color="888888" w:sz="4"/>
+              <w:right w:val="single" w:color="888888" w:sz="4"/>
+            </w:tcBorders>
+            <w:tcMar>
+              <w:top w:type="dxa" w:w="20"/>
+              <w:left w:type="dxa" w:w="60"/>
+              <w:bottom w:type="dxa" w:w="20"/>
+              <w:right w:type="dxa" w:w="60"/>
+            </w:tcMar>
+            <w:vAlign w:val="center"/>
+          </w:tcPr>
+          <w:p>
+            <w:pPr>
+              <w:spacing w:after="0" w:line="230"/>
+            </w:pPr>
+            <w:r>
+              <w:rPr>
+                <w:rFonts w:ascii="NanumGothic" w:cs="NanumGothic" w:eastAsia="NanumGothic" w:hAnsi="NanumGothic"/>
+                <w:sz w:val="16"/>
+                <w:szCs w:val="16"/>
+              </w:rPr>
+              <w:t xml:space="preserve">—</w:t>
+            </w:r>
+          </w:p>
+        </w:tc>
+        <w:tc>
+          <w:tcPr>
+            <w:tcW w:type="dxa" w:w="2500"/>
+            <w:tcBorders>
+              <w:top w:val="single" w:color="888888" w:sz="4"/>
+              <w:left w:val="single" w:color="888888" w:sz="4"/>
+              <w:bottom w:val="single" w:color="888888" w:sz="4"/>
+              <w:right w:val="single" w:color="888888" w:sz="4"/>
+            </w:tcBorders>
+            <w:tcMar>
+              <w:top w:type="dxa" w:w="20"/>
+              <w:left w:type="dxa" w:w="60"/>
+              <w:bottom w:type="dxa" w:w="20"/>
+              <w:right w:type="dxa" w:w="60"/>
+            </w:tcMar>
+            <w:vAlign w:val="center"/>
+          </w:tcPr>
+          <w:p>
+            <w:pPr>
+              <w:spacing w:after="0" w:line="230"/>
+            </w:pPr>
+            <w:r>
+              <w:rPr>
+                <w:rFonts w:ascii="NanumGothic" w:cs="NanumGothic" w:eastAsia="NanumGothic" w:hAnsi="NanumGothic"/>
+                <w:sz w:val="16"/>
+                <w:szCs w:val="16"/>
+              </w:rPr>
+              <w:t xml:space="preserve">서측 부속 구역 / 기둥</w:t>
+            </w:r>
+          </w:p>
+        </w:tc>
+        <w:tc>
+          <w:tcPr>
+            <w:tcW w:type="dxa" w:w="2900"/>
+            <w:tcBorders>
+              <w:top w:val="single" w:color="888888" w:sz="4"/>
+              <w:left w:val="single" w:color="888888" w:sz="4"/>
+              <w:bottom w:val="single" w:color="888888" w:sz="4"/>
+              <w:right w:val="single" w:color="888888" w:sz="4"/>
+            </w:tcBorders>
+            <w:tcMar>
+              <w:top w:type="dxa" w:w="20"/>
+              <w:left w:type="dxa" w:w="60"/>
+              <w:bottom w:type="dxa" w:w="20"/>
+              <w:right w:type="dxa" w:w="60"/>
+            </w:tcMar>
+            <w:vAlign w:val="center"/>
+          </w:tcPr>
+          <w:p>
+            <w:pPr>
+              <w:spacing w:after="0" w:line="230"/>
+            </w:pPr>
+            <w:r>
+              <w:rPr>
+                <w:rFonts w:ascii="NanumGothic" w:cs="NanumGothic" w:eastAsia="NanumGothic" w:hAnsi="NanumGothic"/>
+                <w:sz w:val="16"/>
+                <w:szCs w:val="16"/>
+              </w:rPr>
+              <w:t xml:space="preserve">10 m × 45 m / 가로 10 m · 세로 5 m 간격</w:t>
+            </w:r>
+          </w:p>
+        </w:tc>
+        <w:tc>
+          <w:tcPr>
+            <w:tcW w:type="dxa" w:w="1200"/>
+            <w:tcBorders>
+              <w:top w:val="single" w:color="888888" w:sz="4"/>
+              <w:left w:val="single" w:color="888888" w:sz="4"/>
+              <w:bottom w:val="single" w:color="888888" w:sz="4"/>
+              <w:right w:val="single" w:color="888888" w:sz="4"/>
+            </w:tcBorders>
+            <w:tcMar>
+              <w:top w:type="dxa" w:w="20"/>
+              <w:left w:type="dxa" w:w="60"/>
+              <w:bottom w:type="dxa" w:w="20"/>
+              <w:right w:type="dxa" w:w="60"/>
+            </w:tcMar>
+            <w:vAlign w:val="center"/>
+          </w:tcPr>
+          <w:p>
+            <w:pPr>
+              <w:spacing w:after="0" w:line="230"/>
+            </w:pPr>
+            <w:r>
+              <w:rPr>
+                <w:rFonts w:ascii="NanumGothic" w:cs="NanumGothic" w:eastAsia="NanumGothic" w:hAnsi="NanumGothic"/>
+                <w:sz w:val="16"/>
+                <w:szCs w:val="16"/>
+              </w:rPr>
+              <w:t xml:space="preserve">450 m²</w:t>
+            </w:r>
+          </w:p>
+        </w:tc>
+        <w:tc>
+          <w:tcPr>
+            <w:tcW w:type="dxa" w:w="3066"/>
+            <w:tcBorders>
+              <w:top w:val="single" w:color="888888" w:sz="4"/>
+              <w:left w:val="single" w:color="888888" w:sz="4"/>
+              <w:bottom w:val="single" w:color="888888" w:sz="4"/>
+              <w:right w:val="single" w:color="888888" w:sz="4"/>
+            </w:tcBorders>
+            <w:tcMar>
+              <w:top w:type="dxa" w:w="20"/>
+              <w:left w:type="dxa" w:w="60"/>
+              <w:bottom w:type="dxa" w:w="20"/>
+              <w:right w:type="dxa" w:w="60"/>
+            </w:tcMar>
+            <w:vAlign w:val="center"/>
+          </w:tcPr>
+          <w:p>
+            <w:pPr>
+              <w:spacing w:after="0" w:line="230"/>
+            </w:pPr>
+            <w:r>
+              <w:rPr>
+                <w:rFonts w:ascii="NanumGothic" w:cs="NanumGothic" w:eastAsia="NanumGothic" w:hAnsi="NanumGothic"/>
+                <w:sz w:val="16"/>
+                <w:szCs w:val="16"/>
+              </w:rPr>
+              <w:t xml:space="preserve">용도·기둥 위치 확인 필요 · 중간 기둥 열이 휴식 공간 관통</w:t>
+            </w:r>
+          </w:p>
+        </w:tc>
+      </w:tr>
+      <w:tr>
+        <w:tc>
+          <w:tcPr>
+            <w:tcW w:type="dxa" w:w="800"/>
+            <w:tcBorders>
+              <w:top w:val="single" w:color="888888" w:sz="4"/>
+              <w:left w:val="single" w:color="888888" w:sz="4"/>
+              <w:bottom w:val="single" w:color="888888" w:sz="4"/>
+              <w:right w:val="single" w:color="888888" w:sz="4"/>
+            </w:tcBorders>
+            <w:tcMar>
+              <w:top w:type="dxa" w:w="20"/>
+              <w:left w:type="dxa" w:w="60"/>
+              <w:bottom w:type="dxa" w:w="20"/>
+              <w:right w:type="dxa" w:w="60"/>
+            </w:tcMar>
+            <w:vAlign w:val="center"/>
+          </w:tcPr>
+          <w:p>
+            <w:pPr>
+              <w:spacing w:after="0" w:line="230"/>
+            </w:pPr>
+            <w:r>
+              <w:rPr>
+                <w:rFonts w:ascii="NanumGothic" w:cs="NanumGothic" w:eastAsia="NanumGothic" w:hAnsi="NanumGothic"/>
+                <w:sz w:val="16"/>
+                <w:szCs w:val="16"/>
+              </w:rPr>
+              <w:t xml:space="preserve"/>
+            </w:r>
+          </w:p>
+        </w:tc>
+        <w:tc>
+          <w:tcPr>
+            <w:tcW w:type="dxa" w:w="2500"/>
+            <w:tcBorders>
+              <w:top w:val="single" w:color="888888" w:sz="4"/>
+              <w:left w:val="single" w:color="888888" w:sz="4"/>
+              <w:bottom w:val="single" w:color="888888" w:sz="4"/>
+              <w:right w:val="single" w:color="888888" w:sz="4"/>
+            </w:tcBorders>
+            <w:tcMar>
+              <w:top w:type="dxa" w:w="20"/>
+              <w:left w:type="dxa" w:w="60"/>
+              <w:bottom w:type="dxa" w:w="20"/>
+              <w:right w:type="dxa" w:w="60"/>
+            </w:tcMar>
+            <w:vAlign w:val="center"/>
+          </w:tcPr>
+          <w:p>
+            <w:pPr>
+              <w:spacing w:after="0" w:line="230"/>
+            </w:pPr>
+            <w:r>
+              <w:rPr>
+                <w:rFonts w:ascii="NanumGothic" w:cs="NanumGothic" w:eastAsia="NanumGothic" w:hAnsi="NanumGothic"/>
+                <w:sz w:val="16"/>
+                <w:szCs w:val="16"/>
+              </w:rPr>
+              <w:t xml:space="preserve">휴식 공간 합계 (베딩 기준 면적)</w:t>
+            </w:r>
+          </w:p>
+        </w:tc>
+        <w:tc>
+          <w:tcPr>
+            <w:tcW w:type="dxa" w:w="2900"/>
+            <w:tcBorders>
+              <w:top w:val="single" w:color="888888" w:sz="4"/>
+              <w:left w:val="single" w:color="888888" w:sz="4"/>
+              <w:bottom w:val="single" w:color="888888" w:sz="4"/>
+              <w:right w:val="single" w:color="888888" w:sz="4"/>
+            </w:tcBorders>
+            <w:tcMar>
+              <w:top w:type="dxa" w:w="20"/>
+              <w:left w:type="dxa" w:w="60"/>
+              <w:bottom w:type="dxa" w:w="20"/>
+              <w:right w:type="dxa" w:w="60"/>
+            </w:tcMar>
+            <w:vAlign w:val="center"/>
+          </w:tcPr>
+          <w:p>
+            <w:pPr>
+              <w:spacing w:after="0" w:line="230"/>
+            </w:pPr>
+            <w:r>
+              <w:rPr>
+                <w:rFonts w:ascii="NanumGothic" w:cs="NanumGothic" w:eastAsia="NanumGothic" w:hAnsi="NanumGothic"/>
+                <w:sz w:val="16"/>
+                <w:szCs w:val="16"/>
+              </w:rPr>
+              <w:t xml:space="preserve">전체 건물 60 m × 45 m = 2,700 m² 중</w:t>
+            </w:r>
+          </w:p>
+        </w:tc>
+        <w:tc>
+          <w:tcPr>
+            <w:tcW w:type="dxa" w:w="1200"/>
+            <w:tcBorders>
+              <w:top w:val="single" w:color="888888" w:sz="4"/>
+              <w:left w:val="single" w:color="888888" w:sz="4"/>
+              <w:bottom w:val="single" w:color="888888" w:sz="4"/>
+              <w:right w:val="single" w:color="888888" w:sz="4"/>
+            </w:tcBorders>
+            <w:tcMar>
+              <w:top w:type="dxa" w:w="20"/>
+              <w:left w:type="dxa" w:w="60"/>
+              <w:bottom w:type="dxa" w:w="20"/>
+              <w:right w:type="dxa" w:w="60"/>
+            </w:tcMar>
+            <w:vAlign w:val="center"/>
+          </w:tcPr>
+          <w:p>
+            <w:pPr>
+              <w:spacing w:after="0" w:line="230"/>
+            </w:pPr>
+            <w:r>
+              <w:rPr>
+                <w:rFonts w:ascii="NanumGothic" w:cs="NanumGothic" w:eastAsia="NanumGothic" w:hAnsi="NanumGothic"/>
+                <w:sz w:val="16"/>
+                <w:szCs w:val="16"/>
+              </w:rPr>
+              <w:t xml:space="preserve">1,318 m²</w:t>
+            </w:r>
+          </w:p>
+        </w:tc>
+        <w:tc>
+          <w:tcPr>
+            <w:tcW w:type="dxa" w:w="3066"/>
+            <w:tcBorders>
+              <w:top w:val="single" w:color="888888" w:sz="4"/>
+              <w:left w:val="single" w:color="888888" w:sz="4"/>
+              <w:bottom w:val="single" w:color="888888" w:sz="4"/>
+              <w:right w:val="single" w:color="888888" w:sz="4"/>
+            </w:tcBorders>
+            <w:tcMar>
+              <w:top w:type="dxa" w:w="20"/>
+              <w:left w:type="dxa" w:w="60"/>
+              <w:bottom w:type="dxa" w:w="20"/>
+              <w:right w:type="dxa" w:w="60"/>
+            </w:tcMar>
+            <w:vAlign w:val="center"/>
+          </w:tcPr>
+          <w:p>
+            <w:pPr>
+              <w:spacing w:after="0" w:line="230"/>
+            </w:pPr>
+            <w:r>
+              <w:rPr>
+                <w:rFonts w:ascii="NanumGothic" w:cs="NanumGothic" w:eastAsia="NanumGothic" w:hAnsi="NanumGothic"/>
+                <w:sz w:val="16"/>
+                <w:szCs w:val="16"/>
+              </w:rPr>
+              <w:t xml:space="preserve">A동 800 + B동 518</w:t>
             </w:r>
           </w:p>
         </w:tc>
@@ -2192,7 +2506,7 @@
           <w:sz w:val="18"/>
           <w:szCs w:val="18"/>
         </w:rPr>
-        <w:t xml:space="preserve">베딩 기준 면적은 전체 우사 면적에서 사조·음수·복도(착유대기실·이동통로) 공간을 제외한 「휴식 공간」으로 정의하며, 피트모스 투입량·베딩 두께·로봇 작업 면적은 모두 이 면적을 기준으로 산정한다.</w:t>
+        <w:t xml:space="preserve">베딩 기준 면적은 전체 우사 면적에서 사조·급수·복도(착유대기실·이동통로)·트랙터 주차·로봇착유기실을 제외한 「휴식 공간(소가 누워 쉬는 공간)」으로 정의하며, 피트모스 투입량·베딩 두께·로봇 작업 면적은 모두 이 면적을 기준으로 산정한다. 사조·급수 공간(각 3 m)은 이동 통로로 깔짚을 깔지 않으며, 분뇨의 상당 부분이 이곳에 배설되므로 매일 1회 스키드로더로 퇴비장에 배출해 수직형 교반기로 퇴비화한다.</w:t>
       </w:r>
     </w:p>
     <w:p>
@@ -2330,7 +2644,7 @@
                 <w:sz w:val="16"/>
                 <w:szCs w:val="16"/>
               </w:rPr>
-              <w:t xml:space="preserve">산정 (휴식 공간 1,500 m² 기준)</w:t>
+              <w:t xml:space="preserve">산정 (휴식 공간 1,318 m² 기준)</w:t>
             </w:r>
           </w:p>
         </w:tc>
@@ -2520,7 +2834,7 @@
                 <w:sz w:val="16"/>
                 <w:szCs w:val="16"/>
               </w:rPr>
-              <w:t xml:space="preserve">1회 투입 30 ~ 60 m³ (동당 15 ~ 30 m³, 약 2 ~ 4 cm 층)</w:t>
+              <w:t xml:space="preserve">1회 투입 약 26 ~ 53 m³ (A동 16 ~ 32, B동 10 ~ 21 m³, 약 2 ~ 4 cm 층)</w:t>
             </w:r>
           </w:p>
         </w:tc>
@@ -2615,7 +2929,7 @@
                 <w:sz w:val="16"/>
                 <w:szCs w:val="16"/>
               </w:rPr>
-              <w:t xml:space="preserve">60 cm 기준 총 체적 약 900 m³ (동당 450 m³)</w:t>
+              <w:t xml:space="preserve">60 cm 기준 총 체적 약 790 m³ (A동 480, B동 311 m³)</w:t>
             </w:r>
           </w:p>
         </w:tc>
@@ -2710,7 +3024,7 @@
                 <w:sz w:val="16"/>
                 <w:szCs w:val="16"/>
               </w:rPr>
-              <w:t xml:space="preserve">동당 750 m² 교반 · 기둥 열 사이 왕복 주행</w:t>
+              <w:t xml:space="preserve">A동 800 + B동 518 m² 교반 · 기둥 열 사이 왕복 주행 · 통로 분뇨는 스키드로더 배출</w:t>
             </w:r>
           </w:p>
         </w:tc>
@@ -2761,7 +3075,7 @@
       <w:r>
         <w:drawing>
           <wp:inline distT="0" distB="0" distL="0" distR="0">
-            <wp:extent cx="6286500" cy="4200525"/>
+            <wp:extent cx="6477000" cy="4124325"/>
             <wp:effectExtent t="0" r="0" b="0" l="0"/>
             <wp:docPr id="1" name="" descr="" title=""/>
             <wp:cNvGraphicFramePr>
@@ -2786,7 +3100,7 @@
                   <pic:spPr bwMode="auto">
                     <a:xfrm>
                       <a:off x="0" y="0"/>
-                      <a:ext cx="6286500" cy="4200525"/>
+                      <a:ext cx="6477000" cy="4124325"/>
                     </a:xfrm>
                     <a:prstGeom prst="rect">
                       <a:avLst/>
@@ -2811,7 +3125,7 @@
           <w:sz w:val="16"/>
           <w:szCs w:val="16"/>
         </w:rPr>
-        <w:t xml:space="preserve">개념 평면도(DRAFT). 사조·음수 공간 순서, 중간 기둥 열 위치, 출입구·로봇 진입로, 로봇 차체 치수(GMW 설계)는 현장 도면 확정 후 갱신. 파일: SVG · PNG · DXF(CAD) 제공.</w:t>
+        <w:t xml:space="preserve">2026-09-21 연구책임자 손도면 기준 작도(원본 첨부). 녹색 = 휴식 공간(베딩 기준 면적) · 황색 = 사조 · 청색 = 급수 통로/급수조 · 회색 = 복도 · 주황 = 트랙터 주차(로봇 대기·충전 공유 제안) · 보라 = 로봇착유기실 · ■ 기둥(가로 10 m·세로 5 m, 위치 확인 필요) · 청색 점선 = 갈전구리 교반 경로(안) · 적색 점선 = 로봇 이동 경로(제안). 서측 10 m 구역 용도, 착유 통로 경계, 로봇 차체 치수(GMW)는 확인 후 갱신. 파일: SVG · PNG · DXF(CAD).</w:t>
       </w:r>
     </w:p>
     <w:p>
@@ -3660,7 +3974,7 @@
                 <w:sz w:val="16"/>
                 <w:szCs w:val="16"/>
               </w:rPr>
-              <w:t xml:space="preserve">송영신목장 2개 동, 휴식 공간 1,500 m² (2·4장)</w:t>
+              <w:t xml:space="preserve">송영신목장 2개 동, 휴식 공간 1,318 m² (2·4장), 손도면 기준 평면도 v2 작성</w:t>
             </w:r>
           </w:p>
         </w:tc>
@@ -3850,7 +4164,7 @@
                 <w:sz w:val="16"/>
                 <w:szCs w:val="16"/>
               </w:rPr>
-              <w:t xml:space="preserve">2026. 10 전달: 기둥 열 회피·10×5 m 베이 경로, 회전반경, 교반 깊이·회전수, 30 HP 부하</w:t>
+              <w:t xml:space="preserve">2026. 10 전달: 동별 구역 형상(17×50 / 14×37)·기둥 열 회피 경로, 착유기실 진입 금지, 회전반경, 교반 깊이·회전수, 30 HP 부하</w:t>
             </w:r>
           </w:p>
         </w:tc>
@@ -4075,7 +4389,7 @@
           <w:sz w:val="18"/>
           <w:szCs w:val="18"/>
         </w:rPr>
-        <w:t xml:space="preserve">① 현행 56 HP 트랙터 교반 대비 시제품 30 HP급 하이브리드 엔진의 작업 부하 적정성 — 실측 PTO rpm·깊이·속도 데이터를 제공하여 작업기 규격 협의.  ② 수분·냄새 정량 측정 장비(수분계·암모니아 측정기) 도입 여부 및 재료비·장비비 계상 검토.  ③ 기둥 열·공간 경계·출입구 위치는 현장 도면 첨부로 확정.</w:t>
+        <w:t xml:space="preserve">① 현행 56 HP 트랙터 교반 대비 시제품 30 HP급 하이브리드 엔진의 작업 부하 적정성 — 실측 PTO rpm·깊이·속도 데이터를 제공하여 작업기 규격 협의.  ② 수분·냄새 정량 측정 장비(수분계·암모니아 측정기) 도입 여부 및 재료비·장비비 계상 검토.  ③ 기둥 실제 위치, 서측 10 m 부속 구역 용도, B동 착유 대기·이동 통로 경계는 실측 도면으로 확정.</w:t>
       </w:r>
     </w:p>
     <w:p>
@@ -4089,7 +4403,7 @@
           <w:sz w:val="16"/>
           <w:szCs w:val="16"/>
         </w:rPr>
-        <w:t xml:space="preserve">첨부: 축사 평면도(SVG/PNG/DXF) · 일일 베딩 관리 점검표 누적본 · 베딩 재료 투입 기록 · 현장 사진</w:t>
+        <w:t xml:space="preserve">첨부: 축사 평면도 v2(SVG/PNG/DXF) 및 손도면 원본 · 일일 베딩 관리 점검표 누적본 · 베딩 재료 투입 기록 · 현장 사진</w:t>
       </w:r>
     </w:p>
     <w:p>
@@ -4105,7 +4419,7 @@
           <w:sz w:val="18"/>
           <w:szCs w:val="18"/>
         </w:rPr>
-        <w:t xml:space="preserve">2026년 9월 20일   농업회사법인 주식회사 디투오   연구책임자 하현제 (인)</w:t>
+        <w:t xml:space="preserve">2026년 9월 21일   농업회사법인 주식회사 디투오   연구책임자 하현제 (인)</w:t>
       </w:r>
     </w:p>
     <w:sectPr>

</xml_diff>

<commit_message>
Mark west 10x45 m zone as compost yard with vertical composter; frame D2O role as demonstration and testing
- Floor plan v2: west zone labelled compost yard (vertical composter symbol),
  skid-loader manure removal routes from feed/water lanes drawn.
- Context, full report, 2-page PDF/DOCX and AI prompt updated: D2O role =
  demonstration & testing; current stage = preparing bedding for the trials.
- Open item on the west zone resolved; composter/inlet position added instead.

Co-Authored-By: Claude Fable 5.1 <noreply@anthropic.com>
Claude-Session: https://claude.ai/code/session_01WKbZ2PH3fH4AvF1j5yCwZ2
</commit_message>
<xml_diff>
--- a/deliverables/motie-rs-2026-25508014-중간점검-제출자료-D2O.docx
+++ b/deliverables/motie-rs-2026-25508014-중간점검-제출자료-D2O.docx
@@ -584,7 +584,7 @@
                 <w:sz w:val="16"/>
                 <w:szCs w:val="16"/>
               </w:rPr>
-              <w:t xml:space="preserve">실증 환경 구축 · 현장 실증 지원 · 사업화 확산 기반(영업·교육·컨설팅)</w:t>
+              <w:t xml:space="preserve">실증 및 테스트 (실증 환경 구축 · 현장 실증 지원) · 사업화 확산 기반</w:t>
             </w:r>
           </w:p>
         </w:tc>
@@ -619,7 +619,7 @@
           <w:sz w:val="18"/>
           <w:szCs w:val="18"/>
         </w:rPr>
-        <w:t xml:space="preserve">1년차 목표: 자율주행 깔개 관리 축사 로봇 플랫폼 핵심 기능 확보 및 1차 시제품 설계·핵심부품 개발. D2O는 세 가지 세부 내용 중 「실사용 환경 정의 및 현장 실증 준비(1차 실증지 확보·준비)」를 주 담당하며, 충남대(핵심기술)와 GMW(시제품 설계)에 현장 조건·작업 요구사양을 제공한다.</w:t>
+        <w:t xml:space="preserve">1년차 목표: 자율주행 깔개 관리 축사 로봇 플랫폼 핵심 기능 확보 및 1차 시제품 설계·핵심부품 개발. D2O의 역할은 실증 및 테스트이며, 세 가지 세부 내용 중 「실사용 환경 정의 및 현장 실증 준비(1차 실증지 확보·준비)」를 주 담당하고, 충남대(핵심기술)와 GMW(시제품 설계)에 현장 조건·작업 요구사양을 제공한다.</w:t>
       </w:r>
     </w:p>
     <w:tbl>
@@ -1023,7 +1023,7 @@
                 <w:sz w:val="16"/>
                 <w:szCs w:val="16"/>
               </w:rPr>
-              <w:t xml:space="preserve">실증지 확보 완료 · 환경 정의 완료 · 일일 모니터링 운영 중</w:t>
+              <w:t xml:space="preserve">실증·테스트용 베딩 준비 단계: 실증지 확보 · 환경 정의 완료 · 베딩 조성·일일 모니터링 운영 중</w:t>
             </w:r>
           </w:p>
         </w:tc>
@@ -2209,7 +2209,7 @@
                 <w:sz w:val="16"/>
                 <w:szCs w:val="16"/>
               </w:rPr>
-              <w:t xml:space="preserve">—</w:t>
+              <w:t xml:space="preserve">서측</w:t>
             </w:r>
           </w:p>
         </w:tc>
@@ -2240,7 +2240,7 @@
                 <w:sz w:val="16"/>
                 <w:szCs w:val="16"/>
               </w:rPr>
-              <w:t xml:space="preserve">서측 부속 구역 / 기둥</w:t>
+              <w:t xml:space="preserve">퇴비장 (수직형 교반기) / 기둥</w:t>
             </w:r>
           </w:p>
         </w:tc>
@@ -2333,7 +2333,7 @@
                 <w:sz w:val="16"/>
                 <w:szCs w:val="16"/>
               </w:rPr>
-              <w:t xml:space="preserve">용도·기둥 위치 확인 필요 · 중간 기둥 열이 휴식 공간 관통</w:t>
+              <w:t xml:space="preserve">통로 분뇨 반입·퇴비화 · 기둥 위치 확인 필요</w:t>
             </w:r>
           </w:p>
         </w:tc>
@@ -2506,7 +2506,7 @@
           <w:sz w:val="18"/>
           <w:szCs w:val="18"/>
         </w:rPr>
-        <w:t xml:space="preserve">베딩 기준 면적은 전체 우사 면적에서 사조·급수·복도(착유대기실·이동통로)·트랙터 주차·로봇착유기실을 제외한 「휴식 공간(소가 누워 쉬는 공간)」으로 정의하며, 피트모스 투입량·베딩 두께·로봇 작업 면적은 모두 이 면적을 기준으로 산정한다. 사조·급수 공간(각 3 m)은 이동 통로로 깔짚을 깔지 않으며, 분뇨의 상당 부분이 이곳에 배설되므로 매일 1회 스키드로더로 퇴비장에 배출해 수직형 교반기로 퇴비화한다.</w:t>
+        <w:t xml:space="preserve">베딩 기준 면적은 전체 우사 면적에서 사조·급수·복도(착유대기실·이동통로)·트랙터 주차·로봇착유기실을 제외한 「휴식 공간(소가 누워 쉬는 공간)」으로 정의하며, 피트모스 투입량·베딩 두께·로봇 작업 면적은 모두 이 면적을 기준으로 산정한다. 사조·급수 공간(각 3 m)은 이동 통로로 깔짚을 깔지 않으며, 분뇨의 상당 부분이 이곳에 배설되므로 매일 1회 스키드로더로 서측 퇴비장(10 × 45 m)에 배출해 수직형 교반기로 퇴비화한다.</w:t>
       </w:r>
     </w:p>
     <w:p>
@@ -3125,7 +3125,7 @@
           <w:sz w:val="16"/>
           <w:szCs w:val="16"/>
         </w:rPr>
-        <w:t xml:space="preserve">2026-09-21 연구책임자 손도면 기준 작도(원본 첨부). 녹색 = 휴식 공간(베딩 기준 면적) · 황색 = 사조 · 청색 = 급수 통로/급수조 · 회색 = 복도 · 주황 = 트랙터 주차(로봇 대기·충전 공유 제안) · 보라 = 로봇착유기실 · ■ 기둥(가로 10 m·세로 5 m, 위치 확인 필요) · 청색 점선 = 갈전구리 교반 경로(안) · 적색 점선 = 로봇 이동 경로(제안). 서측 10 m 구역 용도, 착유 통로 경계, 로봇 차체 치수(GMW)는 확인 후 갱신. 파일: SVG · PNG · DXF(CAD).</w:t>
+        <w:t xml:space="preserve">2026-09-21 연구책임자 손도면 기준 작도(원본 첨부). 녹색 = 휴식 공간(베딩 기준 면적) · 황색 = 사조 · 청색 = 급수 통로/급수조 · 회색 = 복도 · 주황 = 트랙터 주차(로봇 대기·충전 공유 제안) · 보라 = 로봇착유기실 · ■ 기둥(가로 10 m·세로 5 m, 위치 확인 필요) · 청색 점선 = 갈전구리 교반 경로(안) · 적색 점선 = 로봇 이동 경로(제안). 갈색 = 서측 퇴비장(수직형 교반기) · 녹색 점선 = 스키드로더 분뇨 배출 동선. 착유 통로 경계, 기둥 위치, 로봇 차체 치수(GMW)는 확인 후 갱신. 파일: SVG · PNG · DXF(CAD).</w:t>
       </w:r>
     </w:p>
     <w:p>
@@ -4389,7 +4389,7 @@
           <w:sz w:val="18"/>
           <w:szCs w:val="18"/>
         </w:rPr>
-        <w:t xml:space="preserve">① 현행 56 HP 트랙터 교반 대비 시제품 30 HP급 하이브리드 엔진의 작업 부하 적정성 — 실측 PTO rpm·깊이·속도 데이터를 제공하여 작업기 규격 협의.  ② 수분·냄새 정량 측정 장비(수분계·암모니아 측정기) 도입 여부 및 재료비·장비비 계상 검토.  ③ 기둥 실제 위치, 서측 10 m 부속 구역 용도, B동 착유 대기·이동 통로 경계는 실측 도면으로 확정.</w:t>
+        <w:t xml:space="preserve">① 현행 56 HP 트랙터 교반 대비 시제품 30 HP급 하이브리드 엔진의 작업 부하 적정성 — 실측 PTO rpm·깊이·속도 데이터를 제공하여 작업기 규격 협의.  ② 수분·냄새 정량 측정 장비(수분계·암모니아 측정기) 도입 여부 및 재료비·장비비 계상 검토.  ③ 기둥 실제 위치, B동 착유 대기·이동 통로 경계, 퇴비장 내 교반기·반입구 위치는 실측 도면으로 확정.</w:t>
       </w:r>
     </w:p>
     <w:p>

</xml_diff>

<commit_message>
Apply founder's 2nd sketch: barn names and rotary-area basis (v3)
- Barns named 착유장 (milking cows, 14 x 37 m) and 건유·육성우동 (dry cows
  and heifers, 17 x 50 m); rotary/bedding area per founder note = 1,368 m2
  (tractor waiting bay not deducted; 800 m2 alternative noted).
- Peat moss per application 27-55 m3; 60 cm volume ~821 m3.
- 3 m passage between milking-barn resting area and robotic milking room
  (13 m non-resting section) labelled; 2nd sketch original saved.
- Plan v3, context, full report, 2-page PDF/DOCX and AI prompts updated.

Co-Authored-By: Claude Fable 5.1 <noreply@anthropic.com>
Claude-Session: https://claude.ai/code/session_01WKbZ2PH3fH4AvF1j5yCwZ2
</commit_message>
<xml_diff>
--- a/deliverables/motie-rs-2026-25508014-중간점검-제출자료-D2O.docx
+++ b/deliverables/motie-rs-2026-25508014-중간점검-제출자료-D2O.docx
@@ -1045,7 +1045,7 @@
           <w:sz w:val="20"/>
           <w:szCs w:val="20"/>
         </w:rPr>
-        <w:t xml:space="preserve">2. 실증지(실사용 환경) 정의 — 송영신목장 우사 (경기 안성, 2026-09-21 손도면 기준)</w:t>
+        <w:t xml:space="preserve">2. 실증지(실사용 환경) 정의 — 송영신목장 우사 (경기 안성, 2026-09-21 손도면 1·2차 기준)</w:t>
       </w:r>
     </w:p>
     <w:tbl>
@@ -1267,7 +1267,7 @@
                 <w:sz w:val="16"/>
                 <w:szCs w:val="16"/>
               </w:rPr>
-              <w:t xml:space="preserve">A동</w:t>
+              <w:t xml:space="preserve">건유·육성우</w:t>
             </w:r>
           </w:p>
         </w:tc>
@@ -1298,7 +1298,7 @@
                 <w:sz w:val="16"/>
                 <w:szCs w:val="16"/>
               </w:rPr>
-              <w:t xml:space="preserve">휴식 공간 = 베딩 기준 면적</w:t>
+              <w:t xml:space="preserve">휴식 공간 = 로터리(베딩) 면적</w:t>
             </w:r>
           </w:p>
         </w:tc>
@@ -1329,7 +1329,7 @@
                 <w:sz w:val="16"/>
                 <w:szCs w:val="16"/>
               </w:rPr>
-              <w:t xml:space="preserve">17 m × 50 m, 트랙터 주차(5×10 m) 제외</w:t>
+              <w:t xml:space="preserve">17 m × 50 m (트랙터 대기실 5×10 m 중첩)</w:t>
             </w:r>
           </w:p>
         </w:tc>
@@ -1360,7 +1360,7 @@
                 <w:sz w:val="16"/>
                 <w:szCs w:val="16"/>
               </w:rPr>
-              <w:t xml:space="preserve">800 m²</w:t>
+              <w:t xml:space="preserve">850 m²</w:t>
             </w:r>
           </w:p>
         </w:tc>
@@ -1391,7 +1391,7 @@
                 <w:sz w:val="16"/>
                 <w:szCs w:val="16"/>
               </w:rPr>
-              <w:t xml:space="preserve">로봇 작업 대상 · 급수조 3개 외벽</w:t>
+              <w:t xml:space="preserve">건유우·육성우 · 로봇 작업 대상 · 급수조 외벽</w:t>
             </w:r>
           </w:p>
         </w:tc>
@@ -1424,7 +1424,7 @@
                 <w:sz w:val="16"/>
                 <w:szCs w:val="16"/>
               </w:rPr>
-              <w:t xml:space="preserve">A동</w:t>
+              <w:t xml:space="preserve">건유·육성우</w:t>
             </w:r>
           </w:p>
         </w:tc>
@@ -1455,7 +1455,7 @@
                 <w:sz w:val="16"/>
                 <w:szCs w:val="16"/>
               </w:rPr>
-              <w:t xml:space="preserve">사조 공간 / 트랙터 주차</w:t>
+              <w:t xml:space="preserve">사조 공간 / 트랙터 대기실</w:t>
             </w:r>
           </w:p>
         </w:tc>
@@ -1738,7 +1738,7 @@
                 <w:sz w:val="16"/>
                 <w:szCs w:val="16"/>
               </w:rPr>
-              <w:t xml:space="preserve">B동</w:t>
+              <w:t xml:space="preserve">착유장</w:t>
             </w:r>
           </w:p>
         </w:tc>
@@ -1769,7 +1769,7 @@
                 <w:sz w:val="16"/>
                 <w:szCs w:val="16"/>
               </w:rPr>
-              <w:t xml:space="preserve">휴식 공간 = 베딩 기준 면적</w:t>
+              <w:t xml:space="preserve">휴식 공간 = 로터리(베딩) 면적</w:t>
             </w:r>
           </w:p>
         </w:tc>
@@ -1862,7 +1862,7 @@
                 <w:sz w:val="16"/>
                 <w:szCs w:val="16"/>
               </w:rPr>
-              <w:t xml:space="preserve">로봇 작업 대상</w:t>
+              <w:t xml:space="preserve">착유우 · 로봇 작업 대상</w:t>
             </w:r>
           </w:p>
         </w:tc>
@@ -1895,7 +1895,7 @@
                 <w:sz w:val="16"/>
                 <w:szCs w:val="16"/>
               </w:rPr>
-              <w:t xml:space="preserve">B동</w:t>
+              <w:t xml:space="preserve">착유장</w:t>
             </w:r>
           </w:p>
         </w:tc>
@@ -2052,7 +2052,7 @@
                 <w:sz w:val="16"/>
                 <w:szCs w:val="16"/>
               </w:rPr>
-              <w:t xml:space="preserve">B동</w:t>
+              <w:t xml:space="preserve">착유장</w:t>
             </w:r>
           </w:p>
         </w:tc>
@@ -2397,7 +2397,7 @@
                 <w:sz w:val="16"/>
                 <w:szCs w:val="16"/>
               </w:rPr>
-              <w:t xml:space="preserve">휴식 공간 합계 (베딩 기준 면적)</w:t>
+              <w:t xml:space="preserve">로터리(베딩) 면적 합계</w:t>
             </w:r>
           </w:p>
         </w:tc>
@@ -2428,7 +2428,7 @@
                 <w:sz w:val="16"/>
                 <w:szCs w:val="16"/>
               </w:rPr>
-              <w:t xml:space="preserve">전체 건물 60 m × 45 m = 2,700 m² 중</w:t>
+              <w:t xml:space="preserve">전체 건물 60 m × 45 m = 2,700 m² 중 (연구책임자 손도면 기준)</w:t>
             </w:r>
           </w:p>
         </w:tc>
@@ -2459,7 +2459,7 @@
                 <w:sz w:val="16"/>
                 <w:szCs w:val="16"/>
               </w:rPr>
-              <w:t xml:space="preserve">1,318 m²</w:t>
+              <w:t xml:space="preserve">1,368 m²</w:t>
             </w:r>
           </w:p>
         </w:tc>
@@ -2490,7 +2490,7 @@
                 <w:sz w:val="16"/>
                 <w:szCs w:val="16"/>
               </w:rPr>
-              <w:t xml:space="preserve">A동 800 + B동 518</w:t>
+              <w:t xml:space="preserve">건유·육성우 850 + 착유장 518</w:t>
             </w:r>
           </w:p>
         </w:tc>
@@ -2506,7 +2506,7 @@
           <w:sz w:val="18"/>
           <w:szCs w:val="18"/>
         </w:rPr>
-        <w:t xml:space="preserve">베딩 기준 면적은 전체 우사 면적에서 사조·급수·복도(착유대기실·이동통로)·트랙터 주차·로봇착유기실을 제외한 「휴식 공간(소가 누워 쉬는 공간)」으로 정의하며, 피트모스 투입량·베딩 두께·로봇 작업 면적은 모두 이 면적을 기준으로 산정한다. 사조·급수 공간(각 3 m)은 이동 통로로 깔짚을 깔지 않으며, 분뇨의 상당 부분이 이곳에 배설되므로 매일 1회 스키드로더로 서측 퇴비장(10 × 45 m)에 배출해 수직형 교반기로 퇴비화한다.</w:t>
+        <w:t xml:space="preserve">베딩 기준 면적은 전체 우사 면적에서 사조·급수·복도(착유대기실·이동통로)·트랙터 대기실·로봇착유기실을 제외한 「휴식 공간(소가 누워 쉬는 공간)」으로 정의하며, 피트모스 투입량·베딩 두께·로봇 작업 면적은 모두 이 면적을 기준으로 산정한다. 사조·급수 공간(각 3 m)은 이동 통로로 깔짚을 깔지 않으며, 분뇨의 상당 부분이 이곳에 배설되므로 매일 1회 스키드로더로 서측 퇴비장(10 × 45 m)에 배출해 수직형 교반기로 퇴비화한다.</w:t>
       </w:r>
     </w:p>
     <w:p>
@@ -2644,7 +2644,7 @@
                 <w:sz w:val="16"/>
                 <w:szCs w:val="16"/>
               </w:rPr>
-              <w:t xml:space="preserve">산정 (휴식 공간 1,318 m² 기준)</w:t>
+              <w:t xml:space="preserve">산정 (휴식 공간 1,368 m² 기준)</w:t>
             </w:r>
           </w:p>
         </w:tc>
@@ -2834,7 +2834,7 @@
                 <w:sz w:val="16"/>
                 <w:szCs w:val="16"/>
               </w:rPr>
-              <w:t xml:space="preserve">1회 투입 약 26 ~ 53 m³ (A동 16 ~ 32, B동 10 ~ 21 m³, 약 2 ~ 4 cm 층)</w:t>
+              <w:t xml:space="preserve">1회 투입 약 27 ~ 55 m³ (건유·육성우동 17 ~ 34, 착유장 10 ~ 21 m³, 약 2 ~ 4 cm 층)</w:t>
             </w:r>
           </w:p>
         </w:tc>
@@ -2929,7 +2929,7 @@
                 <w:sz w:val="16"/>
                 <w:szCs w:val="16"/>
               </w:rPr>
-              <w:t xml:space="preserve">60 cm 기준 총 체적 약 790 m³ (A동 480, B동 311 m³)</w:t>
+              <w:t xml:space="preserve">60 cm 기준 총 체적 약 821 m³ (건유·육성우동 510, 착유장 311 m³)</w:t>
             </w:r>
           </w:p>
         </w:tc>
@@ -3024,7 +3024,7 @@
                 <w:sz w:val="16"/>
                 <w:szCs w:val="16"/>
               </w:rPr>
-              <w:t xml:space="preserve">A동 800 + B동 518 m² 교반 · 기둥 열 사이 왕복 주행 · 통로 분뇨는 스키드로더 배출</w:t>
+              <w:t xml:space="preserve">건유·육성우동 850 + 착유장 518 m² 교반 · 기둥 열 사이 왕복 주행 · 통로 분뇨는 스키드로더 배출</w:t>
             </w:r>
           </w:p>
         </w:tc>
@@ -3125,7 +3125,7 @@
           <w:sz w:val="16"/>
           <w:szCs w:val="16"/>
         </w:rPr>
-        <w:t xml:space="preserve">2026-09-21 연구책임자 손도면 기준 작도(원본 첨부). 녹색 = 휴식 공간(베딩 기준 면적) · 황색 = 사조 · 청색 = 급수 통로/급수조 · 회색 = 복도 · 주황 = 트랙터 주차(로봇 대기·충전 공유 제안) · 보라 = 로봇착유기실 · ■ 기둥(가로 10 m·세로 5 m, 위치 확인 필요) · 청색 점선 = 갈전구리 교반 경로(안) · 적색 점선 = 로봇 이동 경로(제안). 갈색 = 서측 퇴비장(수직형 교반기) · 녹색 점선 = 스키드로더 분뇨 배출 동선. 착유 통로 경계, 기둥 위치, 로봇 차체 치수(GMW)는 확인 후 갱신. 파일: SVG · PNG · DXF(CAD).</w:t>
+        <w:t xml:space="preserve">2026-09-21 연구책임자 손도면 기준 작도(원본 첨부). 녹색 = 휴식 공간(베딩 기준 면적) · 황색 = 사조 · 청색 = 급수 통로/급수조 · 회색 = 복도 · 주황 = 트랙터 대기실(로봇 대기·충전 공유 제안) · 보라 = 로봇착유기실 · ■ 기둥(가로 10 m·세로 5 m, 위치 확인 필요) · 청색 점선 = 갈전구리 교반 경로(안) · 적색 점선 = 로봇 이동 경로(제안). 갈색 = 서측 퇴비장(수직형 교반기) · 녹색 점선 = 스키드로더 분뇨 배출 동선. 착유 통로 경계, 기둥 위치, 로봇 차체 치수(GMW)는 확인 후 갱신. 파일: SVG · PNG · DXF(CAD).</w:t>
       </w:r>
     </w:p>
     <w:p>
@@ -3974,7 +3974,7 @@
                 <w:sz w:val="16"/>
                 <w:szCs w:val="16"/>
               </w:rPr>
-              <w:t xml:space="preserve">송영신목장 2개 동, 휴식 공간 1,318 m² (2·4장), 손도면 기준 평면도 v2 작성</w:t>
+              <w:t xml:space="preserve">송영신목장 2개 동, 휴식 공간 1,368 m² (2·4장), 손도면 기준 평면도 v2 작성</w:t>
             </w:r>
           </w:p>
         </w:tc>
@@ -4389,7 +4389,7 @@
           <w:sz w:val="18"/>
           <w:szCs w:val="18"/>
         </w:rPr>
-        <w:t xml:space="preserve">① 현행 56 HP 트랙터 교반 대비 시제품 30 HP급 하이브리드 엔진의 작업 부하 적정성 — 실측 PTO rpm·깊이·속도 데이터를 제공하여 작업기 규격 협의.  ② 수분·냄새 정량 측정 장비(수분계·암모니아 측정기) 도입 여부 및 재료비·장비비 계상 검토.  ③ 기둥 실제 위치, B동 착유 대기·이동 통로 경계, 퇴비장 내 교반기·반입구 위치는 실측 도면으로 확정.</w:t>
+        <w:t xml:space="preserve">① 현행 56 HP 트랙터 교반 대비 시제품 30 HP급 하이브리드 엔진의 작업 부하 적정성 — 실측 PTO rpm·깊이·속도 데이터를 제공하여 작업기 규격 협의.  ② 수분·냄새 정량 측정 장비(수분계·암모니아 측정기) 도입 여부 및 재료비·장비비 계상 검토.  ③ 기둥 실제 위치, 착유장 착유 대기·이동 통로 경계, 퇴비장 내 교반기·반입구 위치는 실측 도면으로 확정.</w:t>
       </w:r>
     </w:p>
     <w:p>

</xml_diff>

<commit_message>
Add KIAT 9.30 briefing slides (D2O part), herd and manual-tilling context, sales role
- 3-slide landscape PDF for the 10 mega-project performing-organisation
  briefing: D2O duties, 1st-year progress with floor plan, plans and
  robot requirements; photo placeholder for the founder to fill.
- 2-page submission and full report rewritten in the research lead's
  voice; herd counts (30 milking cows, ~35 dry cows/heifers/calves),
  manual tilling 1-2x daily, pillar and cattle avoidance, sales role.
- 2-page PDF re-verified at 2 pages after tightening layout.

Co-Authored-By: Claude Fable 5.1 <noreply@anthropic.com>
Claude-Session: https://claude.ai/code/session_01WKbZ2PH3fH4AvF1j5yCwZ2
</commit_message>
<xml_diff>
--- a/deliverables/motie-rs-2026-25508014-중간점검-제출자료-D2O.docx
+++ b/deliverables/motie-rs-2026-25508014-중간점검-제출자료-D2O.docx
@@ -32,7 +32,7 @@
           <w:sz w:val="20"/>
           <w:szCs w:val="20"/>
         </w:rPr>
-        <w:t xml:space="preserve">공동연구개발기관(수요사·참여기업) 농업회사법인 주식회사 디투오(D2O) — 실증 지원 파트</w:t>
+        <w:t xml:space="preserve">공동연구개발기관(수요사·참여기업) 농업회사법인 주식회사 디투오(D2O) — 실증·테스트 및 영업·판매 파트</w:t>
       </w:r>
     </w:p>
     <w:tbl>
@@ -80,8 +80,8 @@
                 <w:rFonts w:ascii="NanumGothic" w:cs="NanumGothic" w:eastAsia="NanumGothic" w:hAnsi="NanumGothic"/>
                 <w:b/>
                 <w:bCs/>
-                <w:sz w:val="16"/>
-                <w:szCs w:val="16"/>
+                <w:sz w:val="15"/>
+                <w:szCs w:val="15"/>
               </w:rPr>
               <w:t xml:space="preserve">과제번호</w:t>
             </w:r>
@@ -113,8 +113,8 @@
                 <w:rFonts w:ascii="NanumGothic" w:cs="NanumGothic" w:eastAsia="NanumGothic" w:hAnsi="NanumGothic"/>
                 <w:b w:val="false"/>
                 <w:bCs w:val="false"/>
-                <w:sz w:val="16"/>
-                <w:szCs w:val="16"/>
+                <w:sz w:val="15"/>
+                <w:szCs w:val="15"/>
               </w:rPr>
               <w:t xml:space="preserve">RS-2026-25508014</w:t>
             </w:r>
@@ -146,8 +146,8 @@
                 <w:rFonts w:ascii="NanumGothic" w:cs="NanumGothic" w:eastAsia="NanumGothic" w:hAnsi="NanumGothic"/>
                 <w:b w:val="false"/>
                 <w:bCs w:val="false"/>
-                <w:sz w:val="16"/>
-                <w:szCs w:val="16"/>
+                <w:sz w:val="15"/>
+                <w:szCs w:val="15"/>
               </w:rPr>
               <w:t xml:space="preserve">지원분야</w:t>
             </w:r>
@@ -179,8 +179,8 @@
                 <w:rFonts w:ascii="NanumGothic" w:cs="NanumGothic" w:eastAsia="NanumGothic" w:hAnsi="NanumGothic"/>
                 <w:b w:val="false"/>
                 <w:bCs w:val="false"/>
-                <w:sz w:val="16"/>
-                <w:szCs w:val="16"/>
+                <w:sz w:val="15"/>
+                <w:szCs w:val="15"/>
               </w:rPr>
               <w:t xml:space="preserve">농축산 장비</w:t>
             </w:r>
@@ -214,8 +214,8 @@
                 <w:rFonts w:ascii="NanumGothic" w:cs="NanumGothic" w:eastAsia="NanumGothic" w:hAnsi="NanumGothic"/>
                 <w:b/>
                 <w:bCs/>
-                <w:sz w:val="16"/>
-                <w:szCs w:val="16"/>
+                <w:sz w:val="15"/>
+                <w:szCs w:val="15"/>
               </w:rPr>
               <w:t xml:space="preserve">과제명</w:t>
             </w:r>
@@ -247,8 +247,8 @@
                 <w:rFonts w:ascii="NanumGothic" w:cs="NanumGothic" w:eastAsia="NanumGothic" w:hAnsi="NanumGothic"/>
                 <w:b w:val="false"/>
                 <w:bCs w:val="false"/>
-                <w:sz w:val="16"/>
-                <w:szCs w:val="16"/>
+                <w:sz w:val="15"/>
+                <w:szCs w:val="15"/>
               </w:rPr>
               <w:t xml:space="preserve">축사 환경 개선을 위한 자율주행 깔개 관리 축산 로봇 개발 및 사업화</w:t>
             </w:r>
@@ -280,8 +280,8 @@
                 <w:rFonts w:ascii="NanumGothic" w:cs="NanumGothic" w:eastAsia="NanumGothic" w:hAnsi="NanumGothic"/>
                 <w:b w:val="false"/>
                 <w:bCs w:val="false"/>
-                <w:sz w:val="16"/>
-                <w:szCs w:val="16"/>
+                <w:sz w:val="15"/>
+                <w:szCs w:val="15"/>
               </w:rPr>
               <w:t xml:space="preserve">연구기간</w:t>
             </w:r>
@@ -313,8 +313,8 @@
                 <w:rFonts w:ascii="NanumGothic" w:cs="NanumGothic" w:eastAsia="NanumGothic" w:hAnsi="NanumGothic"/>
                 <w:b w:val="false"/>
                 <w:bCs w:val="false"/>
-                <w:sz w:val="16"/>
-                <w:szCs w:val="16"/>
+                <w:sz w:val="15"/>
+                <w:szCs w:val="15"/>
               </w:rPr>
               <w:t xml:space="preserve">2026. 4. 1 ~ 2028. 12. 31 (33개월)</w:t>
             </w:r>
@@ -348,8 +348,8 @@
                 <w:rFonts w:ascii="NanumGothic" w:cs="NanumGothic" w:eastAsia="NanumGothic" w:hAnsi="NanumGothic"/>
                 <w:b/>
                 <w:bCs/>
-                <w:sz w:val="16"/>
-                <w:szCs w:val="16"/>
+                <w:sz w:val="15"/>
+                <w:szCs w:val="15"/>
               </w:rPr>
               <w:t xml:space="preserve">주관기관</w:t>
             </w:r>
@@ -381,8 +381,8 @@
                 <w:rFonts w:ascii="NanumGothic" w:cs="NanumGothic" w:eastAsia="NanumGothic" w:hAnsi="NanumGothic"/>
                 <w:b w:val="false"/>
                 <w:bCs w:val="false"/>
-                <w:sz w:val="16"/>
-                <w:szCs w:val="16"/>
+                <w:sz w:val="15"/>
+                <w:szCs w:val="15"/>
               </w:rPr>
               <w:t xml:space="preserve">㈜GMW (연구책임자 공철주) · 공동(공급사) 충남대학교 산학협력단 (김용주)</w:t>
             </w:r>
@@ -414,8 +414,8 @@
                 <w:rFonts w:ascii="NanumGothic" w:cs="NanumGothic" w:eastAsia="NanumGothic" w:hAnsi="NanumGothic"/>
                 <w:b w:val="false"/>
                 <w:bCs w:val="false"/>
-                <w:sz w:val="16"/>
-                <w:szCs w:val="16"/>
+                <w:sz w:val="15"/>
+                <w:szCs w:val="15"/>
               </w:rPr>
               <w:t xml:space="preserve">보고 기간</w:t>
             </w:r>
@@ -447,8 +447,8 @@
                 <w:rFonts w:ascii="NanumGothic" w:cs="NanumGothic" w:eastAsia="NanumGothic" w:hAnsi="NanumGothic"/>
                 <w:b w:val="false"/>
                 <w:bCs w:val="false"/>
-                <w:sz w:val="16"/>
-                <w:szCs w:val="16"/>
+                <w:sz w:val="15"/>
+                <w:szCs w:val="15"/>
               </w:rPr>
               <w:t xml:space="preserve">2026. 4. 1 ~ 2026. 9. 20 (1년차 6개월차)</w:t>
             </w:r>
@@ -482,8 +482,8 @@
                 <w:rFonts w:ascii="NanumGothic" w:cs="NanumGothic" w:eastAsia="NanumGothic" w:hAnsi="NanumGothic"/>
                 <w:b/>
                 <w:bCs/>
-                <w:sz w:val="16"/>
-                <w:szCs w:val="16"/>
+                <w:sz w:val="15"/>
+                <w:szCs w:val="15"/>
               </w:rPr>
               <w:t xml:space="preserve">우리 기관</w:t>
             </w:r>
@@ -515,8 +515,8 @@
                 <w:rFonts w:ascii="NanumGothic" w:cs="NanumGothic" w:eastAsia="NanumGothic" w:hAnsi="NanumGothic"/>
                 <w:b w:val="false"/>
                 <w:bCs w:val="false"/>
-                <w:sz w:val="16"/>
-                <w:szCs w:val="16"/>
+                <w:sz w:val="15"/>
+                <w:szCs w:val="15"/>
               </w:rPr>
               <w:t xml:space="preserve">㈜D2O · 연구책임자 하현제(국가연구자번호 11152141) · 참여연구원 송영신</w:t>
             </w:r>
@@ -548,8 +548,8 @@
                 <w:rFonts w:ascii="NanumGothic" w:cs="NanumGothic" w:eastAsia="NanumGothic" w:hAnsi="NanumGothic"/>
                 <w:b w:val="false"/>
                 <w:bCs w:val="false"/>
-                <w:sz w:val="16"/>
-                <w:szCs w:val="16"/>
+                <w:sz w:val="15"/>
+                <w:szCs w:val="15"/>
               </w:rPr>
               <w:t xml:space="preserve">담당 역할</w:t>
             </w:r>
@@ -581,10 +581,10 @@
                 <w:rFonts w:ascii="NanumGothic" w:cs="NanumGothic" w:eastAsia="NanumGothic" w:hAnsi="NanumGothic"/>
                 <w:b w:val="false"/>
                 <w:bCs w:val="false"/>
-                <w:sz w:val="16"/>
-                <w:szCs w:val="16"/>
-              </w:rPr>
-              <w:t xml:space="preserve">실증 및 테스트 (실증 환경 구축 · 현장 실증 지원) · 사업화 확산 기반</w:t>
+                <w:sz w:val="15"/>
+                <w:szCs w:val="15"/>
+              </w:rPr>
+              <w:t xml:space="preserve">실증 및 테스트 · 영업·판매 (실증 환경 구축 · 현장 실증 지원 · 사업화 확산)</w:t>
             </w:r>
           </w:p>
         </w:tc>
@@ -616,10 +616,10 @@
       <w:r>
         <w:rPr>
           <w:rFonts w:ascii="NanumGothic" w:cs="NanumGothic" w:eastAsia="NanumGothic" w:hAnsi="NanumGothic"/>
-          <w:sz w:val="18"/>
-          <w:szCs w:val="18"/>
+          <w:sz w:val="17"/>
+          <w:szCs w:val="17"/>
         </w:rPr>
-        <w:t xml:space="preserve">1년차 목표: 자율주행 깔개 관리 축사 로봇 플랫폼 핵심 기능 확보 및 1차 시제품 설계·핵심부품 개발. D2O의 역할은 실증 및 테스트이며, 세 가지 세부 내용 중 「실사용 환경 정의 및 현장 실증 준비(1차 실증지 확보·준비)」를 주 담당하고, 충남대(핵심기술)와 GMW(시제품 설계)에 현장 조건·작업 요구사양을 제공한다.</w:t>
+        <w:t xml:space="preserve">본 자료는 공동연구개발기관(수요사) ㈜디투오의 연구책임자로서 1년차 중간점검을 위해 작성한 것이다. 본 기관은 본 과제에서 실증 및 테스트, 그리고 영업·판매를 담당한다. 실증지인 송영신목장에서 연구책임자가 매일 아침(필요 시 아침·저녁 2회) 56 HP 트랙터로 수작업 로터리 교반을 수행하고 있으며, 이 작업을 기둥과 소를 회피하며 자율주행하는 로봇 교반기(갈전구리)로 대체하는 것이 본 과제의 목적이다. 1년차 목표(자율주행 깔개 관리 축사 로봇 플랫폼 핵심 기능 확보 및 1차 시제품 설계·핵심부품 개발) 중 본 기관은 「실사용 환경 정의 및 현장 실증 준비(1차 실증지 확보·준비)」를 주 담당하고, 충남대(핵심기술)와 GMW(시제품 설계)에 현장 조건·작업 요구사양을 제공한다.</w:t>
       </w:r>
     </w:p>
     <w:tbl>
@@ -667,8 +667,8 @@
                 <w:rFonts w:ascii="NanumGothic" w:cs="NanumGothic" w:eastAsia="NanumGothic" w:hAnsi="NanumGothic"/>
                 <w:b/>
                 <w:bCs/>
-                <w:sz w:val="16"/>
-                <w:szCs w:val="16"/>
+                <w:sz w:val="15"/>
+                <w:szCs w:val="15"/>
               </w:rPr>
               <w:t xml:space="preserve">1년차 세부 내용</w:t>
             </w:r>
@@ -701,8 +701,8 @@
                 <w:rFonts w:ascii="NanumGothic" w:cs="NanumGothic" w:eastAsia="NanumGothic" w:hAnsi="NanumGothic"/>
                 <w:b/>
                 <w:bCs/>
-                <w:sz w:val="16"/>
-                <w:szCs w:val="16"/>
+                <w:sz w:val="15"/>
+                <w:szCs w:val="15"/>
               </w:rPr>
               <w:t xml:space="preserve">주 담당</w:t>
             </w:r>
@@ -735,8 +735,8 @@
                 <w:rFonts w:ascii="NanumGothic" w:cs="NanumGothic" w:eastAsia="NanumGothic" w:hAnsi="NanumGothic"/>
                 <w:b/>
                 <w:bCs/>
-                <w:sz w:val="16"/>
-                <w:szCs w:val="16"/>
+                <w:sz w:val="15"/>
+                <w:szCs w:val="15"/>
               </w:rPr>
               <w:t xml:space="preserve">D2O 역할 / 현황</w:t>
             </w:r>
@@ -768,8 +768,8 @@
             <w:r>
               <w:rPr>
                 <w:rFonts w:ascii="NanumGothic" w:cs="NanumGothic" w:eastAsia="NanumGothic" w:hAnsi="NanumGothic"/>
-                <w:sz w:val="16"/>
-                <w:szCs w:val="16"/>
+                <w:sz w:val="15"/>
+                <w:szCs w:val="15"/>
               </w:rPr>
               <w:t xml:space="preserve">핵심기술 확보 (자율주행·작업기 제어, 축사 환경 대응 구조)</w:t>
             </w:r>
@@ -799,8 +799,8 @@
             <w:r>
               <w:rPr>
                 <w:rFonts w:ascii="NanumGothic" w:cs="NanumGothic" w:eastAsia="NanumGothic" w:hAnsi="NanumGothic"/>
-                <w:sz w:val="16"/>
-                <w:szCs w:val="16"/>
+                <w:sz w:val="15"/>
+                <w:szCs w:val="15"/>
               </w:rPr>
               <w:t xml:space="preserve">충남대</w:t>
             </w:r>
@@ -830,8 +830,8 @@
             <w:r>
               <w:rPr>
                 <w:rFonts w:ascii="NanumGothic" w:cs="NanumGothic" w:eastAsia="NanumGothic" w:hAnsi="NanumGothic"/>
-                <w:sz w:val="16"/>
-                <w:szCs w:val="16"/>
+                <w:sz w:val="15"/>
+                <w:szCs w:val="15"/>
               </w:rPr>
               <w:t xml:space="preserve">축사 제원·기둥 배치·작업 조건 데이터 제공 (본 자료 2·4장)</w:t>
             </w:r>
@@ -863,8 +863,8 @@
             <w:r>
               <w:rPr>
                 <w:rFonts w:ascii="NanumGothic" w:cs="NanumGothic" w:eastAsia="NanumGothic" w:hAnsi="NanumGothic"/>
-                <w:sz w:val="16"/>
-                <w:szCs w:val="16"/>
+                <w:sz w:val="15"/>
+                <w:szCs w:val="15"/>
               </w:rPr>
               <w:t xml:space="preserve">1차 시제품 설계 (외장, 작업기 장착 구조)</w:t>
             </w:r>
@@ -894,8 +894,8 @@
             <w:r>
               <w:rPr>
                 <w:rFonts w:ascii="NanumGothic" w:cs="NanumGothic" w:eastAsia="NanumGothic" w:hAnsi="NanumGothic"/>
-                <w:sz w:val="16"/>
-                <w:szCs w:val="16"/>
+                <w:sz w:val="15"/>
+                <w:szCs w:val="15"/>
               </w:rPr>
               <w:t xml:space="preserve">㈜GMW</w:t>
             </w:r>
@@ -925,8 +925,8 @@
             <w:r>
               <w:rPr>
                 <w:rFonts w:ascii="NanumGothic" w:cs="NanumGothic" w:eastAsia="NanumGothic" w:hAnsi="NanumGothic"/>
-                <w:sz w:val="16"/>
-                <w:szCs w:val="16"/>
+                <w:sz w:val="15"/>
+                <w:szCs w:val="15"/>
               </w:rPr>
               <w:t xml:space="preserve">회전반경·교반 깊이·로터리 회전수 등 요구값 제공 (진행 중)</w:t>
             </w:r>
@@ -958,8 +958,8 @@
             <w:r>
               <w:rPr>
                 <w:rFonts w:ascii="NanumGothic" w:cs="NanumGothic" w:eastAsia="NanumGothic" w:hAnsi="NanumGothic"/>
-                <w:sz w:val="16"/>
-                <w:szCs w:val="16"/>
+                <w:sz w:val="15"/>
+                <w:szCs w:val="15"/>
               </w:rPr>
               <w:t xml:space="preserve">실사용 환경 정의 및 현장 실증 준비 (1차 실증지 확보·준비)</w:t>
             </w:r>
@@ -989,8 +989,8 @@
             <w:r>
               <w:rPr>
                 <w:rFonts w:ascii="NanumGothic" w:cs="NanumGothic" w:eastAsia="NanumGothic" w:hAnsi="NanumGothic"/>
-                <w:sz w:val="16"/>
-                <w:szCs w:val="16"/>
+                <w:sz w:val="15"/>
+                <w:szCs w:val="15"/>
               </w:rPr>
               <w:t xml:space="preserve">㈜D2O</w:t>
             </w:r>
@@ -1020,8 +1020,8 @@
             <w:r>
               <w:rPr>
                 <w:rFonts w:ascii="NanumGothic" w:cs="NanumGothic" w:eastAsia="NanumGothic" w:hAnsi="NanumGothic"/>
-                <w:sz w:val="16"/>
-                <w:szCs w:val="16"/>
+                <w:sz w:val="15"/>
+                <w:szCs w:val="15"/>
               </w:rPr>
               <w:t xml:space="preserve">실증·테스트용 베딩 준비 단계: 실증지 확보 · 환경 정의 완료 · 베딩 조성·일일 모니터링 운영 중</w:t>
             </w:r>
@@ -1095,8 +1095,8 @@
                 <w:rFonts w:ascii="NanumGothic" w:cs="NanumGothic" w:eastAsia="NanumGothic" w:hAnsi="NanumGothic"/>
                 <w:b/>
                 <w:bCs/>
-                <w:sz w:val="16"/>
-                <w:szCs w:val="16"/>
+                <w:sz w:val="15"/>
+                <w:szCs w:val="15"/>
               </w:rPr>
               <w:t xml:space="preserve">동</w:t>
             </w:r>
@@ -1129,8 +1129,8 @@
                 <w:rFonts w:ascii="NanumGothic" w:cs="NanumGothic" w:eastAsia="NanumGothic" w:hAnsi="NanumGothic"/>
                 <w:b/>
                 <w:bCs/>
-                <w:sz w:val="16"/>
-                <w:szCs w:val="16"/>
+                <w:sz w:val="15"/>
+                <w:szCs w:val="15"/>
               </w:rPr>
               <w:t xml:space="preserve">구역</w:t>
             </w:r>
@@ -1163,8 +1163,8 @@
                 <w:rFonts w:ascii="NanumGothic" w:cs="NanumGothic" w:eastAsia="NanumGothic" w:hAnsi="NanumGothic"/>
                 <w:b/>
                 <w:bCs/>
-                <w:sz w:val="16"/>
-                <w:szCs w:val="16"/>
+                <w:sz w:val="15"/>
+                <w:szCs w:val="15"/>
               </w:rPr>
               <w:t xml:space="preserve">규격</w:t>
             </w:r>
@@ -1197,8 +1197,8 @@
                 <w:rFonts w:ascii="NanumGothic" w:cs="NanumGothic" w:eastAsia="NanumGothic" w:hAnsi="NanumGothic"/>
                 <w:b/>
                 <w:bCs/>
-                <w:sz w:val="16"/>
-                <w:szCs w:val="16"/>
+                <w:sz w:val="15"/>
+                <w:szCs w:val="15"/>
               </w:rPr>
               <w:t xml:space="preserve">면적</w:t>
             </w:r>
@@ -1231,8 +1231,8 @@
                 <w:rFonts w:ascii="NanumGothic" w:cs="NanumGothic" w:eastAsia="NanumGothic" w:hAnsi="NanumGothic"/>
                 <w:b/>
                 <w:bCs/>
-                <w:sz w:val="16"/>
-                <w:szCs w:val="16"/>
+                <w:sz w:val="15"/>
+                <w:szCs w:val="15"/>
               </w:rPr>
               <w:t xml:space="preserve">구분</w:t>
             </w:r>
@@ -1264,8 +1264,8 @@
             <w:r>
               <w:rPr>
                 <w:rFonts w:ascii="NanumGothic" w:cs="NanumGothic" w:eastAsia="NanumGothic" w:hAnsi="NanumGothic"/>
-                <w:sz w:val="16"/>
-                <w:szCs w:val="16"/>
+                <w:sz w:val="15"/>
+                <w:szCs w:val="15"/>
               </w:rPr>
               <w:t xml:space="preserve">건유·육성우</w:t>
             </w:r>
@@ -1295,8 +1295,8 @@
             <w:r>
               <w:rPr>
                 <w:rFonts w:ascii="NanumGothic" w:cs="NanumGothic" w:eastAsia="NanumGothic" w:hAnsi="NanumGothic"/>
-                <w:sz w:val="16"/>
-                <w:szCs w:val="16"/>
+                <w:sz w:val="15"/>
+                <w:szCs w:val="15"/>
               </w:rPr>
               <w:t xml:space="preserve">휴식 공간 = 로터리(베딩) 면적</w:t>
             </w:r>
@@ -1326,8 +1326,8 @@
             <w:r>
               <w:rPr>
                 <w:rFonts w:ascii="NanumGothic" w:cs="NanumGothic" w:eastAsia="NanumGothic" w:hAnsi="NanumGothic"/>
-                <w:sz w:val="16"/>
-                <w:szCs w:val="16"/>
+                <w:sz w:val="15"/>
+                <w:szCs w:val="15"/>
               </w:rPr>
               <w:t xml:space="preserve">17 m × 50 m (트랙터 대기실 5×10 m 중첩)</w:t>
             </w:r>
@@ -1357,8 +1357,8 @@
             <w:r>
               <w:rPr>
                 <w:rFonts w:ascii="NanumGothic" w:cs="NanumGothic" w:eastAsia="NanumGothic" w:hAnsi="NanumGothic"/>
-                <w:sz w:val="16"/>
-                <w:szCs w:val="16"/>
+                <w:sz w:val="15"/>
+                <w:szCs w:val="15"/>
               </w:rPr>
               <w:t xml:space="preserve">850 m²</w:t>
             </w:r>
@@ -1388,8 +1388,8 @@
             <w:r>
               <w:rPr>
                 <w:rFonts w:ascii="NanumGothic" w:cs="NanumGothic" w:eastAsia="NanumGothic" w:hAnsi="NanumGothic"/>
-                <w:sz w:val="16"/>
-                <w:szCs w:val="16"/>
+                <w:sz w:val="15"/>
+                <w:szCs w:val="15"/>
               </w:rPr>
               <w:t xml:space="preserve">건유우·육성우 · 로봇 작업 대상 · 급수조 외벽</w:t>
             </w:r>
@@ -1421,8 +1421,8 @@
             <w:r>
               <w:rPr>
                 <w:rFonts w:ascii="NanumGothic" w:cs="NanumGothic" w:eastAsia="NanumGothic" w:hAnsi="NanumGothic"/>
-                <w:sz w:val="16"/>
-                <w:szCs w:val="16"/>
+                <w:sz w:val="15"/>
+                <w:szCs w:val="15"/>
               </w:rPr>
               <w:t xml:space="preserve">건유·육성우</w:t>
             </w:r>
@@ -1452,8 +1452,8 @@
             <w:r>
               <w:rPr>
                 <w:rFonts w:ascii="NanumGothic" w:cs="NanumGothic" w:eastAsia="NanumGothic" w:hAnsi="NanumGothic"/>
-                <w:sz w:val="16"/>
-                <w:szCs w:val="16"/>
+                <w:sz w:val="15"/>
+                <w:szCs w:val="15"/>
               </w:rPr>
               <w:t xml:space="preserve">사조 공간 / 트랙터 대기실</w:t>
             </w:r>
@@ -1483,8 +1483,8 @@
             <w:r>
               <w:rPr>
                 <w:rFonts w:ascii="NanumGothic" w:cs="NanumGothic" w:eastAsia="NanumGothic" w:hAnsi="NanumGothic"/>
-                <w:sz w:val="16"/>
-                <w:szCs w:val="16"/>
+                <w:sz w:val="15"/>
+                <w:szCs w:val="15"/>
               </w:rPr>
               <w:t xml:space="preserve">3 m × 50 m / 5 m × 10 m</w:t>
             </w:r>
@@ -1514,8 +1514,8 @@
             <w:r>
               <w:rPr>
                 <w:rFonts w:ascii="NanumGothic" w:cs="NanumGothic" w:eastAsia="NanumGothic" w:hAnsi="NanumGothic"/>
-                <w:sz w:val="16"/>
-                <w:szCs w:val="16"/>
+                <w:sz w:val="15"/>
+                <w:szCs w:val="15"/>
               </w:rPr>
               <w:t xml:space="preserve">150 / 50 m²</w:t>
             </w:r>
@@ -1545,8 +1545,8 @@
             <w:r>
               <w:rPr>
                 <w:rFonts w:ascii="NanumGothic" w:cs="NanumGothic" w:eastAsia="NanumGothic" w:hAnsi="NanumGothic"/>
-                <w:sz w:val="16"/>
-                <w:szCs w:val="16"/>
+                <w:sz w:val="15"/>
+                <w:szCs w:val="15"/>
               </w:rPr>
               <w:t xml:space="preserve">베딩 제외 · 주차 구역은 로봇 대기·충전 공유 제안</w:t>
             </w:r>
@@ -1578,8 +1578,8 @@
             <w:r>
               <w:rPr>
                 <w:rFonts w:ascii="NanumGothic" w:cs="NanumGothic" w:eastAsia="NanumGothic" w:hAnsi="NanumGothic"/>
-                <w:sz w:val="16"/>
-                <w:szCs w:val="16"/>
+                <w:sz w:val="15"/>
+                <w:szCs w:val="15"/>
               </w:rPr>
               <w:t xml:space="preserve">공용</w:t>
             </w:r>
@@ -1609,8 +1609,8 @@
             <w:r>
               <w:rPr>
                 <w:rFonts w:ascii="NanumGothic" w:cs="NanumGothic" w:eastAsia="NanumGothic" w:hAnsi="NanumGothic"/>
-                <w:sz w:val="16"/>
-                <w:szCs w:val="16"/>
+                <w:sz w:val="15"/>
+                <w:szCs w:val="15"/>
               </w:rPr>
               <w:t xml:space="preserve">중앙 복도</w:t>
             </w:r>
@@ -1640,8 +1640,8 @@
             <w:r>
               <w:rPr>
                 <w:rFonts w:ascii="NanumGothic" w:cs="NanumGothic" w:eastAsia="NanumGothic" w:hAnsi="NanumGothic"/>
-                <w:sz w:val="16"/>
-                <w:szCs w:val="16"/>
+                <w:sz w:val="15"/>
+                <w:szCs w:val="15"/>
               </w:rPr>
               <w:t xml:space="preserve">5 m × 50 m</w:t>
             </w:r>
@@ -1671,8 +1671,8 @@
             <w:r>
               <w:rPr>
                 <w:rFonts w:ascii="NanumGothic" w:cs="NanumGothic" w:eastAsia="NanumGothic" w:hAnsi="NanumGothic"/>
-                <w:sz w:val="16"/>
-                <w:szCs w:val="16"/>
+                <w:sz w:val="15"/>
+                <w:szCs w:val="15"/>
               </w:rPr>
               <w:t xml:space="preserve">250 m²</w:t>
             </w:r>
@@ -1702,8 +1702,8 @@
             <w:r>
               <w:rPr>
                 <w:rFonts w:ascii="NanumGothic" w:cs="NanumGothic" w:eastAsia="NanumGothic" w:hAnsi="NanumGothic"/>
-                <w:sz w:val="16"/>
-                <w:szCs w:val="16"/>
+                <w:sz w:val="15"/>
+                <w:szCs w:val="15"/>
               </w:rPr>
               <w:t xml:space="preserve">착유대기실 · 소 이동통로 · 트랙터/로봇 통로</w:t>
             </w:r>
@@ -1735,8 +1735,8 @@
             <w:r>
               <w:rPr>
                 <w:rFonts w:ascii="NanumGothic" w:cs="NanumGothic" w:eastAsia="NanumGothic" w:hAnsi="NanumGothic"/>
-                <w:sz w:val="16"/>
-                <w:szCs w:val="16"/>
+                <w:sz w:val="15"/>
+                <w:szCs w:val="15"/>
               </w:rPr>
               <w:t xml:space="preserve">착유장</w:t>
             </w:r>
@@ -1766,8 +1766,8 @@
             <w:r>
               <w:rPr>
                 <w:rFonts w:ascii="NanumGothic" w:cs="NanumGothic" w:eastAsia="NanumGothic" w:hAnsi="NanumGothic"/>
-                <w:sz w:val="16"/>
-                <w:szCs w:val="16"/>
+                <w:sz w:val="15"/>
+                <w:szCs w:val="15"/>
               </w:rPr>
               <w:t xml:space="preserve">휴식 공간 = 로터리(베딩) 면적</w:t>
             </w:r>
@@ -1797,8 +1797,8 @@
             <w:r>
               <w:rPr>
                 <w:rFonts w:ascii="NanumGothic" w:cs="NanumGothic" w:eastAsia="NanumGothic" w:hAnsi="NanumGothic"/>
-                <w:sz w:val="16"/>
-                <w:szCs w:val="16"/>
+                <w:sz w:val="15"/>
+                <w:szCs w:val="15"/>
               </w:rPr>
               <w:t xml:space="preserve">14 m × 37 m</w:t>
             </w:r>
@@ -1828,8 +1828,8 @@
             <w:r>
               <w:rPr>
                 <w:rFonts w:ascii="NanumGothic" w:cs="NanumGothic" w:eastAsia="NanumGothic" w:hAnsi="NanumGothic"/>
-                <w:sz w:val="16"/>
-                <w:szCs w:val="16"/>
+                <w:sz w:val="15"/>
+                <w:szCs w:val="15"/>
               </w:rPr>
               <w:t xml:space="preserve">518 m²</w:t>
             </w:r>
@@ -1859,8 +1859,8 @@
             <w:r>
               <w:rPr>
                 <w:rFonts w:ascii="NanumGothic" w:cs="NanumGothic" w:eastAsia="NanumGothic" w:hAnsi="NanumGothic"/>
-                <w:sz w:val="16"/>
-                <w:szCs w:val="16"/>
+                <w:sz w:val="15"/>
+                <w:szCs w:val="15"/>
               </w:rPr>
               <w:t xml:space="preserve">착유우 · 로봇 작업 대상</w:t>
             </w:r>
@@ -1892,8 +1892,8 @@
             <w:r>
               <w:rPr>
                 <w:rFonts w:ascii="NanumGothic" w:cs="NanumGothic" w:eastAsia="NanumGothic" w:hAnsi="NanumGothic"/>
-                <w:sz w:val="16"/>
-                <w:szCs w:val="16"/>
+                <w:sz w:val="15"/>
+                <w:szCs w:val="15"/>
               </w:rPr>
               <w:t xml:space="preserve">착유장</w:t>
             </w:r>
@@ -1923,8 +1923,8 @@
             <w:r>
               <w:rPr>
                 <w:rFonts w:ascii="NanumGothic" w:cs="NanumGothic" w:eastAsia="NanumGothic" w:hAnsi="NanumGothic"/>
-                <w:sz w:val="16"/>
-                <w:szCs w:val="16"/>
+                <w:sz w:val="15"/>
+                <w:szCs w:val="15"/>
               </w:rPr>
               <w:t xml:space="preserve">사조 / 하단 급수 통로</w:t>
             </w:r>
@@ -1954,8 +1954,8 @@
             <w:r>
               <w:rPr>
                 <w:rFonts w:ascii="NanumGothic" w:cs="NanumGothic" w:eastAsia="NanumGothic" w:hAnsi="NanumGothic"/>
-                <w:sz w:val="16"/>
-                <w:szCs w:val="16"/>
+                <w:sz w:val="15"/>
+                <w:szCs w:val="15"/>
               </w:rPr>
               <w:t xml:space="preserve">3 m × 50 m / 3 m × 37 m (급수조 2개 외벽)</w:t>
             </w:r>
@@ -1985,8 +1985,8 @@
             <w:r>
               <w:rPr>
                 <w:rFonts w:ascii="NanumGothic" w:cs="NanumGothic" w:eastAsia="NanumGothic" w:hAnsi="NanumGothic"/>
-                <w:sz w:val="16"/>
-                <w:szCs w:val="16"/>
+                <w:sz w:val="15"/>
+                <w:szCs w:val="15"/>
               </w:rPr>
               <w:t xml:space="preserve">150 / 111 m²</w:t>
             </w:r>
@@ -2016,8 +2016,8 @@
             <w:r>
               <w:rPr>
                 <w:rFonts w:ascii="NanumGothic" w:cs="NanumGothic" w:eastAsia="NanumGothic" w:hAnsi="NanumGothic"/>
-                <w:sz w:val="16"/>
-                <w:szCs w:val="16"/>
+                <w:sz w:val="15"/>
+                <w:szCs w:val="15"/>
               </w:rPr>
               <w:t xml:space="preserve">베딩 제외 · 이동 통로</w:t>
             </w:r>
@@ -2049,8 +2049,8 @@
             <w:r>
               <w:rPr>
                 <w:rFonts w:ascii="NanumGothic" w:cs="NanumGothic" w:eastAsia="NanumGothic" w:hAnsi="NanumGothic"/>
-                <w:sz w:val="16"/>
-                <w:szCs w:val="16"/>
+                <w:sz w:val="15"/>
+                <w:szCs w:val="15"/>
               </w:rPr>
               <w:t xml:space="preserve">착유장</w:t>
             </w:r>
@@ -2080,8 +2080,8 @@
             <w:r>
               <w:rPr>
                 <w:rFonts w:ascii="NanumGothic" w:cs="NanumGothic" w:eastAsia="NanumGothic" w:hAnsi="NanumGothic"/>
-                <w:sz w:val="16"/>
-                <w:szCs w:val="16"/>
+                <w:sz w:val="15"/>
+                <w:szCs w:val="15"/>
               </w:rPr>
               <w:t xml:space="preserve">로봇착유기실 / 착유 대기·이동 통로</w:t>
             </w:r>
@@ -2111,8 +2111,8 @@
             <w:r>
               <w:rPr>
                 <w:rFonts w:ascii="NanumGothic" w:cs="NanumGothic" w:eastAsia="NanumGothic" w:hAnsi="NanumGothic"/>
-                <w:sz w:val="16"/>
-                <w:szCs w:val="16"/>
+                <w:sz w:val="15"/>
+                <w:szCs w:val="15"/>
               </w:rPr>
               <w:t xml:space="preserve">10 m × 10 m / 약 121 m²</w:t>
             </w:r>
@@ -2142,8 +2142,8 @@
             <w:r>
               <w:rPr>
                 <w:rFonts w:ascii="NanumGothic" w:cs="NanumGothic" w:eastAsia="NanumGothic" w:hAnsi="NanumGothic"/>
-                <w:sz w:val="16"/>
-                <w:szCs w:val="16"/>
+                <w:sz w:val="15"/>
+                <w:szCs w:val="15"/>
               </w:rPr>
               <w:t xml:space="preserve">100 / 121 m²</w:t>
             </w:r>
@@ -2173,8 +2173,8 @@
             <w:r>
               <w:rPr>
                 <w:rFonts w:ascii="NanumGothic" w:cs="NanumGothic" w:eastAsia="NanumGothic" w:hAnsi="NanumGothic"/>
-                <w:sz w:val="16"/>
-                <w:szCs w:val="16"/>
+                <w:sz w:val="15"/>
+                <w:szCs w:val="15"/>
               </w:rPr>
               <w:t xml:space="preserve">로봇 진입 금지 (통로 경계 확인 필요)</w:t>
             </w:r>
@@ -2206,8 +2206,8 @@
             <w:r>
               <w:rPr>
                 <w:rFonts w:ascii="NanumGothic" w:cs="NanumGothic" w:eastAsia="NanumGothic" w:hAnsi="NanumGothic"/>
-                <w:sz w:val="16"/>
-                <w:szCs w:val="16"/>
+                <w:sz w:val="15"/>
+                <w:szCs w:val="15"/>
               </w:rPr>
               <w:t xml:space="preserve">서측</w:t>
             </w:r>
@@ -2237,8 +2237,8 @@
             <w:r>
               <w:rPr>
                 <w:rFonts w:ascii="NanumGothic" w:cs="NanumGothic" w:eastAsia="NanumGothic" w:hAnsi="NanumGothic"/>
-                <w:sz w:val="16"/>
-                <w:szCs w:val="16"/>
+                <w:sz w:val="15"/>
+                <w:szCs w:val="15"/>
               </w:rPr>
               <w:t xml:space="preserve">퇴비장 (수직형 교반기) / 기둥</w:t>
             </w:r>
@@ -2268,8 +2268,8 @@
             <w:r>
               <w:rPr>
                 <w:rFonts w:ascii="NanumGothic" w:cs="NanumGothic" w:eastAsia="NanumGothic" w:hAnsi="NanumGothic"/>
-                <w:sz w:val="16"/>
-                <w:szCs w:val="16"/>
+                <w:sz w:val="15"/>
+                <w:szCs w:val="15"/>
               </w:rPr>
               <w:t xml:space="preserve">10 m × 45 m / 가로 10 m · 세로 5 m 간격</w:t>
             </w:r>
@@ -2299,8 +2299,8 @@
             <w:r>
               <w:rPr>
                 <w:rFonts w:ascii="NanumGothic" w:cs="NanumGothic" w:eastAsia="NanumGothic" w:hAnsi="NanumGothic"/>
-                <w:sz w:val="16"/>
-                <w:szCs w:val="16"/>
+                <w:sz w:val="15"/>
+                <w:szCs w:val="15"/>
               </w:rPr>
               <w:t xml:space="preserve">450 m²</w:t>
             </w:r>
@@ -2330,8 +2330,8 @@
             <w:r>
               <w:rPr>
                 <w:rFonts w:ascii="NanumGothic" w:cs="NanumGothic" w:eastAsia="NanumGothic" w:hAnsi="NanumGothic"/>
-                <w:sz w:val="16"/>
-                <w:szCs w:val="16"/>
+                <w:sz w:val="15"/>
+                <w:szCs w:val="15"/>
               </w:rPr>
               <w:t xml:space="preserve">통로 분뇨 반입·퇴비화 · 기둥 위치 확인 필요</w:t>
             </w:r>
@@ -2363,8 +2363,165 @@
             <w:r>
               <w:rPr>
                 <w:rFonts w:ascii="NanumGothic" w:cs="NanumGothic" w:eastAsia="NanumGothic" w:hAnsi="NanumGothic"/>
-                <w:sz w:val="16"/>
-                <w:szCs w:val="16"/>
+                <w:sz w:val="15"/>
+                <w:szCs w:val="15"/>
+              </w:rPr>
+              <w:t xml:space="preserve">사육</w:t>
+            </w:r>
+          </w:p>
+        </w:tc>
+        <w:tc>
+          <w:tcPr>
+            <w:tcW w:type="dxa" w:w="2500"/>
+            <w:tcBorders>
+              <w:top w:val="single" w:color="888888" w:sz="4"/>
+              <w:left w:val="single" w:color="888888" w:sz="4"/>
+              <w:bottom w:val="single" w:color="888888" w:sz="4"/>
+              <w:right w:val="single" w:color="888888" w:sz="4"/>
+            </w:tcBorders>
+            <w:tcMar>
+              <w:top w:type="dxa" w:w="20"/>
+              <w:left w:type="dxa" w:w="60"/>
+              <w:bottom w:type="dxa" w:w="20"/>
+              <w:right w:type="dxa" w:w="60"/>
+            </w:tcMar>
+            <w:vAlign w:val="center"/>
+          </w:tcPr>
+          <w:p>
+            <w:pPr>
+              <w:spacing w:after="0" w:line="230"/>
+            </w:pPr>
+            <w:r>
+              <w:rPr>
+                <w:rFonts w:ascii="NanumGothic" w:cs="NanumGothic" w:eastAsia="NanumGothic" w:hAnsi="NanumGothic"/>
+                <w:sz w:val="15"/>
+                <w:szCs w:val="15"/>
+              </w:rPr>
+              <w:t xml:space="preserve">베딩 공간 내 우군 (휴식·운동)</w:t>
+            </w:r>
+          </w:p>
+        </w:tc>
+        <w:tc>
+          <w:tcPr>
+            <w:tcW w:type="dxa" w:w="2900"/>
+            <w:tcBorders>
+              <w:top w:val="single" w:color="888888" w:sz="4"/>
+              <w:left w:val="single" w:color="888888" w:sz="4"/>
+              <w:bottom w:val="single" w:color="888888" w:sz="4"/>
+              <w:right w:val="single" w:color="888888" w:sz="4"/>
+            </w:tcBorders>
+            <w:tcMar>
+              <w:top w:type="dxa" w:w="20"/>
+              <w:left w:type="dxa" w:w="60"/>
+              <w:bottom w:type="dxa" w:w="20"/>
+              <w:right w:type="dxa" w:w="60"/>
+            </w:tcMar>
+            <w:vAlign w:val="center"/>
+          </w:tcPr>
+          <w:p>
+            <w:pPr>
+              <w:spacing w:after="0" w:line="230"/>
+            </w:pPr>
+            <w:r>
+              <w:rPr>
+                <w:rFonts w:ascii="NanumGothic" w:cs="NanumGothic" w:eastAsia="NanumGothic" w:hAnsi="NanumGothic"/>
+                <w:sz w:val="15"/>
+                <w:szCs w:val="15"/>
+              </w:rPr>
+              <w:t xml:space="preserve">착유장: 착유우 30두 / 건유·육성우동: 건유우·육성우·송아지 약 35두</w:t>
+            </w:r>
+          </w:p>
+        </w:tc>
+        <w:tc>
+          <w:tcPr>
+            <w:tcW w:type="dxa" w:w="1200"/>
+            <w:tcBorders>
+              <w:top w:val="single" w:color="888888" w:sz="4"/>
+              <w:left w:val="single" w:color="888888" w:sz="4"/>
+              <w:bottom w:val="single" w:color="888888" w:sz="4"/>
+              <w:right w:val="single" w:color="888888" w:sz="4"/>
+            </w:tcBorders>
+            <w:tcMar>
+              <w:top w:type="dxa" w:w="20"/>
+              <w:left w:type="dxa" w:w="60"/>
+              <w:bottom w:type="dxa" w:w="20"/>
+              <w:right w:type="dxa" w:w="60"/>
+            </w:tcMar>
+            <w:vAlign w:val="center"/>
+          </w:tcPr>
+          <w:p>
+            <w:pPr>
+              <w:spacing w:after="0" w:line="230"/>
+            </w:pPr>
+            <w:r>
+              <w:rPr>
+                <w:rFonts w:ascii="NanumGothic" w:cs="NanumGothic" w:eastAsia="NanumGothic" w:hAnsi="NanumGothic"/>
+                <w:sz w:val="15"/>
+                <w:szCs w:val="15"/>
+              </w:rPr>
+              <w:t xml:space="preserve">17.3 / 24.3 m²/두</w:t>
+            </w:r>
+          </w:p>
+        </w:tc>
+        <w:tc>
+          <w:tcPr>
+            <w:tcW w:type="dxa" w:w="3066"/>
+            <w:tcBorders>
+              <w:top w:val="single" w:color="888888" w:sz="4"/>
+              <w:left w:val="single" w:color="888888" w:sz="4"/>
+              <w:bottom w:val="single" w:color="888888" w:sz="4"/>
+              <w:right w:val="single" w:color="888888" w:sz="4"/>
+            </w:tcBorders>
+            <w:tcMar>
+              <w:top w:type="dxa" w:w="20"/>
+              <w:left w:type="dxa" w:w="60"/>
+              <w:bottom w:type="dxa" w:w="20"/>
+              <w:right w:type="dxa" w:w="60"/>
+            </w:tcMar>
+            <w:vAlign w:val="center"/>
+          </w:tcPr>
+          <w:p>
+            <w:pPr>
+              <w:spacing w:after="0" w:line="230"/>
+            </w:pPr>
+            <w:r>
+              <w:rPr>
+                <w:rFonts w:ascii="NanumGothic" w:cs="NanumGothic" w:eastAsia="NanumGothic" w:hAnsi="NanumGothic"/>
+                <w:sz w:val="15"/>
+                <w:szCs w:val="15"/>
+              </w:rPr>
+              <w:t xml:space="preserve">로봇이 회피해야 할 동적 장애물</w:t>
+            </w:r>
+          </w:p>
+        </w:tc>
+      </w:tr>
+      <w:tr>
+        <w:tc>
+          <w:tcPr>
+            <w:tcW w:type="dxa" w:w="800"/>
+            <w:tcBorders>
+              <w:top w:val="single" w:color="888888" w:sz="4"/>
+              <w:left w:val="single" w:color="888888" w:sz="4"/>
+              <w:bottom w:val="single" w:color="888888" w:sz="4"/>
+              <w:right w:val="single" w:color="888888" w:sz="4"/>
+            </w:tcBorders>
+            <w:tcMar>
+              <w:top w:type="dxa" w:w="20"/>
+              <w:left w:type="dxa" w:w="60"/>
+              <w:bottom w:type="dxa" w:w="20"/>
+              <w:right w:type="dxa" w:w="60"/>
+            </w:tcMar>
+            <w:vAlign w:val="center"/>
+          </w:tcPr>
+          <w:p>
+            <w:pPr>
+              <w:spacing w:after="0" w:line="230"/>
+            </w:pPr>
+            <w:r>
+              <w:rPr>
+                <w:rFonts w:ascii="NanumGothic" w:cs="NanumGothic" w:eastAsia="NanumGothic" w:hAnsi="NanumGothic"/>
+                <w:sz w:val="15"/>
+                <w:szCs w:val="15"/>
               </w:rPr>
               <w:t xml:space="preserve"/>
             </w:r>
@@ -2394,8 +2551,8 @@
             <w:r>
               <w:rPr>
                 <w:rFonts w:ascii="NanumGothic" w:cs="NanumGothic" w:eastAsia="NanumGothic" w:hAnsi="NanumGothic"/>
-                <w:sz w:val="16"/>
-                <w:szCs w:val="16"/>
+                <w:sz w:val="15"/>
+                <w:szCs w:val="15"/>
               </w:rPr>
               <w:t xml:space="preserve">로터리(베딩) 면적 합계</w:t>
             </w:r>
@@ -2425,8 +2582,8 @@
             <w:r>
               <w:rPr>
                 <w:rFonts w:ascii="NanumGothic" w:cs="NanumGothic" w:eastAsia="NanumGothic" w:hAnsi="NanumGothic"/>
-                <w:sz w:val="16"/>
-                <w:szCs w:val="16"/>
+                <w:sz w:val="15"/>
+                <w:szCs w:val="15"/>
               </w:rPr>
               <w:t xml:space="preserve">전체 건물 60 m × 45 m = 2,700 m² 중 (연구책임자 손도면 기준)</w:t>
             </w:r>
@@ -2456,8 +2613,8 @@
             <w:r>
               <w:rPr>
                 <w:rFonts w:ascii="NanumGothic" w:cs="NanumGothic" w:eastAsia="NanumGothic" w:hAnsi="NanumGothic"/>
-                <w:sz w:val="16"/>
-                <w:szCs w:val="16"/>
+                <w:sz w:val="15"/>
+                <w:szCs w:val="15"/>
               </w:rPr>
               <w:t xml:space="preserve">1,368 m²</w:t>
             </w:r>
@@ -2487,8 +2644,8 @@
             <w:r>
               <w:rPr>
                 <w:rFonts w:ascii="NanumGothic" w:cs="NanumGothic" w:eastAsia="NanumGothic" w:hAnsi="NanumGothic"/>
-                <w:sz w:val="16"/>
-                <w:szCs w:val="16"/>
+                <w:sz w:val="15"/>
+                <w:szCs w:val="15"/>
               </w:rPr>
               <w:t xml:space="preserve">건유·육성우 850 + 착유장 518</w:t>
             </w:r>
@@ -2503,8 +2660,8 @@
       <w:r>
         <w:rPr>
           <w:rFonts w:ascii="NanumGothic" w:cs="NanumGothic" w:eastAsia="NanumGothic" w:hAnsi="NanumGothic"/>
-          <w:sz w:val="18"/>
-          <w:szCs w:val="18"/>
+          <w:sz w:val="17"/>
+          <w:szCs w:val="17"/>
         </w:rPr>
         <w:t xml:space="preserve">베딩 기준 면적은 전체 우사 면적에서 사조·급수·복도(착유대기실·이동통로)·트랙터 대기실·로봇착유기실을 제외한 「휴식 공간(소가 누워 쉬는 공간)」으로 정의하며, 피트모스 투입량·베딩 두께·로봇 작업 면적은 모두 이 면적을 기준으로 산정한다. 사조·급수 공간(각 3 m)은 이동 통로로 깔짚을 깔지 않으며, 분뇨의 상당 부분이 이곳에 배설되므로 매일 1회 스키드로더로 서측 퇴비장(10 × 45 m)에 배출해 수직형 교반기로 퇴비화한다.</w:t>
       </w:r>
@@ -2573,8 +2730,8 @@
                 <w:rFonts w:ascii="NanumGothic" w:cs="NanumGothic" w:eastAsia="NanumGothic" w:hAnsi="NanumGothic"/>
                 <w:b/>
                 <w:bCs/>
-                <w:sz w:val="16"/>
-                <w:szCs w:val="16"/>
+                <w:sz w:val="15"/>
+                <w:szCs w:val="15"/>
               </w:rPr>
               <w:t xml:space="preserve">항목</w:t>
             </w:r>
@@ -2607,8 +2764,8 @@
                 <w:rFonts w:ascii="NanumGothic" w:cs="NanumGothic" w:eastAsia="NanumGothic" w:hAnsi="NanumGothic"/>
                 <w:b/>
                 <w:bCs/>
-                <w:sz w:val="16"/>
-                <w:szCs w:val="16"/>
+                <w:sz w:val="15"/>
+                <w:szCs w:val="15"/>
               </w:rPr>
               <w:t xml:space="preserve">운영 기준</w:t>
             </w:r>
@@ -2641,8 +2798,8 @@
                 <w:rFonts w:ascii="NanumGothic" w:cs="NanumGothic" w:eastAsia="NanumGothic" w:hAnsi="NanumGothic"/>
                 <w:b/>
                 <w:bCs/>
-                <w:sz w:val="16"/>
-                <w:szCs w:val="16"/>
+                <w:sz w:val="15"/>
+                <w:szCs w:val="15"/>
               </w:rPr>
               <w:t xml:space="preserve">산정 (휴식 공간 1,368 m² 기준)</w:t>
             </w:r>
@@ -2674,8 +2831,8 @@
             <w:r>
               <w:rPr>
                 <w:rFonts w:ascii="NanumGothic" w:cs="NanumGothic" w:eastAsia="NanumGothic" w:hAnsi="NanumGothic"/>
-                <w:sz w:val="16"/>
-                <w:szCs w:val="16"/>
+                <w:sz w:val="15"/>
+                <w:szCs w:val="15"/>
               </w:rPr>
               <w:t xml:space="preserve">재료</w:t>
             </w:r>
@@ -2705,8 +2862,8 @@
             <w:r>
               <w:rPr>
                 <w:rFonts w:ascii="NanumGothic" w:cs="NanumGothic" w:eastAsia="NanumGothic" w:hAnsi="NanumGothic"/>
-                <w:sz w:val="16"/>
-                <w:szCs w:val="16"/>
+                <w:sz w:val="15"/>
+                <w:szCs w:val="15"/>
               </w:rPr>
               <w:t xml:space="preserve">주재료 톱밥 + 부재료 피트모스 (D2O 베딩 시스템)</w:t>
             </w:r>
@@ -2736,8 +2893,8 @@
             <w:r>
               <w:rPr>
                 <w:rFonts w:ascii="NanumGothic" w:cs="NanumGothic" w:eastAsia="NanumGothic" w:hAnsi="NanumGothic"/>
-                <w:sz w:val="16"/>
-                <w:szCs w:val="16"/>
+                <w:sz w:val="15"/>
+                <w:szCs w:val="15"/>
               </w:rPr>
               <w:t xml:space="preserve">톱밥은 현장 두께·수분 상태에 따라 투입</w:t>
             </w:r>
@@ -2769,8 +2926,8 @@
             <w:r>
               <w:rPr>
                 <w:rFonts w:ascii="NanumGothic" w:cs="NanumGothic" w:eastAsia="NanumGothic" w:hAnsi="NanumGothic"/>
-                <w:sz w:val="16"/>
-                <w:szCs w:val="16"/>
+                <w:sz w:val="15"/>
+                <w:szCs w:val="15"/>
               </w:rPr>
               <w:t xml:space="preserve">피트모스 투입 기준</w:t>
             </w:r>
@@ -2800,8 +2957,8 @@
             <w:r>
               <w:rPr>
                 <w:rFonts w:ascii="NanumGothic" w:cs="NanumGothic" w:eastAsia="NanumGothic" w:hAnsi="NanumGothic"/>
-                <w:sz w:val="16"/>
-                <w:szCs w:val="16"/>
+                <w:sz w:val="15"/>
+                <w:szCs w:val="15"/>
               </w:rPr>
               <w:t xml:space="preserve">휴식 공간 50 m²당 1 ~ 2 m³ (톱밥 투입량과 무관, 면적 기준)</w:t>
             </w:r>
@@ -2831,8 +2988,8 @@
             <w:r>
               <w:rPr>
                 <w:rFonts w:ascii="NanumGothic" w:cs="NanumGothic" w:eastAsia="NanumGothic" w:hAnsi="NanumGothic"/>
-                <w:sz w:val="16"/>
-                <w:szCs w:val="16"/>
+                <w:sz w:val="15"/>
+                <w:szCs w:val="15"/>
               </w:rPr>
               <w:t xml:space="preserve">1회 투입 약 27 ~ 55 m³ (건유·육성우동 17 ~ 34, 착유장 10 ~ 21 m³, 약 2 ~ 4 cm 층)</w:t>
             </w:r>
@@ -2864,8 +3021,8 @@
             <w:r>
               <w:rPr>
                 <w:rFonts w:ascii="NanumGothic" w:cs="NanumGothic" w:eastAsia="NanumGothic" w:hAnsi="NanumGothic"/>
-                <w:sz w:val="16"/>
-                <w:szCs w:val="16"/>
+                <w:sz w:val="15"/>
+                <w:szCs w:val="15"/>
               </w:rPr>
               <w:t xml:space="preserve">베딩 두께</w:t>
             </w:r>
@@ -2895,8 +3052,8 @@
             <w:r>
               <w:rPr>
                 <w:rFonts w:ascii="NanumGothic" w:cs="NanumGothic" w:eastAsia="NanumGothic" w:hAnsi="NanumGothic"/>
-                <w:sz w:val="16"/>
-                <w:szCs w:val="16"/>
+                <w:sz w:val="15"/>
+                <w:szCs w:val="15"/>
               </w:rPr>
               <w:t xml:space="preserve">약 60 cm 이상 유지</w:t>
             </w:r>
@@ -2926,8 +3083,8 @@
             <w:r>
               <w:rPr>
                 <w:rFonts w:ascii="NanumGothic" w:cs="NanumGothic" w:eastAsia="NanumGothic" w:hAnsi="NanumGothic"/>
-                <w:sz w:val="16"/>
-                <w:szCs w:val="16"/>
+                <w:sz w:val="15"/>
+                <w:szCs w:val="15"/>
               </w:rPr>
               <w:t xml:space="preserve">60 cm 기준 총 체적 약 821 m³ (건유·육성우동 510, 착유장 311 m³)</w:t>
             </w:r>
@@ -2959,8 +3116,8 @@
             <w:r>
               <w:rPr>
                 <w:rFonts w:ascii="NanumGothic" w:cs="NanumGothic" w:eastAsia="NanumGothic" w:hAnsi="NanumGothic"/>
-                <w:sz w:val="16"/>
-                <w:szCs w:val="16"/>
+                <w:sz w:val="15"/>
+                <w:szCs w:val="15"/>
               </w:rPr>
               <w:t xml:space="preserve">교반 작업</w:t>
             </w:r>
@@ -2990,10 +3147,10 @@
             <w:r>
               <w:rPr>
                 <w:rFonts w:ascii="NanumGothic" w:cs="NanumGothic" w:eastAsia="NanumGothic" w:hAnsi="NanumGothic"/>
-                <w:sz w:val="16"/>
-                <w:szCs w:val="16"/>
-              </w:rPr>
-              <w:t xml:space="preserve">56 HP 트랙터 + 로터리, 매일 아침 1회</w:t>
+                <w:sz w:val="15"/>
+                <w:szCs w:val="15"/>
+              </w:rPr>
+              <w:t xml:space="preserve">56 HP 트랙터 + 로터리, 매일 아침 1회(필요 시 아침·저녁 2회) 연구책임자 수작업, 소가 있는 상태에서 작업</w:t>
             </w:r>
           </w:p>
         </w:tc>
@@ -3021,8 +3178,8 @@
             <w:r>
               <w:rPr>
                 <w:rFonts w:ascii="NanumGothic" w:cs="NanumGothic" w:eastAsia="NanumGothic" w:hAnsi="NanumGothic"/>
-                <w:sz w:val="16"/>
-                <w:szCs w:val="16"/>
+                <w:sz w:val="15"/>
+                <w:szCs w:val="15"/>
               </w:rPr>
               <w:t xml:space="preserve">건유·육성우동 850 + 착유장 518 m² 교반 · 기둥 열 사이 왕복 주행 · 통로 분뇨는 스키드로더 배출</w:t>
             </w:r>
@@ -3037,8 +3194,8 @@
       <w:r>
         <w:rPr>
           <w:rFonts w:ascii="NanumGothic" w:cs="NanumGothic" w:eastAsia="NanumGothic" w:hAnsi="NanumGothic"/>
-          <w:sz w:val="18"/>
-          <w:szCs w:val="18"/>
+          <w:sz w:val="17"/>
+          <w:szCs w:val="17"/>
         </w:rPr>
         <w:t xml:space="preserve">기대 효과(실증 목표): 피트모스 혼합 베딩의 수분 흡수·완충 기능으로 악취 저감 및 퇴비화 효율 향상을 기대하며, 효과는 본 과제 실증 데이터로 검증한다.</w:t>
       </w:r>
@@ -3075,7 +3232,7 @@
       <w:r>
         <w:drawing>
           <wp:inline distT="0" distB="0" distL="0" distR="0">
-            <wp:extent cx="6477000" cy="4124325"/>
+            <wp:extent cx="6096000" cy="3886200"/>
             <wp:effectExtent t="0" r="0" b="0" l="0"/>
             <wp:docPr id="1" name="" descr="" title=""/>
             <wp:cNvGraphicFramePr>
@@ -3100,7 +3257,7 @@
                   <pic:spPr bwMode="auto">
                     <a:xfrm>
                       <a:off x="0" y="0"/>
-                      <a:ext cx="6477000" cy="4124325"/>
+                      <a:ext cx="6096000" cy="3886200"/>
                     </a:xfrm>
                     <a:prstGeom prst="rect">
                       <a:avLst/>
@@ -3122,8 +3279,8 @@
         <w:rPr>
           <w:rFonts w:ascii="NanumGothic" w:cs="NanumGothic" w:eastAsia="NanumGothic" w:hAnsi="NanumGothic"/>
           <w:color w:val="555555"/>
-          <w:sz w:val="16"/>
-          <w:szCs w:val="16"/>
+          <w:sz w:val="15"/>
+          <w:szCs w:val="15"/>
         </w:rPr>
         <w:t xml:space="preserve">2026-09-21 연구책임자 손도면 기준 작도(원본 첨부). 녹색 = 휴식 공간(베딩 기준 면적) · 황색 = 사조 · 청색 = 급수 통로/급수조 · 회색 = 복도 · 주황 = 트랙터 대기실(로봇 대기·충전 공유 제안) · 보라 = 로봇착유기실 · ■ 기둥(가로 10 m·세로 5 m, 위치 확인 필요) · 청색 점선 = 갈전구리 교반 경로(안) · 적색 점선 = 로봇 이동 경로(제안). 갈색 = 서측 퇴비장(수직형 교반기) · 녹색 점선 = 스키드로더 분뇨 배출 동선. 착유 통로 경계, 기둥 위치, 로봇 차체 치수(GMW)는 확인 후 갱신. 파일: SVG · PNG · DXF(CAD).</w:t>
       </w:r>
@@ -3192,8 +3349,8 @@
                 <w:rFonts w:ascii="NanumGothic" w:cs="NanumGothic" w:eastAsia="NanumGothic" w:hAnsi="NanumGothic"/>
                 <w:b/>
                 <w:bCs/>
-                <w:sz w:val="16"/>
-                <w:szCs w:val="16"/>
+                <w:sz w:val="15"/>
+                <w:szCs w:val="15"/>
               </w:rPr>
               <w:t xml:space="preserve">체크 항목</w:t>
             </w:r>
@@ -3226,8 +3383,8 @@
                 <w:rFonts w:ascii="NanumGothic" w:cs="NanumGothic" w:eastAsia="NanumGothic" w:hAnsi="NanumGothic"/>
                 <w:b/>
                 <w:bCs/>
-                <w:sz w:val="16"/>
-                <w:szCs w:val="16"/>
+                <w:sz w:val="15"/>
+                <w:szCs w:val="15"/>
               </w:rPr>
               <w:t xml:space="preserve">측정·기록 방법</w:t>
             </w:r>
@@ -3260,8 +3417,8 @@
                 <w:rFonts w:ascii="NanumGothic" w:cs="NanumGothic" w:eastAsia="NanumGothic" w:hAnsi="NanumGothic"/>
                 <w:b/>
                 <w:bCs/>
-                <w:sz w:val="16"/>
-                <w:szCs w:val="16"/>
+                <w:sz w:val="15"/>
+                <w:szCs w:val="15"/>
               </w:rPr>
               <w:t xml:space="preserve">로봇 요구사양과의 연계</w:t>
             </w:r>
@@ -3293,8 +3450,8 @@
             <w:r>
               <w:rPr>
                 <w:rFonts w:ascii="NanumGothic" w:cs="NanumGothic" w:eastAsia="NanumGothic" w:hAnsi="NanumGothic"/>
-                <w:sz w:val="16"/>
-                <w:szCs w:val="16"/>
+                <w:sz w:val="15"/>
+                <w:szCs w:val="15"/>
               </w:rPr>
               <w:t xml:space="preserve">① 작업 동선 ② 회전반경</w:t>
             </w:r>
@@ -3324,10 +3481,10 @@
             <w:r>
               <w:rPr>
                 <w:rFonts w:ascii="NanumGothic" w:cs="NanumGothic" w:eastAsia="NanumGothic" w:hAnsi="NanumGothic"/>
-                <w:sz w:val="16"/>
-                <w:szCs w:val="16"/>
-              </w:rPr>
-              <w:t xml:space="preserve">진입·왕복·퇴출 경로, 왕복 횟수, 소요 시간 / 끝단 회전 반경·방식</w:t>
+                <w:sz w:val="15"/>
+                <w:szCs w:val="15"/>
+              </w:rPr>
+              <w:t xml:space="preserve">진입·왕복·퇴출 경로, 왕복 횟수, 소요 시간, 소 회피 상황 / 끝단 회전 반경·방식</w:t>
             </w:r>
           </w:p>
         </w:tc>
@@ -3355,10 +3512,10 @@
             <w:r>
               <w:rPr>
                 <w:rFonts w:ascii="NanumGothic" w:cs="NanumGothic" w:eastAsia="NanumGothic" w:hAnsi="NanumGothic"/>
-                <w:sz w:val="16"/>
-                <w:szCs w:val="16"/>
-              </w:rPr>
-              <w:t xml:space="preserve">자율주행 기준 경로 · 플랫폼 조향·회전반경 설계값</w:t>
+                <w:sz w:val="15"/>
+                <w:szCs w:val="15"/>
+              </w:rPr>
+              <w:t xml:space="preserve">자율주행 기준 경로 · 기둥·소 회피 · 조향·회전반경 설계값</w:t>
             </w:r>
           </w:p>
         </w:tc>
@@ -3388,8 +3545,8 @@
             <w:r>
               <w:rPr>
                 <w:rFonts w:ascii="NanumGothic" w:cs="NanumGothic" w:eastAsia="NanumGothic" w:hAnsi="NanumGothic"/>
-                <w:sz w:val="16"/>
-                <w:szCs w:val="16"/>
+                <w:sz w:val="15"/>
+                <w:szCs w:val="15"/>
               </w:rPr>
               <w:t xml:space="preserve">③ 베딩 두께 ④ 교반 깊이</w:t>
             </w:r>
@@ -3419,8 +3576,8 @@
             <w:r>
               <w:rPr>
                 <w:rFonts w:ascii="NanumGothic" w:cs="NanumGothic" w:eastAsia="NanumGothic" w:hAnsi="NanumGothic"/>
-                <w:sz w:val="16"/>
-                <w:szCs w:val="16"/>
+                <w:sz w:val="15"/>
+                <w:szCs w:val="15"/>
               </w:rPr>
               <w:t xml:space="preserve">구역별(전·중·후) 두께, 60 cm 기준 대비 / 로터리 관입 깊이</w:t>
             </w:r>
@@ -3450,8 +3607,8 @@
             <w:r>
               <w:rPr>
                 <w:rFonts w:ascii="NanumGothic" w:cs="NanumGothic" w:eastAsia="NanumGothic" w:hAnsi="NanumGothic"/>
-                <w:sz w:val="16"/>
-                <w:szCs w:val="16"/>
+                <w:sz w:val="15"/>
+                <w:szCs w:val="15"/>
               </w:rPr>
               <w:t xml:space="preserve">작업기 깊이 제어 범위 · 차체 지상고</w:t>
             </w:r>
@@ -3483,8 +3640,8 @@
             <w:r>
               <w:rPr>
                 <w:rFonts w:ascii="NanumGothic" w:cs="NanumGothic" w:eastAsia="NanumGothic" w:hAnsi="NanumGothic"/>
-                <w:sz w:val="16"/>
-                <w:szCs w:val="16"/>
+                <w:sz w:val="15"/>
+                <w:szCs w:val="15"/>
               </w:rPr>
               <w:t xml:space="preserve">⑤ 로터리 회전수</w:t>
             </w:r>
@@ -3514,8 +3671,8 @@
             <w:r>
               <w:rPr>
                 <w:rFonts w:ascii="NanumGothic" w:cs="NanumGothic" w:eastAsia="NanumGothic" w:hAnsi="NanumGothic"/>
-                <w:sz w:val="16"/>
-                <w:szCs w:val="16"/>
+                <w:sz w:val="15"/>
+                <w:szCs w:val="15"/>
               </w:rPr>
               <w:t xml:space="preserve">PTO rpm 및 주행 속도</w:t>
             </w:r>
@@ -3545,8 +3702,8 @@
             <w:r>
               <w:rPr>
                 <w:rFonts w:ascii="NanumGothic" w:cs="NanumGothic" w:eastAsia="NanumGothic" w:hAnsi="NanumGothic"/>
-                <w:sz w:val="16"/>
-                <w:szCs w:val="16"/>
+                <w:sz w:val="15"/>
+                <w:szCs w:val="15"/>
               </w:rPr>
               <w:t xml:space="preserve">작업기 구동 출력·제어 사양 (56 HP 대비 30 HP급 부하 검토)</w:t>
             </w:r>
@@ -3578,8 +3735,8 @@
             <w:r>
               <w:rPr>
                 <w:rFonts w:ascii="NanumGothic" w:cs="NanumGothic" w:eastAsia="NanumGothic" w:hAnsi="NanumGothic"/>
-                <w:sz w:val="16"/>
-                <w:szCs w:val="16"/>
+                <w:sz w:val="15"/>
+                <w:szCs w:val="15"/>
               </w:rPr>
               <w:t xml:space="preserve">⑥ 수분함량 ⑦ 냄새</w:t>
             </w:r>
@@ -3609,8 +3766,8 @@
             <w:r>
               <w:rPr>
                 <w:rFonts w:ascii="NanumGothic" w:cs="NanumGothic" w:eastAsia="NanumGothic" w:hAnsi="NanumGothic"/>
-                <w:sz w:val="16"/>
-                <w:szCs w:val="16"/>
+                <w:sz w:val="15"/>
+                <w:szCs w:val="15"/>
               </w:rPr>
               <w:t xml:space="preserve">등급 평가 + 샘플 측정(수분계·암모니아, 도입 검토)</w:t>
             </w:r>
@@ -3640,8 +3797,8 @@
             <w:r>
               <w:rPr>
                 <w:rFonts w:ascii="NanumGothic" w:cs="NanumGothic" w:eastAsia="NanumGothic" w:hAnsi="NanumGothic"/>
-                <w:sz w:val="16"/>
-                <w:szCs w:val="16"/>
+                <w:sz w:val="15"/>
+                <w:szCs w:val="15"/>
               </w:rPr>
               <w:t xml:space="preserve">작업 조건 자동 판단 후보 · 환경 개선 성과지표</w:t>
             </w:r>
@@ -3673,8 +3830,8 @@
             <w:r>
               <w:rPr>
                 <w:rFonts w:ascii="NanumGothic" w:cs="NanumGothic" w:eastAsia="NanumGothic" w:hAnsi="NanumGothic"/>
-                <w:sz w:val="16"/>
-                <w:szCs w:val="16"/>
+                <w:sz w:val="15"/>
+                <w:szCs w:val="15"/>
               </w:rPr>
               <w:t xml:space="preserve">⑧ 베딩 추가 여부 ⑨ 사용기간</w:t>
             </w:r>
@@ -3704,8 +3861,8 @@
             <w:r>
               <w:rPr>
                 <w:rFonts w:ascii="NanumGothic" w:cs="NanumGothic" w:eastAsia="NanumGothic" w:hAnsi="NanumGothic"/>
-                <w:sz w:val="16"/>
-                <w:szCs w:val="16"/>
+                <w:sz w:val="15"/>
+                <w:szCs w:val="15"/>
               </w:rPr>
               <w:t xml:space="preserve">톱밥·피트모스 추가량(m³)·사유 / 투입일 기준 경과일·교체일</w:t>
             </w:r>
@@ -3735,8 +3892,8 @@
             <w:r>
               <w:rPr>
                 <w:rFonts w:ascii="NanumGothic" w:cs="NanumGothic" w:eastAsia="NanumGothic" w:hAnsi="NanumGothic"/>
-                <w:sz w:val="16"/>
-                <w:szCs w:val="16"/>
+                <w:sz w:val="15"/>
+                <w:szCs w:val="15"/>
               </w:rPr>
               <w:t xml:space="preserve">보충 시점 예측 · 베딩 수명 및 운영비 산정</w:t>
             </w:r>
@@ -3744,6 +3901,19 @@
         </w:tc>
       </w:tr>
     </w:tbl>
+    <w:p>
+      <w:pPr>
+        <w:spacing w:after="40" w:before="40" w:line="250"/>
+      </w:pPr>
+      <w:r>
+        <w:rPr>
+          <w:rFonts w:ascii="NanumGothic" w:cs="NanumGothic" w:eastAsia="NanumGothic" w:hAnsi="NanumGothic"/>
+          <w:sz w:val="17"/>
+          <w:szCs w:val="17"/>
+        </w:rPr>
+        <w:t xml:space="preserve">로봇 핵심 요구(실증지 관점): 기둥(가로 10 m·세로 5 m)과 베딩 공간의 소(착유우 30두, 건유·육성우·송아지 약 35두)를 실시간 회피하며 가축 안전 속도로 자율 교반할 것, 56 HP 트랙터 수작업과 동등한 교반 깊이·품질을 낼 것, 매일 1~2회 예약 작업이 가능할 것.</w:t>
+      </w:r>
+    </w:p>
     <w:p>
       <w:pPr>
         <w:pBdr>
@@ -3808,8 +3978,8 @@
                 <w:rFonts w:ascii="NanumGothic" w:cs="NanumGothic" w:eastAsia="NanumGothic" w:hAnsi="NanumGothic"/>
                 <w:b/>
                 <w:bCs/>
-                <w:sz w:val="16"/>
-                <w:szCs w:val="16"/>
+                <w:sz w:val="15"/>
+                <w:szCs w:val="15"/>
               </w:rPr>
               <w:t xml:space="preserve">과업</w:t>
             </w:r>
@@ -3842,8 +4012,8 @@
                 <w:rFonts w:ascii="NanumGothic" w:cs="NanumGothic" w:eastAsia="NanumGothic" w:hAnsi="NanumGothic"/>
                 <w:b/>
                 <w:bCs/>
-                <w:sz w:val="16"/>
-                <w:szCs w:val="16"/>
+                <w:sz w:val="15"/>
+                <w:szCs w:val="15"/>
               </w:rPr>
               <w:t xml:space="preserve">상태</w:t>
             </w:r>
@@ -3876,8 +4046,8 @@
                 <w:rFonts w:ascii="NanumGothic" w:cs="NanumGothic" w:eastAsia="NanumGothic" w:hAnsi="NanumGothic"/>
                 <w:b/>
                 <w:bCs/>
-                <w:sz w:val="16"/>
-                <w:szCs w:val="16"/>
+                <w:sz w:val="15"/>
+                <w:szCs w:val="15"/>
               </w:rPr>
               <w:t xml:space="preserve">내용 / 일정</w:t>
             </w:r>
@@ -3909,8 +4079,8 @@
             <w:r>
               <w:rPr>
                 <w:rFonts w:ascii="NanumGothic" w:cs="NanumGothic" w:eastAsia="NanumGothic" w:hAnsi="NanumGothic"/>
-                <w:sz w:val="16"/>
-                <w:szCs w:val="16"/>
+                <w:sz w:val="15"/>
+                <w:szCs w:val="15"/>
               </w:rPr>
               <w:t xml:space="preserve">1차 실증지 확보 · 실사용 환경 정의</w:t>
             </w:r>
@@ -3940,8 +4110,8 @@
             <w:r>
               <w:rPr>
                 <w:rFonts w:ascii="NanumGothic" w:cs="NanumGothic" w:eastAsia="NanumGothic" w:hAnsi="NanumGothic"/>
-                <w:sz w:val="16"/>
-                <w:szCs w:val="16"/>
+                <w:sz w:val="15"/>
+                <w:szCs w:val="15"/>
               </w:rPr>
               <w:t xml:space="preserve">완료</w:t>
             </w:r>
@@ -3971,10 +4141,10 @@
             <w:r>
               <w:rPr>
                 <w:rFonts w:ascii="NanumGothic" w:cs="NanumGothic" w:eastAsia="NanumGothic" w:hAnsi="NanumGothic"/>
-                <w:sz w:val="16"/>
-                <w:szCs w:val="16"/>
-              </w:rPr>
-              <w:t xml:space="preserve">송영신목장 2개 동, 휴식 공간 1,368 m² (2·4장), 손도면 기준 평면도 v2 작성</w:t>
+                <w:sz w:val="15"/>
+                <w:szCs w:val="15"/>
+              </w:rPr>
+              <w:t xml:space="preserve">송영신목장 2개 동, 휴식 공간 1,368 m² (2·4장), 손도면 기준 평면도 v3 작성</w:t>
             </w:r>
           </w:p>
         </w:tc>
@@ -4004,8 +4174,8 @@
             <w:r>
               <w:rPr>
                 <w:rFonts w:ascii="NanumGothic" w:cs="NanumGothic" w:eastAsia="NanumGothic" w:hAnsi="NanumGothic"/>
-                <w:sz w:val="16"/>
-                <w:szCs w:val="16"/>
+                <w:sz w:val="15"/>
+                <w:szCs w:val="15"/>
               </w:rPr>
               <w:t xml:space="preserve">일일 작업·모니터링 체계 수립 · 데이터 축적</w:t>
             </w:r>
@@ -4035,8 +4205,8 @@
             <w:r>
               <w:rPr>
                 <w:rFonts w:ascii="NanumGothic" w:cs="NanumGothic" w:eastAsia="NanumGothic" w:hAnsi="NanumGothic"/>
-                <w:sz w:val="16"/>
-                <w:szCs w:val="16"/>
+                <w:sz w:val="15"/>
+                <w:szCs w:val="15"/>
               </w:rPr>
               <w:t xml:space="preserve">운영 중</w:t>
             </w:r>
@@ -4066,8 +4236,8 @@
             <w:r>
               <w:rPr>
                 <w:rFonts w:ascii="NanumGothic" w:cs="NanumGothic" w:eastAsia="NanumGothic" w:hAnsi="NanumGothic"/>
-                <w:sz w:val="16"/>
-                <w:szCs w:val="16"/>
+                <w:sz w:val="15"/>
+                <w:szCs w:val="15"/>
               </w:rPr>
               <w:t xml:space="preserve">9개 항목 매일 기록 → 2026. 12 연차보고서에 기간별 통계(평균·범위) 반영</w:t>
             </w:r>
@@ -4099,8 +4269,8 @@
             <w:r>
               <w:rPr>
                 <w:rFonts w:ascii="NanumGothic" w:cs="NanumGothic" w:eastAsia="NanumGothic" w:hAnsi="NanumGothic"/>
-                <w:sz w:val="16"/>
-                <w:szCs w:val="16"/>
+                <w:sz w:val="15"/>
+                <w:szCs w:val="15"/>
               </w:rPr>
               <w:t xml:space="preserve">로봇 요구사양 초안 → 주관기관·충남대 협의</w:t>
             </w:r>
@@ -4130,8 +4300,8 @@
             <w:r>
               <w:rPr>
                 <w:rFonts w:ascii="NanumGothic" w:cs="NanumGothic" w:eastAsia="NanumGothic" w:hAnsi="NanumGothic"/>
-                <w:sz w:val="16"/>
-                <w:szCs w:val="16"/>
+                <w:sz w:val="15"/>
+                <w:szCs w:val="15"/>
               </w:rPr>
               <w:t xml:space="preserve">진행 중</w:t>
             </w:r>
@@ -4161,8 +4331,8 @@
             <w:r>
               <w:rPr>
                 <w:rFonts w:ascii="NanumGothic" w:cs="NanumGothic" w:eastAsia="NanumGothic" w:hAnsi="NanumGothic"/>
-                <w:sz w:val="16"/>
-                <w:szCs w:val="16"/>
+                <w:sz w:val="15"/>
+                <w:szCs w:val="15"/>
               </w:rPr>
               <w:t xml:space="preserve">2026. 10 전달: 동별 구역 형상(17×50 / 14×37)·기둥 열 회피 경로, 착유기실 진입 금지, 회전반경, 교반 깊이·회전수, 30 HP 부하</w:t>
             </w:r>
@@ -4194,8 +4364,8 @@
             <w:r>
               <w:rPr>
                 <w:rFonts w:ascii="NanumGothic" w:cs="NanumGothic" w:eastAsia="NanumGothic" w:hAnsi="NanumGothic"/>
-                <w:sz w:val="16"/>
-                <w:szCs w:val="16"/>
+                <w:sz w:val="15"/>
+                <w:szCs w:val="15"/>
               </w:rPr>
               <w:t xml:space="preserve">확산 기반 구축 (영업·교육·컨설팅)</w:t>
             </w:r>
@@ -4225,8 +4395,8 @@
             <w:r>
               <w:rPr>
                 <w:rFonts w:ascii="NanumGothic" w:cs="NanumGothic" w:eastAsia="NanumGothic" w:hAnsi="NanumGothic"/>
-                <w:sz w:val="16"/>
-                <w:szCs w:val="16"/>
+                <w:sz w:val="15"/>
+                <w:szCs w:val="15"/>
               </w:rPr>
               <w:t xml:space="preserve">진행 중</w:t>
             </w:r>
@@ -4256,8 +4426,8 @@
             <w:r>
               <w:rPr>
                 <w:rFonts w:ascii="NanumGothic" w:cs="NanumGothic" w:eastAsia="NanumGothic" w:hAnsi="NanumGothic"/>
-                <w:sz w:val="16"/>
-                <w:szCs w:val="16"/>
+                <w:sz w:val="15"/>
+                <w:szCs w:val="15"/>
               </w:rPr>
               <w:t xml:space="preserve">7. 30 농림부 축산경영과장·낙농진흥회·경기도청 축산국 방문 시 HBP·본 과제 소개 / 해외 ODA 방문단 소개</w:t>
             </w:r>
@@ -4289,8 +4459,103 @@
             <w:r>
               <w:rPr>
                 <w:rFonts w:ascii="NanumGothic" w:cs="NanumGothic" w:eastAsia="NanumGothic" w:hAnsi="NanumGothic"/>
-                <w:sz w:val="16"/>
-                <w:szCs w:val="16"/>
+                <w:sz w:val="15"/>
+                <w:szCs w:val="15"/>
+              </w:rPr>
+              <w:t xml:space="preserve">영업·판매 준비 (사업화 확산)</w:t>
+            </w:r>
+          </w:p>
+        </w:tc>
+        <w:tc>
+          <w:tcPr>
+            <w:tcW w:type="dxa" w:w="1300"/>
+            <w:tcBorders>
+              <w:top w:val="single" w:color="888888" w:sz="4"/>
+              <w:left w:val="single" w:color="888888" w:sz="4"/>
+              <w:bottom w:val="single" w:color="888888" w:sz="4"/>
+              <w:right w:val="single" w:color="888888" w:sz="4"/>
+            </w:tcBorders>
+            <w:tcMar>
+              <w:top w:type="dxa" w:w="20"/>
+              <w:left w:type="dxa" w:w="60"/>
+              <w:bottom w:type="dxa" w:w="20"/>
+              <w:right w:type="dxa" w:w="60"/>
+            </w:tcMar>
+            <w:vAlign w:val="center"/>
+          </w:tcPr>
+          <w:p>
+            <w:pPr>
+              <w:spacing w:after="0" w:line="230"/>
+            </w:pPr>
+            <w:r>
+              <w:rPr>
+                <w:rFonts w:ascii="NanumGothic" w:cs="NanumGothic" w:eastAsia="NanumGothic" w:hAnsi="NanumGothic"/>
+                <w:sz w:val="15"/>
+                <w:szCs w:val="15"/>
+              </w:rPr>
+              <w:t xml:space="preserve">착수</w:t>
+            </w:r>
+          </w:p>
+        </w:tc>
+        <w:tc>
+          <w:tcPr>
+            <w:tcW w:type="dxa" w:w="5766"/>
+            <w:tcBorders>
+              <w:top w:val="single" w:color="888888" w:sz="4"/>
+              <w:left w:val="single" w:color="888888" w:sz="4"/>
+              <w:bottom w:val="single" w:color="888888" w:sz="4"/>
+              <w:right w:val="single" w:color="888888" w:sz="4"/>
+            </w:tcBorders>
+            <w:tcMar>
+              <w:top w:type="dxa" w:w="20"/>
+              <w:left w:type="dxa" w:w="60"/>
+              <w:bottom w:type="dxa" w:w="20"/>
+              <w:right w:type="dxa" w:w="60"/>
+            </w:tcMar>
+            <w:vAlign w:val="center"/>
+          </w:tcPr>
+          <w:p>
+            <w:pPr>
+              <w:spacing w:after="0" w:line="230"/>
+            </w:pPr>
+            <w:r>
+              <w:rPr>
+                <w:rFonts w:ascii="NanumGothic" w:cs="NanumGothic" w:eastAsia="NanumGothic" w:hAnsi="NanumGothic"/>
+                <w:sz w:val="15"/>
+                <w:szCs w:val="15"/>
+              </w:rPr>
+              <w:t xml:space="preserve">실증 레퍼런스(송영신목장) 확보 후 낙농·한우 농가 대상 영업 자료·판매 계획 수립, 3년차 양산 체계와 연계</w:t>
+            </w:r>
+          </w:p>
+        </w:tc>
+      </w:tr>
+      <w:tr>
+        <w:tc>
+          <w:tcPr>
+            <w:tcW w:type="dxa" w:w="3400"/>
+            <w:tcBorders>
+              <w:top w:val="single" w:color="888888" w:sz="4"/>
+              <w:left w:val="single" w:color="888888" w:sz="4"/>
+              <w:bottom w:val="single" w:color="888888" w:sz="4"/>
+              <w:right w:val="single" w:color="888888" w:sz="4"/>
+            </w:tcBorders>
+            <w:tcMar>
+              <w:top w:type="dxa" w:w="20"/>
+              <w:left w:type="dxa" w:w="60"/>
+              <w:bottom w:type="dxa" w:w="20"/>
+              <w:right w:type="dxa" w:w="60"/>
+            </w:tcMar>
+            <w:vAlign w:val="center"/>
+          </w:tcPr>
+          <w:p>
+            <w:pPr>
+              <w:spacing w:after="0" w:line="230"/>
+            </w:pPr>
+            <w:r>
+              <w:rPr>
+                <w:rFonts w:ascii="NanumGothic" w:cs="NanumGothic" w:eastAsia="NanumGothic" w:hAnsi="NanumGothic"/>
+                <w:sz w:val="15"/>
+                <w:szCs w:val="15"/>
               </w:rPr>
               <w:t xml:space="preserve">2년차 1차 시제품 현장 실증 준비</w:t>
             </w:r>
@@ -4320,8 +4585,8 @@
             <w:r>
               <w:rPr>
                 <w:rFonts w:ascii="NanumGothic" w:cs="NanumGothic" w:eastAsia="NanumGothic" w:hAnsi="NanumGothic"/>
-                <w:sz w:val="16"/>
-                <w:szCs w:val="16"/>
+                <w:sz w:val="15"/>
+                <w:szCs w:val="15"/>
               </w:rPr>
               <w:t xml:space="preserve">예정</w:t>
             </w:r>
@@ -4351,8 +4616,8 @@
             <w:r>
               <w:rPr>
                 <w:rFonts w:ascii="NanumGothic" w:cs="NanumGothic" w:eastAsia="NanumGothic" w:hAnsi="NanumGothic"/>
-                <w:sz w:val="16"/>
-                <w:szCs w:val="16"/>
+                <w:sz w:val="15"/>
+                <w:szCs w:val="15"/>
               </w:rPr>
               <w:t xml:space="preserve">2027. 1 ~ 3 실증 동 지정, 안전 구획, 기준 데이터(baseline) 확정 → 2027 실증 지원</w:t>
             </w:r>
@@ -4386,8 +4651,8 @@
       <w:r>
         <w:rPr>
           <w:rFonts w:ascii="NanumGothic" w:cs="NanumGothic" w:eastAsia="NanumGothic" w:hAnsi="NanumGothic"/>
-          <w:sz w:val="18"/>
-          <w:szCs w:val="18"/>
+          <w:sz w:val="17"/>
+          <w:szCs w:val="17"/>
         </w:rPr>
         <w:t xml:space="preserve">① 현행 56 HP 트랙터 교반 대비 시제품 30 HP급 하이브리드 엔진의 작업 부하 적정성 — 실측 PTO rpm·깊이·속도 데이터를 제공하여 작업기 규격 협의.  ② 수분·냄새 정량 측정 장비(수분계·암모니아 측정기) 도입 여부 및 재료비·장비비 계상 검토.  ③ 기둥 실제 위치, 착유장 착유 대기·이동 통로 경계, 퇴비장 내 교반기·반입구 위치는 실측 도면으로 확정.</w:t>
       </w:r>
@@ -4400,8 +4665,8 @@
         <w:rPr>
           <w:rFonts w:ascii="NanumGothic" w:cs="NanumGothic" w:eastAsia="NanumGothic" w:hAnsi="NanumGothic"/>
           <w:color w:val="555555"/>
-          <w:sz w:val="16"/>
-          <w:szCs w:val="16"/>
+          <w:sz w:val="15"/>
+          <w:szCs w:val="15"/>
         </w:rPr>
         <w:t xml:space="preserve">첨부: 축사 평면도 v2(SVG/PNG/DXF) 및 손도면 원본 · 일일 베딩 관리 점검표 누적본 · 베딩 재료 투입 기록 · 현장 사진</w:t>
       </w:r>
@@ -4416,8 +4681,8 @@
           <w:rFonts w:ascii="NanumGothic" w:cs="NanumGothic" w:eastAsia="NanumGothic" w:hAnsi="NanumGothic"/>
           <w:b/>
           <w:bCs/>
-          <w:sz w:val="18"/>
-          <w:szCs w:val="18"/>
+          <w:sz w:val="17"/>
+          <w:szCs w:val="17"/>
         </w:rPr>
         <w:t xml:space="preserve">2026년 9월 21일   농업회사법인 주식회사 디투오   연구책임자 하현제 (인)</w:t>
       </w:r>
@@ -4611,8 +4876,8 @@
     <w:rPrDefault>
       <w:rPr>
         <w:rFonts w:ascii="NanumGothic" w:cs="NanumGothic" w:eastAsia="NanumGothic" w:hAnsi="NanumGothic"/>
-        <w:sz w:val="18"/>
-        <w:szCs w:val="18"/>
+        <w:sz w:val="17"/>
+        <w:szCs w:val="17"/>
       </w:rPr>
     </w:rPrDefault>
     <w:pPrDefault/>

</xml_diff>